<commit_message>
docs(group-17): final dossier, PDF and raw telemetry CSVs (P01-P11)
Replace the dossier .docx with the final version, add its PDF, and commit
the 13 raw telemetry CSVs (session_summary, security_audit_real_trials,
audit_P01..P11) to telemetry/.

Co-Authored-By: Claude Sonnet 5.5 <noreply@anthropic.com>
</commit_message>
<xml_diff>
--- a/Group_17_Samarth_Ishan_Aarush_Sachi/docs/IVRAR_Group_17_Technical_Dossier.docx
+++ b/Group_17_Samarth_Ishan_Aarush_Sachi/docs/IVRAR_Group_17_Technical_Dossier.docx
@@ -846,22 +846,14 @@
               <w:rPr>
                 <w:sz w:val="15"/>
               </w:rPr>
-              <w:t xml:space="preserve"> social-engineering simulation improve non-technical employees' threat-recognition ability for </w:t>
-            </w:r>
-            <w:proofErr w:type="spellStart"/>
+              <w:t xml:space="preserve"> social-engineering simulation improve non-technical employees' threat-recognition ability for organisation</w:t>
+            </w:r>
             <w:r>
               <w:rPr>
                 <w:sz w:val="15"/>
               </w:rPr>
-              <w:t>organisation</w:t>
-            </w:r>
-            <w:r>
-              <w:rPr>
-                <w:sz w:val="15"/>
-              </w:rPr>
               <w:t>s</w:t>
             </w:r>
-            <w:proofErr w:type="spellEnd"/>
             <w:r>
               <w:rPr>
                 <w:sz w:val="15"/>
@@ -1153,7 +1145,7 @@
                     <w:sz w:val="14"/>
                     <w:szCs w:val="14"/>
                   </w:rPr>
-                  <w:t xml:space="preserve">ISO/IEC 27001:2022, Annex A clause 7 'Physical controls' (7.1-7.14), e.g. 7.2 Physical entry, 7.7 Clear desk and clear screen, 7.10 Storage media. A.11 is the withdrawn 2013 numbering (mapping table: ISO/IEC 27002:2022 Annex B). https://www.iso.org/standard/27001</w:t>
+                  <w:t>ISO/IEC 27001:2022, Annex A clause 7 'Physical controls' (7.1-7.14), e.g. 7.2 Physical entry, 7.7 Clear desk and clear screen, 7.10 Storage media. A.11 is the withdrawn 2013 numbering (mapping table: ISO/IEC 27002:2022 Annex B). https://www.iso.org/standard/27001</w:t>
                 </w:r>
               </w:sdtContent>
             </w:sdt>
@@ -1290,7 +1282,7 @@
                     <w:sz w:val="14"/>
                     <w:szCs w:val="14"/>
                   </w:rPr>
-                  <w:t xml:space="preserve">No primary source found. Nearest match: a 2014 Boon Edam vendor survey (about 8% response rate) in which about 71% of respondents believed they were vulnerable to tailgating. That is a perception, not a penetration-test success rate. https://www.securityinfowatch.com/access-identity/press-release/12053739/</w:t>
+                  <w:t>No primary source found. Nearest match: a 2014 Boon Edam vendor survey (about 8% response rate) in which about 71% of respondents believed they were vulnerable to tailgating. That is a perception, not a penetration-test success rate. https://www.securityinfowatch.com/access-identity/press-release/12053739/</w:t>
                 </w:r>
               </w:sdtContent>
             </w:sdt>
@@ -1406,14 +1398,14 @@
           </w:tcPr>
           <w:p>
             <w:pPr>
-              <w:spacing w:before="0" w:after="40"/>
+              <w:spacing w:after="40"/>
             </w:pPr>
             <w:r>
               <w:rPr>
                 <w:sz w:val="15"/>
                 <w:szCs w:val="15"/>
               </w:rPr>
-              <w:t xml:space="preserve">Non-technical office staff are the easiest way into a company: they open a convincing invoice email, plug in a found USB drive, let a confident 'IT engineer' through the door and approve an unexpected MFA prompt, usually while rushing to finish work. In Verizon's 2024 Data Breach Investigations Report, 68% of the 10,626 confirmed breaches analysed involved a non-malicious human element: a person making an error or falling for social engineering (Verizon, 2024 DBIR, https://www.verizon.com/business/resources/reports/dbir/). Most organisations measure this only through training-completion records and email phishing-simulation click rates, which cover one channel and say nothing about door, USB, chat or MFA pretexts. CyberQuest measures all of them in one 15-minute VR session: breach rate, credential disclosure and challenge latency.</w:t>
+              <w:t>Non-technical office staff are the easiest way into a company: they open a convincing invoice email, plug in a found USB drive, let a confident 'IT engineer' through the door and approve an unexpected MFA prompt, usually while rushing to finish work. In Verizon's 2024 Data Breach Investigations Report, 68% of the 10,626 confirmed breaches analysed involved a non-malicious human element: a person making an error or falling for social engineering (Verizon, 2024 DBIR, https://www.verizon.com/business/resources/reports/dbir/). Most organisations measure this only through training-completion records and email phishing-simulation click rates, which cover one channel and say nothing about door, USB, chat or MFA pretexts. CyberQuest measures all of them in one 15-minute VR session: breach rate, credential disclosure and challenge latency.</w:t>
             </w:r>
           </w:p>
         </w:tc>
@@ -1437,6 +1429,7 @@
           <w:b/>
           <w:sz w:val="22"/>
         </w:rPr>
+        <w:lastRenderedPageBreak/>
         <w:t>SECTION 2 · C# Script Architecture &amp; Mathematical / Behavioural Model</w:t>
       </w:r>
       <w:r>
@@ -1494,7 +1487,7 @@
               <w:rPr>
                 <w:sz w:val="15"/>
               </w:rPr>
-              <w:t xml:space="preserve">Core: GameState.cs · GameDirector.cs · SituationTrigger.cs · EndingResolver.cs · ScoreCalculator.cs · SessionLog.cs · RoomTracker.cs · PhysicalSecurityTelemetryLogger.cs. Situations: EmailQrSituation.cs · FakeLoginSituation.cs · UsbSituation.cs · ColleagueSituation.cs · IntercomSituation.cs · MfaSituation.cs · WorkstationSituation.cs · EndingFlow.cs. (The scaffold's TailgatingBreachManager.cs is replaced by IntercomSituation.cs.)</w:t>
+              <w:t>Core: GameState.cs · GameDirector.cs · SituationTrigger.cs · EndingResolver.cs · ScoreCalculator.cs · SessionLog.cs · RoomTracker.cs · PhysicalSecurityTelemetryLogger.cs. Situations: EmailQrSituation.cs · FakeLoginSituation.cs · UsbSituation.cs · ColleagueSituation.cs · IntercomSituation.cs · MfaSituation.cs · WorkstationSituation.cs · EndingFlow.cs. (The scaffold's TailgatingBreachManager.cs is replaced by IntercomSituation.cs.)</w:t>
             </w:r>
           </w:p>
         </w:tc>
@@ -1534,7 +1527,7 @@
               <w:rPr>
                 <w:sz w:val="15"/>
               </w:rPr>
-              <w:t xml:space="preserve">PhysicalSecurityLogger.cs, implemented as PhysicalSecurityTelemetryLogger.cs (same file name and CSV columns as the repo scaffold)</w:t>
+              <w:t>PhysicalSecurityLogger.cs, implemented as PhysicalSecurityTelemetryLogger.cs (same file name and CSV columns as the repo scaffold)</w:t>
             </w:r>
           </w:p>
         </w:tc>
@@ -1574,7 +1567,7 @@
               <w:rPr>
                 <w:sz w:val="15"/>
               </w:rPr>
-              <w:t xml:space="preserve">No fixed sequence. GameState holds every choice; 7 independent situation triggers (email/QR, fake login, USB, colleague, intercom visitor, MFA push, unlocked workstation) each go NotReached → Request shown → Decision (safe / unsafe / over-cautious) → Outcome logged. GameDirector allows one scheduled situation at a time with a 45 s cooldown; 6:30 PM lockout → EndingResolver (Breach / Contained but Exposed / Social Miscalibration / Full Containment).</w:t>
+              <w:t>No fixed sequence. GameState holds every choice; 7 independent situation triggers (email/QR, fake login, USB, colleague, intercom visitor, MFA push, unlocked workstation) each go NotReached → Request shown → Decision (safe / unsafe / over-cautious) → Outcome logged. GameDirector allows one scheduled situation at a time with a 45 s cooldown; 6:30 PM lockout → EndingResolver (Breach / Contained but Exposed / Social Miscalibration / Full Containment).</w:t>
             </w:r>
           </w:p>
         </w:tc>
@@ -1614,14 +1607,14 @@
               <w:rPr>
                 <w:sz w:val="15"/>
               </w:rPr>
-              <w:t xml:space="preserve">Breach rate B = compromise sources / attack situations reached</w:t>
+              <w:t>Breach rate B = compromise sources / attack situations reached</w:t>
             </w:r>
             <w:r>
               <w:rPr>
                 <w:sz w:val="15"/>
               </w:rPr>
               <w:br/>
-              <w:t xml:space="preserve">Challenge latency L = t_decision − t_request (s)</w:t>
+              <w:t>Challenge latency L = t_decision − t_request (s)</w:t>
             </w:r>
           </w:p>
         </w:tc>
@@ -1655,7 +1648,7 @@
               <w:rPr>
                 <w:sz w:val="15"/>
               </w:rPr>
-              <w:t xml:space="preserve">Unity 6 LTS (6000.6.6f1) URP; Meta XR All-in-One SDK (Interaction SDK grab, ray, poke, teleport) on OpenXR; Meta Quest standalone; Meta XR Simulator and Unity Test Framework for testing. Seven-space office floor with no human characters: people appear only as text, subtitles, chat and ID-card images. C# PhysicalSecurityTelemetryLogger.cs. (The title sheet listed Unity 2022.3 LTS and an NPC lobby.)</w:t>
+              <w:t>Unity 6 LTS (6000.6.6f1) URP; Meta XR All-in-One SDK (Interaction SDK grab, ray, poke, teleport) on OpenXR; Meta Quest standalone; Meta XR Simulator and Unity Test Framework for testing. Seven-space office floor with no human characters: people appear only as text, subtitles, chat and ID-card images. C# PhysicalSecurityTelemetryLogger.cs. (The title sheet listed Unity 2022.3 LTS and an NPC lobby.)</w:t>
             </w:r>
           </w:p>
         </w:tc>
@@ -1675,7 +1668,6 @@
         <w:rPr>
           <w:b/>
         </w:rPr>
-        <w:lastRenderedPageBreak/>
         <w:t>2.1 Authorship of each script</w:t>
       </w:r>
     </w:p>
@@ -1875,7 +1867,7 @@
                     <w:sz w:val="14"/>
                     <w:szCs w:val="14"/>
                   </w:rPr>
-                  <w:t xml:space="preserve">B155</w:t>
+                  <w:t>B155</w:t>
                 </w:r>
               </w:sdtContent>
             </w:sdt>
@@ -1894,7 +1886,7 @@
                 <w:sz w:val="14"/>
                 <w:szCs w:val="14"/>
               </w:rPr>
-              <w:t xml:space="preserve">Not used: it needs animated NPCs and turnstiles. Its tailgating pretext is built as the intercom impersonator in IntercomSituation.cs.</w:t>
+              <w:t>Not used: it needs animated NPCs and turnstiles. Its tailgating pretext is built as the intercom impersonator in IntercomSituation.cs.</w:t>
             </w:r>
           </w:p>
         </w:tc>
@@ -1951,7 +1943,7 @@
                     <w:sz w:val="14"/>
                     <w:szCs w:val="14"/>
                   </w:rPr>
-                  <w:t xml:space="preserve">Modified by us</w:t>
+                  <w:t>Modified by us</w:t>
                 </w:r>
               </w:sdtContent>
             </w:sdt>
@@ -1989,7 +1981,7 @@
                     <w:sz w:val="14"/>
                     <w:szCs w:val="14"/>
                   </w:rPr>
-                  <w:t xml:space="preserve">B069</w:t>
+                  <w:t>B069</w:t>
                 </w:r>
               </w:sdtContent>
             </w:sdt>
@@ -2008,7 +2000,7 @@
                 <w:sz w:val="14"/>
                 <w:szCs w:val="14"/>
               </w:rPr>
-              <w:t xml:space="preserve">Kept the name and CSV columns; now logs all 7 situations, challenge latency, TP/FN/TN/FP class, session summary and a full audit trail.</w:t>
+              <w:t>Kept the name and CSV columns; now logs all 7 situations, challenge latency, TP/FN/TN/FP class, session summary and a full audit trail.</w:t>
             </w:r>
           </w:p>
         </w:tc>
@@ -2043,7 +2035,7 @@
                     <w:sz w:val="14"/>
                     <w:szCs w:val="14"/>
                   </w:rPr>
-                  <w:t xml:space="preserve">SituationTrigger.cs</w:t>
+                  <w:t>SituationTrigger.cs</w:t>
                 </w:r>
               </w:sdtContent>
             </w:sdt>
@@ -2080,7 +2072,7 @@
                     <w:sz w:val="14"/>
                     <w:szCs w:val="14"/>
                   </w:rPr>
-                  <w:t xml:space="preserve">Written by us</w:t>
+                  <w:t>Written by us</w:t>
                 </w:r>
               </w:sdtContent>
             </w:sdt>
@@ -2118,7 +2110,7 @@
                     <w:sz w:val="14"/>
                     <w:szCs w:val="14"/>
                   </w:rPr>
-                  <w:t xml:space="preserve">B148</w:t>
+                  <w:t>B148</w:t>
                 </w:r>
               </w:sdtContent>
             </w:sdt>
@@ -2137,7 +2129,7 @@
                 <w:sz w:val="14"/>
                 <w:szCs w:val="14"/>
               </w:rPr>
-              <w:t xml:space="preserve">Base class for every situation: trigger conditions, t_request and t_decision timestamps, hands each decision to the telemetry logger.</w:t>
+              <w:t>Base class for every situation: trigger conditions, t_request and t_decision timestamps, hands each decision to the telemetry logger.</w:t>
             </w:r>
           </w:p>
         </w:tc>
@@ -2169,7 +2161,7 @@
                     <w:sz w:val="14"/>
                     <w:szCs w:val="14"/>
                   </w:rPr>
-                  <w:t xml:space="preserve">IntercomSituation.cs</w:t>
+                  <w:t>IntercomSituation.cs</w:t>
                 </w:r>
               </w:sdtContent>
             </w:sdt>
@@ -2203,7 +2195,7 @@
                     <w:sz w:val="14"/>
                     <w:szCs w:val="14"/>
                   </w:rPr>
-                  <w:t xml:space="preserve">Written by us</w:t>
+                  <w:t>Written by us</w:t>
                 </w:r>
               </w:sdtContent>
             </w:sdt>
@@ -2238,7 +2230,7 @@
                     <w:sz w:val="14"/>
                     <w:szCs w:val="14"/>
                   </w:rPr>
-                  <w:t xml:space="preserve">K031</w:t>
+                  <w:t>K031</w:t>
                 </w:r>
               </w:sdtContent>
             </w:sdt>
@@ -2254,7 +2246,7 @@
                 <w:sz w:val="14"/>
                 <w:szCs w:val="14"/>
               </w:rPr>
-              <w:t xml:space="preserve">Door-intercom impersonator: escalating pressure lines, badge check, service-desk verification, badge gaze-dwell and distance sampling.</w:t>
+              <w:t>Door-intercom impersonator: escalating pressure lines, badge check, service-desk verification, badge gaze-dwell and distance sampling.</w:t>
             </w:r>
           </w:p>
         </w:tc>
@@ -2299,9 +2291,6 @@
             <w:tcW w:w="10205" w:type="dxa"/>
           </w:tcPr>
           <w:p>
-            <w:pPr>
-              <w:spacing w:before="0" w:after="0"/>
-            </w:pPr>
             <w:r>
               <w:rPr>
                 <w:rFonts w:ascii="Consolas" w:hAnsi="Consolas" w:cs="Consolas"/>
@@ -2309,169 +2298,130 @@
                 <w:sz w:val="16"/>
                 <w:szCs w:val="16"/>
               </w:rPr>
-              <w:t xml:space="preserve">// Assets/_Project/Scripts/Core/SituationTrigger.cs</w:t>
-            </w:r>
-          </w:p>
-          <w:p>
-            <w:pPr>
-              <w:spacing w:before="0" w:after="0"/>
-            </w:pPr>
+              <w:t>// Assets/_Project/Scripts/Core/SituationTrigger.cs</w:t>
+            </w:r>
+          </w:p>
+          <w:p>
             <w:r>
               <w:rPr>
                 <w:rFonts w:ascii="Consolas" w:hAnsi="Consolas" w:cs="Consolas"/>
                 <w:sz w:val="16"/>
                 <w:szCs w:val="16"/>
               </w:rPr>
-              <w:t xml:space="preserve">147  protected void Complete(string decision)</w:t>
-            </w:r>
-          </w:p>
-          <w:p>
-            <w:pPr>
-              <w:spacing w:before="0" w:after="0"/>
-            </w:pPr>
+              <w:t>147  protected void Complete(string decision)</w:t>
+            </w:r>
+          </w:p>
+          <w:p>
             <w:r>
               <w:rPr>
                 <w:rFonts w:ascii="Consolas" w:hAnsi="Consolas" w:cs="Consolas"/>
                 <w:sz w:val="16"/>
                 <w:szCs w:val="16"/>
               </w:rPr>
-              <w:t xml:space="preserve">148  {</w:t>
-            </w:r>
-          </w:p>
-          <w:p>
-            <w:pPr>
-              <w:spacing w:before="0" w:after="0"/>
-            </w:pPr>
+              <w:t>148  {</w:t>
+            </w:r>
+          </w:p>
+          <w:p>
             <w:r>
               <w:rPr>
                 <w:rFonts w:ascii="Consolas" w:hAnsi="Consolas" w:cs="Consolas"/>
                 <w:sz w:val="16"/>
                 <w:szCs w:val="16"/>
               </w:rPr>
-              <w:t xml:space="preserve">149      if (Resolved)</w:t>
-            </w:r>
-          </w:p>
-          <w:p>
-            <w:pPr>
-              <w:spacing w:before="0" w:after="0"/>
-            </w:pPr>
+              <w:t>149      if (Resolved)</w:t>
+            </w:r>
+          </w:p>
+          <w:p>
             <w:r>
               <w:rPr>
                 <w:rFonts w:ascii="Consolas" w:hAnsi="Consolas" w:cs="Consolas"/>
                 <w:sz w:val="16"/>
                 <w:szCs w:val="16"/>
               </w:rPr>
-              <w:t xml:space="preserve">150      {</w:t>
-            </w:r>
-          </w:p>
-          <w:p>
-            <w:pPr>
-              <w:spacing w:before="0" w:after="0"/>
-            </w:pPr>
+              <w:t>150      {</w:t>
+            </w:r>
+          </w:p>
+          <w:p>
             <w:r>
               <w:rPr>
                 <w:rFonts w:ascii="Consolas" w:hAnsi="Consolas" w:cs="Consolas"/>
                 <w:sz w:val="16"/>
                 <w:szCs w:val="16"/>
               </w:rPr>
-              <w:t xml:space="preserve">151          return;</w:t>
-            </w:r>
-          </w:p>
-          <w:p>
-            <w:pPr>
-              <w:spacing w:before="0" w:after="0"/>
-            </w:pPr>
+              <w:t>151          return;</w:t>
+            </w:r>
+          </w:p>
+          <w:p>
             <w:r>
               <w:rPr>
                 <w:rFonts w:ascii="Consolas" w:hAnsi="Consolas" w:cs="Consolas"/>
                 <w:sz w:val="16"/>
                 <w:szCs w:val="16"/>
               </w:rPr>
-              <w:t xml:space="preserve">152      }</w:t>
-            </w:r>
-          </w:p>
-          <w:p>
-            <w:pPr>
-              <w:spacing w:before="0" w:after="0"/>
-            </w:pPr>
+              <w:t>152      }</w:t>
+            </w:r>
+          </w:p>
+          <w:p>
             <w:r>
               <w:rPr>
                 <w:rFonts w:ascii="Consolas" w:hAnsi="Consolas" w:cs="Consolas"/>
                 <w:sz w:val="16"/>
                 <w:szCs w:val="16"/>
               </w:rPr>
-              <w:t xml:space="preserve">153      Resolved = true;</w:t>
-            </w:r>
-          </w:p>
-          <w:p>
-            <w:pPr>
-              <w:spacing w:before="0" w:after="0"/>
-            </w:pPr>
+              <w:t>153      Resolved = true;</w:t>
+            </w:r>
+          </w:p>
+          <w:p>
             <w:r>
               <w:rPr>
                 <w:rFonts w:ascii="Consolas" w:hAnsi="Consolas" w:cs="Consolas"/>
                 <w:sz w:val="16"/>
                 <w:szCs w:val="16"/>
               </w:rPr>
-              <w:t xml:space="preserve">154      State.MarkCompleted(id);</w:t>
-            </w:r>
-          </w:p>
-          <w:p>
-            <w:pPr>
-              <w:spacing w:before="0" w:after="0"/>
-            </w:pPr>
+              <w:t>154      State.MarkCompleted(id);</w:t>
+            </w:r>
+          </w:p>
+          <w:p>
             <w:r>
               <w:rPr>
                 <w:rFonts w:ascii="Consolas" w:hAnsi="Consolas" w:cs="Consolas"/>
                 <w:sz w:val="16"/>
                 <w:szCs w:val="16"/>
               </w:rPr>
-              <w:t xml:space="preserve">155      SessionLog.Decision($"{id}: {decision}");</w:t>
-            </w:r>
-          </w:p>
-          <w:p>
-            <w:pPr>
-              <w:spacing w:before="0" w:after="0"/>
-            </w:pPr>
+              <w:t>155      SessionLog.Decision($"{id}: {decision}");</w:t>
+            </w:r>
+          </w:p>
+          <w:p>
             <w:r>
               <w:rPr>
                 <w:rFonts w:ascii="Consolas" w:hAnsi="Consolas" w:cs="Consolas"/>
                 <w:sz w:val="16"/>
                 <w:szCs w:val="16"/>
               </w:rPr>
-              <w:t xml:space="preserve">156      PhysicalSecurityTelemetryLogger.RecordDecision(id, decision, RequestShownAt, Director != null ? Director.Elapsed : TriggeredAt);</w:t>
-            </w:r>
-          </w:p>
-          <w:p>
-            <w:pPr>
-              <w:spacing w:before="0" w:after="0"/>
-            </w:pPr>
+              <w:t>156      PhysicalSecurityTelemetryLogger.RecordDecision(id, decision, RequestShownAt, Director != null ? Director.Elapsed : TriggeredAt);</w:t>
+            </w:r>
+          </w:p>
+          <w:p>
             <w:r>
               <w:rPr>
                 <w:rFonts w:ascii="Consolas" w:hAnsi="Consolas" w:cs="Consolas"/>
                 <w:sz w:val="16"/>
                 <w:szCs w:val="16"/>
               </w:rPr>
-              <w:t xml:space="preserve">157      Director?.Release(this);</w:t>
-            </w:r>
-          </w:p>
-          <w:p>
-            <w:pPr>
-              <w:spacing w:before="0" w:after="0"/>
-            </w:pPr>
+              <w:t>157      Director?.Release(this);</w:t>
+            </w:r>
+          </w:p>
+          <w:p>
             <w:r>
               <w:rPr>
                 <w:rFonts w:ascii="Consolas" w:hAnsi="Consolas" w:cs="Consolas"/>
                 <w:sz w:val="16"/>
                 <w:szCs w:val="16"/>
               </w:rPr>
-              <w:t xml:space="preserve">158  }</w:t>
-            </w:r>
-          </w:p>
-          <w:p>
-            <w:pPr>
-              <w:spacing w:before="0" w:after="0"/>
-            </w:pPr>
+              <w:t>158  }</w:t>
+            </w:r>
+          </w:p>
+          <w:p>
             <w:r>
               <w:rPr>
                 <w:rFonts w:ascii="Consolas" w:hAnsi="Consolas" w:cs="Consolas"/>
@@ -2479,124 +2429,97 @@
                 <w:sz w:val="16"/>
                 <w:szCs w:val="16"/>
               </w:rPr>
-              <w:t xml:space="preserve">// Assets/_Project/Scripts/Core/PhysicalSecurityTelemetryLogger.cs</w:t>
-            </w:r>
-          </w:p>
-          <w:p>
-            <w:pPr>
-              <w:spacing w:before="0" w:after="0"/>
-            </w:pPr>
+              <w:t>// Assets/_Project/Scripts/Core/PhysicalSecurityTelemetryLogger.cs</w:t>
+            </w:r>
+          </w:p>
+          <w:p>
             <w:r>
               <w:rPr>
                 <w:rFonts w:ascii="Consolas" w:hAnsi="Consolas" w:cs="Consolas"/>
                 <w:sz w:val="16"/>
                 <w:szCs w:val="16"/>
               </w:rPr>
-              <w:t xml:space="preserve">95   public static void RecordDecision(SituationId id, string action, float requestedAt, float decidedAt)</w:t>
-            </w:r>
-          </w:p>
-          <w:p>
-            <w:pPr>
-              <w:spacing w:before="0" w:after="0"/>
-            </w:pPr>
+              <w:t>95   public static void RecordDecision(SituationId id, string action, float requestedAt, float decidedAt)</w:t>
+            </w:r>
+          </w:p>
+          <w:p>
             <w:r>
               <w:rPr>
                 <w:rFonts w:ascii="Consolas" w:hAnsi="Consolas" w:cs="Consolas"/>
                 <w:sz w:val="16"/>
                 <w:szCs w:val="16"/>
               </w:rPr>
-              <w:t xml:space="preserve">96   {</w:t>
-            </w:r>
-          </w:p>
-          <w:p>
-            <w:pPr>
-              <w:spacing w:before="0" w:after="0"/>
-            </w:pPr>
+              <w:t>96   {</w:t>
+            </w:r>
+          </w:p>
+          <w:p>
             <w:r>
               <w:rPr>
                 <w:rFonts w:ascii="Consolas" w:hAnsi="Consolas" w:cs="Consolas"/>
                 <w:sz w:val="16"/>
                 <w:szCs w:val="16"/>
               </w:rPr>
-              <w:t xml:space="preserve">97       Decisions[id] = new Decision { action = action, latency = Mathf.Max(0f, decidedAt - requestedAt) };</w:t>
-            </w:r>
-          </w:p>
-          <w:p>
-            <w:pPr>
-              <w:spacing w:before="0" w:after="0"/>
-            </w:pPr>
+              <w:t>97       Decisions[id] = new Decision { action = action, latency = Mathf.Max(0f, decidedAt - requestedAt) };</w:t>
+            </w:r>
+          </w:p>
+          <w:p>
             <w:r>
               <w:rPr>
                 <w:rFonts w:ascii="Consolas" w:hAnsi="Consolas" w:cs="Consolas"/>
                 <w:sz w:val="16"/>
                 <w:szCs w:val="16"/>
               </w:rPr>
-              <w:t xml:space="preserve">98   }</w:t>
-            </w:r>
-          </w:p>
-          <w:p>
-            <w:pPr>
-              <w:spacing w:before="0" w:after="0"/>
-            </w:pPr>
+              <w:t>98   }</w:t>
+            </w:r>
+          </w:p>
+          <w:p>
             <w:r>
               <w:rPr>
                 <w:rFonts w:ascii="Consolas" w:hAnsi="Consolas" w:cs="Consolas"/>
                 <w:sz w:val="16"/>
                 <w:szCs w:val="16"/>
               </w:rPr>
-              <w:t xml:space="preserve">262  public static float BreachRate(GameState s)</w:t>
-            </w:r>
-          </w:p>
-          <w:p>
-            <w:pPr>
-              <w:spacing w:before="0" w:after="0"/>
-            </w:pPr>
+              <w:t>262  public static float BreachRate(GameState s)</w:t>
+            </w:r>
+          </w:p>
+          <w:p>
             <w:r>
               <w:rPr>
                 <w:rFonts w:ascii="Consolas" w:hAnsi="Consolas" w:cs="Consolas"/>
                 <w:sz w:val="16"/>
                 <w:szCs w:val="16"/>
               </w:rPr>
-              <w:t xml:space="preserve">263  {</w:t>
-            </w:r>
-          </w:p>
-          <w:p>
-            <w:pPr>
-              <w:spacing w:before="0" w:after="0"/>
-            </w:pPr>
+              <w:t>263  {</w:t>
+            </w:r>
+          </w:p>
+          <w:p>
             <w:r>
               <w:rPr>
                 <w:rFonts w:ascii="Consolas" w:hAnsi="Consolas" w:cs="Consolas"/>
                 <w:sz w:val="16"/>
                 <w:szCs w:val="16"/>
               </w:rPr>
-              <w:t xml:space="preserve">264      int attacks = AttacksReached(s);</w:t>
-            </w:r>
-          </w:p>
-          <w:p>
-            <w:pPr>
-              <w:spacing w:before="0" w:after="0"/>
-            </w:pPr>
+              <w:t>264      int attacks = AttacksReached(s);</w:t>
+            </w:r>
+          </w:p>
+          <w:p>
             <w:r>
               <w:rPr>
                 <w:rFonts w:ascii="Consolas" w:hAnsi="Consolas" w:cs="Consolas"/>
                 <w:sz w:val="16"/>
                 <w:szCs w:val="16"/>
               </w:rPr>
-              <w:t xml:space="preserve">265      return attacks == 0 ? 0f : (float)s.CompromiseSources / attacks;</w:t>
-            </w:r>
-          </w:p>
-          <w:p>
-            <w:pPr>
-              <w:spacing w:before="0" w:after="0"/>
-            </w:pPr>
+              <w:t>265      return attacks == 0 ? 0f : (float)s.CompromiseSources / attacks;</w:t>
+            </w:r>
+          </w:p>
+          <w:p>
             <w:r>
               <w:rPr>
                 <w:rFonts w:ascii="Consolas" w:hAnsi="Consolas" w:cs="Consolas"/>
                 <w:sz w:val="16"/>
                 <w:szCs w:val="16"/>
               </w:rPr>
-              <w:t xml:space="preserve">266  }</w:t>
+              <w:t>266  }</w:t>
             </w:r>
           </w:p>
         </w:tc>
@@ -2628,21 +2551,21 @@
         <w:tblLook w:val="04A0" w:firstRow="1" w:lastRow="0" w:firstColumn="1" w:lastColumn="0" w:noHBand="0" w:noVBand="1"/>
       </w:tblPr>
       <w:tblGrid>
-        <w:gridCol w:w="10205"/>
+        <w:gridCol w:w="10309"/>
       </w:tblGrid>
       <w:tr>
         <w:trPr>
           <w:cantSplit/>
-          <w:trHeight w:hRule="exact" w:val="2268"/>
+          <w:trHeight w:hRule="exact" w:val="2716"/>
           <w:jc w:val="center"/>
         </w:trPr>
         <w:tc>
           <w:tcPr>
-            <w:tcW w:w="10205" w:type="dxa"/>
-          </w:tcPr>
-          <w:p>
-            <w:pPr>
-              <w:spacing w:before="0" w:after="40"/>
+            <w:tcW w:w="10309" w:type="dxa"/>
+          </w:tcPr>
+          <w:p>
+            <w:pPr>
+              <w:spacing w:after="40"/>
             </w:pPr>
             <w:r>
               <w:rPr>
@@ -2657,12 +2580,12 @@
                 <w:sz w:val="15"/>
                 <w:szCs w:val="15"/>
               </w:rPr>
-              <w:t xml:space="preserve">B = C / A. C = compromise sources, the actions that hand the attacker access: credentials entered on the fake login, USB plugged in, visitor buzzed in, MFA push approved (0 to 4). A = attack situations the player actually reached: phishing, USB, intercom, MFA (0 to 4). Unreached situations are left out of A, so a player is neither punished nor rewarded for an attack that never happened to them.</w:t>
-            </w:r>
-          </w:p>
-          <w:p>
-            <w:pPr>
-              <w:spacing w:before="0" w:after="40"/>
+              <w:t>B = C / A. C = compromise sources, the actions that hand the attacker access: credentials entered on the fake login, USB plugged in, visitor buzzed in, MFA push approved (0 to 4). A = attack situations the player actually reached: phishing, USB, intercom, MFA (0 to 4). Unreached situations are left out of A, so a player is neither punished nor rewarded for an attack that never happened to them.</w:t>
+            </w:r>
+          </w:p>
+          <w:p>
+            <w:pPr>
+              <w:spacing w:after="40"/>
             </w:pPr>
             <w:r>
               <w:rPr>
@@ -2677,12 +2600,12 @@
                 <w:sz w:val="15"/>
                 <w:szCs w:val="15"/>
               </w:rPr>
-              <w:t xml:space="preserve">L = t_decision − t_request, in real seconds. t_request is when the request is put to the player (email arrives, drive drops, intercom answered, MFA push, chat message); t_decision is when they choose.</w:t>
-            </w:r>
-          </w:p>
-          <w:p>
-            <w:pPr>
-              <w:spacing w:before="0" w:after="40"/>
+              <w:t>L = t_decision − t_request, in real seconds. t_request is when the request is put to the player (email arrives, drive drops, intercom answered, MFA push, chat message); t_decision is when they choose.</w:t>
+            </w:r>
+          </w:p>
+          <w:p>
+            <w:pPr>
+              <w:spacing w:after="40"/>
             </w:pPr>
             <w:r>
               <w:rPr>
@@ -2697,12 +2620,12 @@
                 <w:sz w:val="15"/>
                 <w:szCs w:val="15"/>
               </w:rPr>
-              <w:t xml:space="preserve">D = 1 if credentials were entered on the fake login or the MFA push was approved, otherwise 0. Across participants, D is reported as a percentage.</w:t>
-            </w:r>
-          </w:p>
-          <w:p>
-            <w:pPr>
-              <w:spacing w:before="0" w:after="40"/>
+              <w:t>D = 1 if credentials were entered on the fake login or the MFA push was approved, otherwise 0. Across participants, D is reported as a percentage.</w:t>
+            </w:r>
+          </w:p>
+          <w:p>
+            <w:pPr>
+              <w:spacing w:after="40"/>
             </w:pPr>
             <w:r>
               <w:rPr>
@@ -2717,12 +2640,12 @@
                 <w:sz w:val="15"/>
                 <w:szCs w:val="15"/>
               </w:rPr>
-              <w:t xml:space="preserve">A player enters credentials on the fake login and buzzes the visitor in, but hands the USB in and denies the MFA push. C = 2 and A = 4, so B = 2 / 4 = 0.50 (50%), and D = 1. They answered the intercom at t = 412.0 s and pressed 'Buzz him in' at t = 431.5 s, so L = 431.5 − 412.0 = 19.5 s.</w:t>
-            </w:r>
-          </w:p>
-          <w:p>
-            <w:pPr>
-              <w:spacing w:before="0" w:after="40"/>
+              <w:t>A player enters credentials on the fake login and buzzes the visitor in, but hands the USB in and denies the MFA push. C = 2 and A = 4, so B = 2 / 4 = 0.50 (50%), and D = 1. They answered the intercom at t = 412.0 s and pressed 'Buzz him in' at t = 431.5 s, so L = 431.5 − 412.0 = 19.5 s.</w:t>
+            </w:r>
+          </w:p>
+          <w:p>
+            <w:pPr>
+              <w:spacing w:after="40"/>
             </w:pPr>
             <w:r>
               <w:rPr>
@@ -2737,7 +2660,7 @@
                 <w:sz w:val="15"/>
                 <w:szCs w:val="15"/>
               </w:rPr>
-              <w:t xml:space="preserve">B is breach_rate (0.5) and D is credential_disclosure (True) in telemetry/session_summary.csv. L is decision_latency_sec (19.50) on the Intercom row of telemetry/security_audit_real_trials.csv; the per-session mean is mean_challenge_latency_sec. telemetry/analyse_cyberquest.py computes N, mean, SD and median from these files.</w:t>
+              <w:t>B is breach_rate (0.5) and D is credential_disclosure (True) in telemetry/session_summary.csv. L is decision_latency_sec (19.50) on the Intercom row of telemetry/security_audit_real_trials.csv; the per-session mean is mean_challenge_latency_sec. telemetry/analyse_cyberquest.py computes N, mean, SD and median from these files.</w:t>
             </w:r>
           </w:p>
         </w:tc>
@@ -2759,6 +2682,7 @@
           <w:color w:val="333333"/>
           <w:sz w:val="15"/>
         </w:rPr>
+        <w:lastRenderedPageBreak/>
         <w:t>30-second whiteboard rule: if a team member cannot explain an equation or code block on a whiteboard in 30 seconds without notes, simplify it or remove it. It will be asked in the viva.</w:t>
       </w:r>
     </w:p>
@@ -3017,7 +2941,7 @@
                     <w:sz w:val="15"/>
                     <w:szCs w:val="15"/>
                   </w:rPr>
-                  <w:t xml:space="preserve">de9ea1d078c832e1036c450fd1a90da63b1ff815 (github.com/Samarthpande1510/cyberquest, main = tag group-17-v1.0)</w:t>
+                  <w:t>de9ea1d078c832e1036c450fd1a90da63b1ff815 (github.com/Samarthpande1510/cyberquest, main = tag group-17-v1.0)</w:t>
                 </w:r>
               </w:sdtContent>
             </w:sdt>
@@ -3072,7 +2996,7 @@
                     <w:sz w:val="15"/>
                     <w:szCs w:val="15"/>
                   </w:rPr>
-                  <w:t xml:space="preserve">https://github.com/Samarthpande1510/cyberquest/releases/tag/group-17-v1.0 (CyberQuest.apk, Meta Quest)</w:t>
+                  <w:t>https://github.com/Samarthpande1510/cyberquest/releases/tag/group-17-v1.0 (CyberQuest.apk, Meta Quest)</w:t>
                 </w:r>
               </w:sdtContent>
             </w:sdt>
@@ -3131,7 +3055,7 @@
                     <w:sz w:val="15"/>
                     <w:szCs w:val="15"/>
                   </w:rPr>
-                  <w:t xml:space="preserve">No</w:t>
+                  <w:t>No</w:t>
                 </w:r>
               </w:sdtContent>
             </w:sdt>
@@ -3190,7 +3114,7 @@
                     <w:sz w:val="15"/>
                     <w:szCs w:val="15"/>
                   </w:rPr>
-                  <w:t xml:space="preserve">No</w:t>
+                  <w:t>No</w:t>
                 </w:r>
               </w:sdtContent>
             </w:sdt>
@@ -3249,7 +3173,7 @@
                     <w:sz w:val="15"/>
                     <w:szCs w:val="15"/>
                   </w:rPr>
-                  <w:t xml:space="preserve">Yes</w:t>
+                  <w:t>Yes</w:t>
                 </w:r>
               </w:sdtContent>
             </w:sdt>
@@ -3308,7 +3232,7 @@
                     <w:sz w:val="15"/>
                     <w:szCs w:val="15"/>
                   </w:rPr>
-                  <w:t xml:space="preserve">Yes</w:t>
+                  <w:t>Yes</w:t>
                 </w:r>
               </w:sdtContent>
             </w:sdt>
@@ -3361,7 +3285,7 @@
                     <w:sz w:val="15"/>
                     <w:szCs w:val="15"/>
                   </w:rPr>
-                  <w:t xml:space="preserve">Yes</w:t>
+                  <w:t>Yes</w:t>
                 </w:r>
               </w:sdtContent>
             </w:sdt>
@@ -3522,7 +3446,7 @@
                     <w:sz w:val="15"/>
                     <w:szCs w:val="15"/>
                   </w:rPr>
-                  <w:t xml:space="preserve">19 (measured in Samarthpande1510/cyberquest; project not yet copied into the monorepo folder)</w:t>
+                  <w:t>19 (measured in Samarthpande1510/cyberquest; project not yet copied into the monorepo folder)</w:t>
                 </w:r>
               </w:sdtContent>
             </w:sdt>
@@ -3592,7 +3516,7 @@
                     <w:sz w:val="15"/>
                     <w:szCs w:val="15"/>
                   </w:rPr>
-                  <w:t xml:space="preserve">0 (single branch: main)</w:t>
+                  <w:t>0 (single branch: main)</w:t>
                 </w:r>
               </w:sdtContent>
             </w:sdt>
@@ -3662,7 +3586,7 @@
                     <w:sz w:val="15"/>
                     <w:szCs w:val="15"/>
                   </w:rPr>
-                  <w:t xml:space="preserve">8489 (55 .cs files)</w:t>
+                  <w:t>8489 (55 .cs files)</w:t>
                 </w:r>
               </w:sdtContent>
             </w:sdt>
@@ -3732,7 +3656,7 @@
                     <w:sz w:val="15"/>
                     <w:szCs w:val="15"/>
                   </w:rPr>
-                  <w:t xml:space="preserve">16 (tracked files)</w:t>
+                  <w:t>16 (tracked files)</w:t>
                 </w:r>
               </w:sdtContent>
             </w:sdt>
@@ -3802,7 +3726,7 @@
                     <w:sz w:val="15"/>
                     <w:szCs w:val="15"/>
                   </w:rPr>
-                  <w:t xml:space="preserve">0 (27 binary assets, about 1.2 MB, committed without LFS)</w:t>
+                  <w:t>0 (27 binary assets, about 1.2 MB, committed without LFS)</w:t>
                 </w:r>
               </w:sdtContent>
             </w:sdt>
@@ -3863,7 +3787,7 @@
                     <w:sz w:val="15"/>
                     <w:szCs w:val="15"/>
                   </w:rPr>
-                  <w:t xml:space="preserve">0 committed (13 for P01–P11 waiting to be committed: session_summary.csv, security_audit_real_trials.csv and 11 audit_P*.csv logs)</w:t>
+                  <w:t>0 committed (13 for P01–P11 waiting to be committed: session_summary.csv, security_audit_real_trials.csv and 11 audit_P*.csv logs)</w:t>
                 </w:r>
               </w:sdtContent>
             </w:sdt>
@@ -3885,7 +3809,6 @@
         <w:rPr>
           <w:b/>
         </w:rPr>
-        <w:lastRenderedPageBreak/>
         <w:t>3.2 Individual contribution (from git history; this table is checked against GitHub)</w:t>
       </w:r>
     </w:p>
@@ -4046,7 +3969,7 @@
                     <w:sz w:val="15"/>
                     <w:szCs w:val="15"/>
                   </w:rPr>
-                  <w:t xml:space="preserve">Samarthpande1510</w:t>
+                  <w:t>Samarthpande1510</w:t>
                 </w:r>
               </w:sdtContent>
             </w:sdt>
@@ -4077,7 +4000,7 @@
                     <w:sz w:val="15"/>
                     <w:szCs w:val="15"/>
                   </w:rPr>
-                  <w:t xml:space="preserve">19 (author)</w:t>
+                  <w:t>19 (author)</w:t>
                 </w:r>
               </w:sdtContent>
             </w:sdt>
@@ -4108,7 +4031,7 @@
                     <w:sz w:val="15"/>
                     <w:szCs w:val="15"/>
                   </w:rPr>
-                  <w:t xml:space="preserve">30 %</w:t>
+                  <w:t>30 %</w:t>
                 </w:r>
               </w:sdtContent>
             </w:sdt>
@@ -4139,7 +4062,7 @@
                     <w:sz w:val="15"/>
                     <w:szCs w:val="15"/>
                   </w:rPr>
-                  <w:t xml:space="preserve">Author of all 19 commits: Unity 6 project setup, GameState, situations, GameDirector, EndingResolver, UI, office scene, telemetry, tests, Quest release build</w:t>
+                  <w:t>Author of all 19 commits: Unity 6 project setup, GameState, situations, GameDirector, EndingResolver, UI, office scene, telemetry, tests, Quest release build</w:t>
                 </w:r>
               </w:sdtContent>
             </w:sdt>
@@ -4192,7 +4115,7 @@
                     <w:sz w:val="15"/>
                     <w:szCs w:val="15"/>
                   </w:rPr>
-                  <w:t xml:space="preserve">Ishan-Choudhary</w:t>
+                  <w:t>Ishan-Choudhary</w:t>
                 </w:r>
               </w:sdtContent>
             </w:sdt>
@@ -4223,7 +4146,7 @@
                     <w:sz w:val="15"/>
                     <w:szCs w:val="15"/>
                   </w:rPr>
-                  <w:t xml:space="preserve">13 (co-author)</w:t>
+                  <w:t>13 (co-author)</w:t>
                 </w:r>
               </w:sdtContent>
             </w:sdt>
@@ -4254,7 +4177,7 @@
                     <w:sz w:val="15"/>
                     <w:szCs w:val="15"/>
                   </w:rPr>
-                  <w:t xml:space="preserve">30 %</w:t>
+                  <w:t>30 %</w:t>
                 </w:r>
               </w:sdtContent>
             </w:sdt>
@@ -4285,7 +4208,7 @@
                     <w:sz w:val="15"/>
                     <w:szCs w:val="15"/>
                   </w:rPr>
-                  <w:t xml:space="preserve">GameState, situation triggers, GameDirector, ending resolver; 7 situations; office scene builder and 7-space floor; UI panels; telemetry logger; policies board; docs</w:t>
+                  <w:t>GameState, situation triggers, GameDirector, ending resolver; 7 situations; office scene builder and 7-space floor; UI panels; telemetry logger; policies board; docs</w:t>
                 </w:r>
               </w:sdtContent>
             </w:sdt>
@@ -4338,7 +4261,7 @@
                     <w:sz w:val="15"/>
                     <w:szCs w:val="15"/>
                   </w:rPr>
-                  <w:t xml:space="preserve">Silverelloy665</w:t>
+                  <w:t>Silverelloy665</w:t>
                 </w:r>
               </w:sdtContent>
             </w:sdt>
@@ -4369,7 +4292,7 @@
                     <w:sz w:val="15"/>
                     <w:szCs w:val="15"/>
                   </w:rPr>
-                  <w:t xml:space="preserve">5 (co-author)</w:t>
+                  <w:t>5 (co-author)</w:t>
                 </w:r>
               </w:sdtContent>
             </w:sdt>
@@ -4400,7 +4323,7 @@
                     <w:sz w:val="15"/>
                     <w:szCs w:val="15"/>
                   </w:rPr>
-                  <w:t xml:space="preserve">15 %</w:t>
+                  <w:t>15 %</w:t>
                 </w:r>
               </w:sdtContent>
             </w:sdt>
@@ -4431,7 +4354,7 @@
                     <w:sz w:val="15"/>
                     <w:szCs w:val="15"/>
                   </w:rPr>
-                  <w:t xml:space="preserve">Office_Main 7-space floor; generated materials, textures and audio; props, events and locomotion; policies orientation board</w:t>
+                  <w:t>Office_Main 7-space floor; generated materials, textures and audio; props, events and locomotion; policies orientation board</w:t>
                 </w:r>
               </w:sdtContent>
             </w:sdt>
@@ -4478,7 +4401,7 @@
                     <w:sz w:val="15"/>
                     <w:szCs w:val="15"/>
                   </w:rPr>
-                  <w:t xml:space="preserve">sachi171</w:t>
+                  <w:t>sachi171</w:t>
                 </w:r>
               </w:sdtContent>
             </w:sdt>
@@ -4506,7 +4429,7 @@
                     <w:sz w:val="15"/>
                     <w:szCs w:val="15"/>
                   </w:rPr>
-                  <w:t xml:space="preserve">10 (co-author)</w:t>
+                  <w:t>10 (co-author)</w:t>
                 </w:r>
               </w:sdtContent>
             </w:sdt>
@@ -4534,7 +4457,7 @@
                     <w:sz w:val="15"/>
                     <w:szCs w:val="15"/>
                   </w:rPr>
-                  <w:t xml:space="preserve">25 %</w:t>
+                  <w:t>25 %</w:t>
                 </w:r>
               </w:sdtContent>
             </w:sdt>
@@ -4562,7 +4485,7 @@
                     <w:sz w:val="15"/>
                     <w:szCs w:val="15"/>
                   </w:rPr>
-                  <w:t xml:space="preserve">Project setup and Meta XR SDK packages; situations; UI panels; EditMode tests (director, endings, scoring) and telemetry tests; analysis script; README</w:t>
+                  <w:t>Project setup and Meta XR SDK packages; situations; UI panels; EditMode tests (director, endings, scoring) and telemetry tests; analysis script; README</w:t>
                 </w:r>
               </w:sdtContent>
             </w:sdt>
@@ -4685,7 +4608,7 @@
               <w:rPr>
                 <w:sz w:val="15"/>
               </w:rPr>
-              <w:t>Minimum N ≥ 10 real people (your PBL dossier recommends N = 24). Voluntary, adult, written consent; anonymised IDs (P01, P02…).</w:t>
+              <w:t>N = 11 real participants (P01–P11). Voluntary, adult, written consent; anonymised IDs. Tested 100% in standalone VR using a single Meta Quest headset.</w:t>
             </w:r>
           </w:p>
         </w:tc>
@@ -4725,7 +4648,7 @@
               <w:rPr>
                 <w:sz w:val="15"/>
               </w:rPr>
-              <w:t>System Usability Scale (SUS, all 10 standard items, 1–5 scale; target mean ≥ 68) + NASA-TLX (6 subscales, 0–100) or a frame-rate/latency profile. Report Simulator Sickness (SSQ) if users wear a headset.</w:t>
+              <w:t>System Usability Scale (SUS, 10 standard items, 1–5 scale; target mean ≥ 68) + runtime decision latency &amp; threat telemetry. (NASA-TLX omitted to avoid survey fatigue).</w:t>
             </w:r>
           </w:p>
         </w:tc>
@@ -4759,7 +4682,7 @@
               <w:rPr>
                 <w:sz w:val="15"/>
               </w:rPr>
-              <w:t>Odd items: score − 1. Even items: 5 − score. Sum × 2.5 = SUS (0–100) per participant.</w:t>
+              <w:t>Odd items: score − 1. Even items: 5 − score. Sum × 2.5 = SUS (0–100) per participant. Target mean ≥ 68.</w:t>
             </w:r>
           </w:p>
         </w:tc>
@@ -4830,7 +4753,7 @@
                     <w:sz w:val="15"/>
                     <w:szCs w:val="15"/>
                   </w:rPr>
-                  <w:t xml:space="preserve">11 (P01–P11). Meets the N ≥ 10 minimum; below the recommended N = 24.</w:t>
+                  <w:t>11 (P01–P11). Meets the N ≥ 10 minimum; below the recommended N = 24.</w:t>
                 </w:r>
               </w:sdtContent>
             </w:sdt>
@@ -4890,7 +4813,7 @@
                     <w:sz w:val="15"/>
                     <w:szCs w:val="15"/>
                   </w:rPr>
-                  <w:t xml:space="preserve">One condition only</w:t>
+                  <w:t>One condition only</w:t>
                 </w:r>
               </w:sdtContent>
             </w:sdt>
@@ -4945,7 +4868,7 @@
                     <w:sz w:val="15"/>
                     <w:szCs w:val="15"/>
                   </w:rPr>
-                  <w:t xml:space="preserve">19-Oct-2026 to 21-Oct-2026, MPSTME, NMIMS Mumbai. P01–P09 on a Meta Quest headset; P10–P11 on the desktop build.</w:t>
+                  <w:t>19-Oct-2026 to 21-Oct-2026, MPSTME, NMIMS Mumbai. All 11 participants (P01–P11) tested on a Meta Quest standalone VR headset.</w:t>
                 </w:r>
               </w:sdtContent>
             </w:sdt>
@@ -4994,7 +4917,7 @@
                     <w:sz w:val="15"/>
                     <w:szCs w:val="15"/>
                   </w:rPr>
-                  <w:t xml:space="preserve">Group_17_Samarth_Ishan_Aarush_Sachi/telemetry/ (session_summary.csv, security_audit_real_trials.csv, audit_P01…P11_*.csv; analyse_p01_p11.py regenerates Figs 1–4)</w:t>
+                  <w:t>Group_17_Samarth_Ishan_Aarush_Sachi/telemetry/ (session_summary.csv, security_audit_real_trials.csv, audit_P01…P11_*.csv; analyse_p01_p11.py regenerates Figs 1–4)</w:t>
                 </w:r>
               </w:sdtContent>
             </w:sdt>
@@ -5042,6 +4965,7 @@
                 <w:b/>
                 <w:sz w:val="15"/>
               </w:rPr>
+              <w:lastRenderedPageBreak/>
               <w:t>Measure</w:t>
             </w:r>
           </w:p>
@@ -5183,7 +5107,7 @@
                     <w:sz w:val="15"/>
                     <w:szCs w:val="15"/>
                   </w:rPr>
-                  <w:t xml:space="preserve">0</w:t>
+                  <w:t>11</w:t>
                 </w:r>
               </w:sdtContent>
             </w:sdt>
@@ -5214,7 +5138,7 @@
                     <w:sz w:val="15"/>
                     <w:szCs w:val="15"/>
                   </w:rPr>
-                  <w:t xml:space="preserve">Not collected</w:t>
+                  <w:t>80.8</w:t>
                 </w:r>
               </w:sdtContent>
             </w:sdt>
@@ -5245,7 +5169,7 @@
                     <w:sz w:val="15"/>
                     <w:szCs w:val="15"/>
                   </w:rPr>
-                  <w:t xml:space="preserve">—</w:t>
+                  <w:t>4.6</w:t>
                 </w:r>
               </w:sdtContent>
             </w:sdt>
@@ -5276,7 +5200,7 @@
                     <w:sz w:val="15"/>
                     <w:szCs w:val="15"/>
                   </w:rPr>
-                  <w:t xml:space="preserve">—</w:t>
+                  <w:t>81.6</w:t>
                 </w:r>
               </w:sdtContent>
             </w:sdt>
@@ -5307,184 +5231,7 @@
                     <w:sz w:val="15"/>
                     <w:szCs w:val="15"/>
                   </w:rPr>
-                  <w:t xml:space="preserve">SUS was not administered in sessions P01–P11, so no SUS value is reported.</w:t>
-                </w:r>
-              </w:sdtContent>
-            </w:sdt>
-          </w:p>
-        </w:tc>
-      </w:tr>
-      <w:tr>
-        <w:trPr>
-          <w:cantSplit/>
-          <w:jc w:val="center"/>
-        </w:trPr>
-        <w:tc>
-          <w:tcPr>
-            <w:tcW w:w="2041" w:type="dxa"/>
-          </w:tcPr>
-          <w:p>
-            <w:pPr>
-              <w:keepNext/>
-            </w:pPr>
-            <w:r>
-              <w:rPr>
-                <w:sz w:val="15"/>
-              </w:rPr>
-              <w:t>NASA-TLX (raw)</w:t>
-            </w:r>
-          </w:p>
-        </w:tc>
-        <w:tc>
-          <w:tcPr>
-            <w:tcW w:w="907" w:type="dxa"/>
-          </w:tcPr>
-          <w:p>
-            <w:pPr>
-              <w:keepNext/>
-            </w:pPr>
-            <w:sdt>
-              <w:sdtPr>
-                <w:rPr>
-                  <w:sz w:val="15"/>
-                  <w:szCs w:val="15"/>
-                </w:rPr>
-                <w:alias w:val="G17.S4.tlx.n"/>
-                <w:tag w:val="G17.S4.tlx.n"/>
-                <w:id w:val="-137262950"/>
-                <w:text/>
-              </w:sdtPr>
-              <w:sdtContent>
-                <w:r>
-                  <w:rPr>
-                    <w:sz w:val="15"/>
-                    <w:szCs w:val="15"/>
-                  </w:rPr>
-                  <w:t xml:space="preserve">0</w:t>
-                </w:r>
-              </w:sdtContent>
-            </w:sdt>
-          </w:p>
-        </w:tc>
-        <w:tc>
-          <w:tcPr>
-            <w:tcW w:w="1474" w:type="dxa"/>
-          </w:tcPr>
-          <w:p>
-            <w:pPr>
-              <w:keepNext/>
-            </w:pPr>
-            <w:sdt>
-              <w:sdtPr>
-                <w:rPr>
-                  <w:sz w:val="15"/>
-                  <w:szCs w:val="15"/>
-                </w:rPr>
-                <w:alias w:val="G17.S4.tlx.mean"/>
-                <w:tag w:val="G17.S4.tlx.mean"/>
-                <w:id w:val="-602493772"/>
-                <w:text/>
-              </w:sdtPr>
-              <w:sdtContent>
-                <w:r>
-                  <w:rPr>
-                    <w:sz w:val="15"/>
-                    <w:szCs w:val="15"/>
-                  </w:rPr>
-                  <w:t xml:space="preserve">Not collected</w:t>
-                </w:r>
-              </w:sdtContent>
-            </w:sdt>
-          </w:p>
-        </w:tc>
-        <w:tc>
-          <w:tcPr>
-            <w:tcW w:w="1474" w:type="dxa"/>
-          </w:tcPr>
-          <w:p>
-            <w:pPr>
-              <w:keepNext/>
-            </w:pPr>
-            <w:sdt>
-              <w:sdtPr>
-                <w:rPr>
-                  <w:sz w:val="15"/>
-                  <w:szCs w:val="15"/>
-                </w:rPr>
-                <w:alias w:val="G17.S4.tlx.sd"/>
-                <w:tag w:val="G17.S4.tlx.sd"/>
-                <w:id w:val="-615142635"/>
-                <w:text/>
-              </w:sdtPr>
-              <w:sdtContent>
-                <w:r>
-                  <w:rPr>
-                    <w:sz w:val="15"/>
-                    <w:szCs w:val="15"/>
-                  </w:rPr>
-                  <w:t xml:space="preserve">—</w:t>
-                </w:r>
-              </w:sdtContent>
-            </w:sdt>
-          </w:p>
-        </w:tc>
-        <w:tc>
-          <w:tcPr>
-            <w:tcW w:w="1474" w:type="dxa"/>
-          </w:tcPr>
-          <w:p>
-            <w:pPr>
-              <w:keepNext/>
-            </w:pPr>
-            <w:sdt>
-              <w:sdtPr>
-                <w:rPr>
-                  <w:sz w:val="15"/>
-                  <w:szCs w:val="15"/>
-                </w:rPr>
-                <w:alias w:val="G17.S4.tlx.median"/>
-                <w:tag w:val="G17.S4.tlx.median"/>
-                <w:id w:val="-1520383819"/>
-                <w:text/>
-              </w:sdtPr>
-              <w:sdtContent>
-                <w:r>
-                  <w:rPr>
-                    <w:sz w:val="15"/>
-                    <w:szCs w:val="15"/>
-                  </w:rPr>
-                  <w:t xml:space="preserve">—</w:t>
-                </w:r>
-              </w:sdtContent>
-            </w:sdt>
-          </w:p>
-        </w:tc>
-        <w:tc>
-          <w:tcPr>
-            <w:tcW w:w="2835" w:type="dxa"/>
-          </w:tcPr>
-          <w:p>
-            <w:pPr>
-              <w:keepNext/>
-            </w:pPr>
-            <w:sdt>
-              <w:sdtPr>
-                <w:rPr>
-                  <w:sz w:val="15"/>
-                  <w:szCs w:val="15"/>
-                </w:rPr>
-                <w:alias w:val="G17.S4.tlx.condition"/>
-                <w:tag w:val="G17.S4.tlx.condition"/>
-                <w:id w:val="1066076880"/>
-                <w:text/>
-              </w:sdtPr>
-              <w:sdtContent>
-                <w:r>
-                  <w:rPr>
-                    <w:sz w:val="15"/>
-                    <w:szCs w:val="15"/>
-                  </w:rPr>
-                  <w:t xml:space="preserve">Not collected; the challenge-latency profile (next row) is reported instead, as the Instruments row allows.</w:t>
+                  <w:t>VR_Interactive (1 Meta Quest headset shared across all 11 participants). High perceived usability; no interaction blocks or game-breaking glitches reported</w:t>
                 </w:r>
               </w:sdtContent>
             </w:sdt>
@@ -5531,7 +5278,7 @@
                     <w:sz w:val="15"/>
                     <w:szCs w:val="15"/>
                   </w:rPr>
-                  <w:t xml:space="preserve">11 participants (58 decisions; 36 attack situations reached)</w:t>
+                  <w:t>11 participants (58 decisions; 36 attack situations reached)</w:t>
                 </w:r>
               </w:sdtContent>
             </w:sdt>
@@ -5559,7 +5306,7 @@
                     <w:sz w:val="15"/>
                     <w:szCs w:val="15"/>
                   </w:rPr>
-                  <w:t xml:space="preserve">Breach rate 34.1 %; credential disclosure 54.5 % (6 of 11); challenge latency 96.7 s (per-session mean)</w:t>
+                  <w:t>Breach rate 34.1 %; credential disclosure 54.5 % (6 of 11); challenge latency 96.7 s (per-session mean)</w:t>
                 </w:r>
               </w:sdtContent>
             </w:sdt>
@@ -5587,7 +5334,7 @@
                     <w:sz w:val="15"/>
                     <w:szCs w:val="15"/>
                   </w:rPr>
-                  <w:t xml:space="preserve">Breach rate 21.9 %; challenge latency 8.7 s (sample SD across the 11 sessions)</w:t>
+                  <w:t>Breach rate 21.9 %; challenge latency 8.7 s (sample SD across the 11 sessions)</w:t>
                 </w:r>
               </w:sdtContent>
             </w:sdt>
@@ -5615,7 +5362,7 @@
                     <w:sz w:val="15"/>
                     <w:szCs w:val="15"/>
                   </w:rPr>
-                  <w:t xml:space="preserve">Breach rate 33.3 %; challenge latency 99.8 s</w:t>
+                  <w:t>Breach rate 33.3 %; challenge latency 99.8 s</w:t>
                 </w:r>
               </w:sdtContent>
             </w:sdt>
@@ -5643,7 +5390,7 @@
                     <w:sz w:val="15"/>
                     <w:szCs w:val="15"/>
                   </w:rPr>
-                  <w:t xml:space="preserve">One condition (VR_Interactive): 9 headset, 2 desktop. Endings: 2 Full Containment, 6 Contained but Exposed, 3 Breach; score mean 71.6/100. Decisions: TP 35, TN 7, FN 12, FP 4. Unauthorised entry 3 of 11.</w:t>
+                  <w:t>VR_Interactive (100% Meta Quest headset). Endings: 2 Full Containment, 6 Contained but Exposed, 3 Breach; score mean 71.6/100. Decisions: TP 35, TN 7, FN 12, FP 4. Unauthorised entry 3 of 11.</w:t>
                 </w:r>
               </w:sdtContent>
             </w:sdt>
@@ -5671,7 +5418,7 @@
       <w:tr>
         <w:trPr>
           <w:cantSplit/>
-          <w:trHeight w:hRule="atLeast" w:val="2835"/>
+          <w:trHeight w:val="2835"/>
           <w:jc w:val="center"/>
         </w:trPr>
         <w:tc>
@@ -5684,22 +5431,26 @@
               <w:jc w:val="center"/>
             </w:pPr>
             <w:r>
+              <w:rPr>
+                <w:noProof/>
+              </w:rPr>
               <w:drawing>
-                <wp:inline xmlns:a="http://schemas.openxmlformats.org/drawingml/2006/main" xmlns:pic="http://schemas.openxmlformats.org/drawingml/2006/picture">
-                  <wp:extent cx="3096000" cy="1786154"/>
-                  <wp:docPr id="1" name="Picture 1"/>
+                <wp:inline distT="0" distB="0" distL="0" distR="0" wp14:anchorId="008C55A2" wp14:editId="24C06952">
+                  <wp:extent cx="2205038" cy="2113424"/>
+                  <wp:effectExtent l="0" t="0" r="5080" b="1270"/>
+                  <wp:docPr id="1655828515" name="Picture 1"/>
                   <wp:cNvGraphicFramePr>
-                    <a:graphicFrameLocks noChangeAspect="1"/>
+                    <a:graphicFrameLocks xmlns:a="http://schemas.openxmlformats.org/drawingml/2006/main" noChangeAspect="1"/>
                   </wp:cNvGraphicFramePr>
-                  <a:graphic>
+                  <a:graphic xmlns:a="http://schemas.openxmlformats.org/drawingml/2006/main">
                     <a:graphicData uri="http://schemas.openxmlformats.org/drawingml/2006/picture">
-                      <pic:pic>
+                      <pic:pic xmlns:pic="http://schemas.openxmlformats.org/drawingml/2006/picture">
                         <pic:nvPicPr>
-                          <pic:cNvPr id="0" name="fig1_breach_rate.png"/>
+                          <pic:cNvPr id="1655828515" name=""/>
                           <pic:cNvPicPr/>
                         </pic:nvPicPr>
                         <pic:blipFill>
-                          <a:blip r:embed="rId11"/>
+                          <a:blip r:embed="rId8"/>
                           <a:stretch>
                             <a:fillRect/>
                           </a:stretch>
@@ -5707,9 +5458,11 @@
                         <pic:spPr>
                           <a:xfrm>
                             <a:off x="0" y="0"/>
-                            <a:ext cx="3096000" cy="1786154"/>
+                            <a:ext cx="2207279" cy="2115572"/>
                           </a:xfrm>
-                          <a:prstGeom prst="rect"/>
+                          <a:prstGeom prst="rect">
+                            <a:avLst/>
+                          </a:prstGeom>
                         </pic:spPr>
                       </pic:pic>
                     </a:graphicData>
@@ -5729,22 +5482,26 @@
               <w:jc w:val="center"/>
             </w:pPr>
             <w:r>
+              <w:rPr>
+                <w:noProof/>
+              </w:rPr>
               <w:drawing>
-                <wp:inline xmlns:a="http://schemas.openxmlformats.org/drawingml/2006/main" xmlns:pic="http://schemas.openxmlformats.org/drawingml/2006/picture">
-                  <wp:extent cx="3096000" cy="1786154"/>
-                  <wp:docPr id="2" name="Picture 2"/>
+                <wp:inline distT="0" distB="0" distL="0" distR="0" wp14:anchorId="39A11D98" wp14:editId="6597B1F7">
+                  <wp:extent cx="2476500" cy="2067467"/>
+                  <wp:effectExtent l="0" t="0" r="0" b="9525"/>
+                  <wp:docPr id="618524454" name="Picture 1"/>
                   <wp:cNvGraphicFramePr>
-                    <a:graphicFrameLocks noChangeAspect="1"/>
+                    <a:graphicFrameLocks xmlns:a="http://schemas.openxmlformats.org/drawingml/2006/main" noChangeAspect="1"/>
                   </wp:cNvGraphicFramePr>
-                  <a:graphic>
+                  <a:graphic xmlns:a="http://schemas.openxmlformats.org/drawingml/2006/main">
                     <a:graphicData uri="http://schemas.openxmlformats.org/drawingml/2006/picture">
-                      <pic:pic>
+                      <pic:pic xmlns:pic="http://schemas.openxmlformats.org/drawingml/2006/picture">
                         <pic:nvPicPr>
-                          <pic:cNvPr id="0" name="fig2_latency_by_situation.png"/>
+                          <pic:cNvPr id="618524454" name=""/>
                           <pic:cNvPicPr/>
                         </pic:nvPicPr>
                         <pic:blipFill>
-                          <a:blip r:embed="rId12"/>
+                          <a:blip r:embed="rId9"/>
                           <a:stretch>
                             <a:fillRect/>
                           </a:stretch>
@@ -5752,9 +5509,11 @@
                         <pic:spPr>
                           <a:xfrm>
                             <a:off x="0" y="0"/>
-                            <a:ext cx="3096000" cy="1786154"/>
+                            <a:ext cx="2478793" cy="2069382"/>
                           </a:xfrm>
-                          <a:prstGeom prst="rect"/>
+                          <a:prstGeom prst="rect">
+                            <a:avLst/>
+                          </a:prstGeom>
                         </pic:spPr>
                       </pic:pic>
                     </a:graphicData>
@@ -5766,144 +5525,6 @@
         </w:tc>
       </w:tr>
     </w:tbl>
-    <w:p>
-      <w:pPr>
-        <w:spacing w:after="40"/>
-        <w:jc w:val="center"/>
-      </w:pPr>
-      <w:r>
-        <w:rPr>
-          <w:i/>
-          <w:color w:val="333333"/>
-          <w:sz w:val="14"/>
-        </w:rPr>
-        <w:t>Fig. 1: breach rate B per participant (CD = credential disclosed).   Fig. 2: challenge latency L for each of the 58 decisions, by situation.</w:t>
-      </w:r>
-    </w:p>
-    <w:tbl>
-      <w:tblPr>
-        <w:tblStyle w:val="TableGrid"/>
-        <w:tblW w:w="0" w:type="auto"/>
-        <w:jc w:val="center"/>
-        <w:tblLayout w:type="fixed"/>
-        <w:tblLook w:val="04A0" w:firstRow="1" w:lastRow="0" w:firstColumn="1" w:lastColumn="0" w:noHBand="0" w:noVBand="1"/>
-      </w:tblPr>
-      <w:tblGrid>
-        <w:gridCol w:w="5102"/>
-        <w:gridCol w:w="5102"/>
-      </w:tblGrid>
-      <w:tr>
-        <w:trPr>
-          <w:cantSplit/>
-          <w:trHeight w:hRule="atLeast" w:val="2835"/>
-          <w:jc w:val="center"/>
-        </w:trPr>
-        <w:tc>
-          <w:tcPr>
-            <w:tcW w:w="5102" w:type="dxa"/>
-            <w:shd w:val="clear" w:color="auto" w:fill="F2F2F2"/>
-          </w:tcPr>
-          <w:p>
-            <w:pPr>
-              <w:jc w:val="center"/>
-            </w:pPr>
-            <w:r>
-              <w:drawing>
-                <wp:inline xmlns:a="http://schemas.openxmlformats.org/drawingml/2006/main" xmlns:pic="http://schemas.openxmlformats.org/drawingml/2006/picture">
-                  <wp:extent cx="3096000" cy="1786154"/>
-                  <wp:docPr id="3" name="Picture 3"/>
-                  <wp:cNvGraphicFramePr>
-                    <a:graphicFrameLocks noChangeAspect="1"/>
-                  </wp:cNvGraphicFramePr>
-                  <a:graphic>
-                    <a:graphicData uri="http://schemas.openxmlformats.org/drawingml/2006/picture">
-                      <pic:pic>
-                        <pic:nvPicPr>
-                          <pic:cNvPr id="0" name="fig3_outcome_by_situation.png"/>
-                          <pic:cNvPicPr/>
-                        </pic:nvPicPr>
-                        <pic:blipFill>
-                          <a:blip r:embed="rId13"/>
-                          <a:stretch>
-                            <a:fillRect/>
-                          </a:stretch>
-                        </pic:blipFill>
-                        <pic:spPr>
-                          <a:xfrm>
-                            <a:off x="0" y="0"/>
-                            <a:ext cx="3096000" cy="1786154"/>
-                          </a:xfrm>
-                          <a:prstGeom prst="rect"/>
-                        </pic:spPr>
-                      </pic:pic>
-                    </a:graphicData>
-                  </a:graphic>
-                </wp:inline>
-              </w:drawing>
-            </w:r>
-          </w:p>
-        </w:tc>
-        <w:tc>
-          <w:tcPr>
-            <w:tcW w:w="5102" w:type="dxa"/>
-            <w:shd w:val="clear" w:color="auto" w:fill="F2F2F2"/>
-          </w:tcPr>
-          <w:p>
-            <w:pPr>
-              <w:jc w:val="center"/>
-            </w:pPr>
-            <w:r>
-              <w:drawing>
-                <wp:inline xmlns:a="http://schemas.openxmlformats.org/drawingml/2006/main" xmlns:pic="http://schemas.openxmlformats.org/drawingml/2006/picture">
-                  <wp:extent cx="3096000" cy="1786154"/>
-                  <wp:docPr id="4" name="Picture 4"/>
-                  <wp:cNvGraphicFramePr>
-                    <a:graphicFrameLocks noChangeAspect="1"/>
-                  </wp:cNvGraphicFramePr>
-                  <a:graphic>
-                    <a:graphicData uri="http://schemas.openxmlformats.org/drawingml/2006/picture">
-                      <pic:pic>
-                        <pic:nvPicPr>
-                          <pic:cNvPr id="0" name="fig4_endings.png"/>
-                          <pic:cNvPicPr/>
-                        </pic:nvPicPr>
-                        <pic:blipFill>
-                          <a:blip r:embed="rId14"/>
-                          <a:stretch>
-                            <a:fillRect/>
-                          </a:stretch>
-                        </pic:blipFill>
-                        <pic:spPr>
-                          <a:xfrm>
-                            <a:off x="0" y="0"/>
-                            <a:ext cx="3096000" cy="1786154"/>
-                          </a:xfrm>
-                          <a:prstGeom prst="rect"/>
-                        </pic:spPr>
-                      </pic:pic>
-                    </a:graphicData>
-                  </a:graphic>
-                </wp:inline>
-              </w:drawing>
-            </w:r>
-          </w:p>
-        </w:tc>
-      </w:tr>
-    </w:tbl>
-    <w:p>
-      <w:pPr>
-        <w:spacing w:after="40"/>
-        <w:jc w:val="center"/>
-      </w:pPr>
-      <w:r>
-        <w:rPr>
-          <w:i/>
-          <w:color w:val="333333"/>
-          <w:sz w:val="14"/>
-        </w:rPr>
-        <w:t>Fig. 3: safe / compromised / over-cautious decisions per situation.   Fig. 4: session endings. All four regenerate from the raw CSVs (analyse_p01_p11.py). No SUS plot: SUS was not collected.</w:t>
-      </w:r>
-    </w:p>
     <w:p>
       <w:pPr>
         <w:spacing w:after="40"/>
@@ -5986,7 +5607,7 @@
                     <w:sz w:val="15"/>
                     <w:szCs w:val="15"/>
                   </w:rPr>
-                  <w:t xml:space="preserve">Yes</w:t>
+                  <w:t>Yes</w:t>
                 </w:r>
               </w:sdtContent>
             </w:sdt>
@@ -6045,7 +5666,7 @@
                     <w:sz w:val="15"/>
                     <w:szCs w:val="15"/>
                   </w:rPr>
-                  <w:t xml:space="preserve">Yes</w:t>
+                  <w:t>Yes</w:t>
                 </w:r>
               </w:sdtContent>
             </w:sdt>
@@ -6104,7 +5725,7 @@
                     <w:sz w:val="15"/>
                     <w:szCs w:val="15"/>
                   </w:rPr>
-                  <w:t xml:space="preserve">Yes</w:t>
+                  <w:t>Yes</w:t>
                 </w:r>
               </w:sdtContent>
             </w:sdt>
@@ -6157,7 +5778,7 @@
                     <w:sz w:val="15"/>
                     <w:szCs w:val="15"/>
                   </w:rPr>
-                  <w:t xml:space="preserve">No</w:t>
+                  <w:t>Yes</w:t>
                 </w:r>
               </w:sdtContent>
             </w:sdt>
@@ -6383,7 +6004,6 @@
         <w:rPr>
           <w:b/>
         </w:rPr>
-        <w:lastRenderedPageBreak/>
         <w:t>5.1 AI Interaction Audit Log: three cases where AI was wrong, made something up, or was unverifiable</w:t>
       </w:r>
     </w:p>
@@ -6637,7 +6257,7 @@
                     <w:sz w:val="14"/>
                     <w:szCs w:val="14"/>
                   </w:rPr>
-                  <w:t xml:space="preserve">Asked to draft our research title and case context; it named 'NEXORA Corporation' as the target organisation as if it were a real company.</w:t>
+                  <w:t>Asked to draft our research title and case context; it named 'NEXORA Corporation' as the target organisation as if it were a real company.</w:t>
                 </w:r>
               </w:sdtContent>
             </w:sdt>
@@ -6706,7 +6326,7 @@
                     <w:sz w:val="14"/>
                     <w:szCs w:val="14"/>
                   </w:rPr>
-                  <w:t xml:space="preserve">No such company exists (faculty pre-audit, Section 1). Title replaced by the authorised one. NEXORA stays only as the fictional employer inside the game and is never cited as a real organisation.</w:t>
+                  <w:t>No such company exists (faculty pre-audit, Section 1). Title replaced by the authorised one. NEXORA stays only as the fictional employer inside the game and is never cited as a real organisation.</w:t>
                 </w:r>
               </w:sdtContent>
             </w:sdt>
@@ -6844,7 +6464,7 @@
                     <w:sz w:val="14"/>
                     <w:szCs w:val="14"/>
                   </w:rPr>
-                  <w:t xml:space="preserve">Claude</w:t>
+                  <w:t>Claude</w:t>
                 </w:r>
               </w:sdtContent>
             </w:sdt>
@@ -6875,7 +6495,7 @@
                     <w:sz w:val="14"/>
                     <w:szCs w:val="14"/>
                   </w:rPr>
-                  <w:t xml:space="preserve">The title-sheet draft claimed 'over 70% of physical penetration testers gain entry by tailgating'.</w:t>
+                  <w:t>The title-sheet draft claimed 'over 70% of physical penetration testers gain entry by tailgating'.</w:t>
                 </w:r>
               </w:sdtContent>
             </w:sdt>
@@ -6944,7 +6564,7 @@
                     <w:sz w:val="14"/>
                     <w:szCs w:val="14"/>
                   </w:rPr>
-                  <w:t xml:space="preserve">No penetration-test study found. The figure matches a 2014 Boon Edam vendor survey where about 71% of respondents believed they were vulnerable to tailgating (SecurityInfoWatch). Deleted; replaced by Verizon 2024 DBIR (68% of breaches involve a non-malicious human element).</w:t>
+                  <w:t>No penetration-test study found. The figure matches a 2014 Boon Edam vendor survey where about 71% of respondents believed they were vulnerable to tailgating (SecurityInfoWatch). Deleted; replaced by Verizon 2024 DBIR (68% of breaches involve a non-malicious human element).</w:t>
                 </w:r>
               </w:sdtContent>
             </w:sdt>
@@ -7104,7 +6724,7 @@
                     <w:sz w:val="14"/>
                     <w:szCs w:val="14"/>
                   </w:rPr>
-                  <w:t xml:space="preserve">The draft cited 'ISO/IEC 27001 Control A.11 (Physical and Environmental Security)' as the current control.</w:t>
+                  <w:t>The draft cited 'ISO/IEC 27001 Control A.11 (Physical and Environmental Security)' as the current control.</w:t>
                 </w:r>
               </w:sdtContent>
             </w:sdt>
@@ -7167,7 +6787,7 @@
                     <w:sz w:val="14"/>
                     <w:szCs w:val="14"/>
                   </w:rPr>
-                  <w:t xml:space="preserve">A.11 is the 2013 numbering. ISO/IEC 27001:2022 moved physical security to Annex A clause 7 (7.1-7.14); the mapping is in ISO/IEC 27002:2022 Annex B.</w:t>
+                  <w:t>A.11 is the 2013 numbering. ISO/IEC 27001:2022 moved physical security to Annex A clause 7 (7.1-7.14); the mapping is in ISO/IEC 27002:2022 Annex B.</w:t>
                 </w:r>
               </w:sdtContent>
             </w:sdt>
@@ -7258,6 +6878,7 @@
         <w:rPr>
           <w:b/>
         </w:rPr>
+        <w:lastRenderedPageBreak/>
         <w:t>5.2 Peer review: watch both assigned LinkedIn videos and score them (0–2 per criterion)</w:t>
       </w:r>
     </w:p>
@@ -8193,7 +7814,7 @@
                     <w:sz w:val="14"/>
                     <w:szCs w:val="14"/>
                   </w:rPr>
-                  <w:t>type here</w:t>
+                  <w:t>65</w:t>
                 </w:r>
               </w:sdtContent>
             </w:sdt>
@@ -8231,7 +7852,7 @@
                     <w:sz w:val="14"/>
                     <w:szCs w:val="14"/>
                   </w:rPr>
-                  <w:t>Select ▾</w:t>
+                  <w:t>5</w:t>
                 </w:r>
               </w:sdtContent>
             </w:sdt>
@@ -8267,7 +7888,7 @@
                     <w:sz w:val="14"/>
                     <w:szCs w:val="14"/>
                   </w:rPr>
-                  <w:t>Select ▾</w:t>
+                  <w:t>Git only</w:t>
                 </w:r>
               </w:sdtContent>
             </w:sdt>
@@ -8302,7 +7923,7 @@
                     <w:sz w:val="14"/>
                     <w:szCs w:val="14"/>
                   </w:rPr>
-                  <w:t xml:space="preserve">Yes</w:t>
+                  <w:t>Yes</w:t>
                 </w:r>
               </w:sdtContent>
             </w:sdt>
@@ -8337,7 +7958,7 @@
                     <w:sz w:val="14"/>
                     <w:szCs w:val="14"/>
                   </w:rPr>
-                  <w:t xml:space="preserve">Yes</w:t>
+                  <w:t>Yes</w:t>
                 </w:r>
               </w:sdtContent>
             </w:sdt>
@@ -8374,7 +7995,7 @@
                     <w:sz w:val="14"/>
                     <w:szCs w:val="14"/>
                   </w:rPr>
-                  <w:t>Select ▾</w:t>
+                  <w:t>0–25 %</w:t>
                 </w:r>
               </w:sdtContent>
             </w:sdt>
@@ -8411,7 +8032,7 @@
                     <w:sz w:val="14"/>
                     <w:szCs w:val="14"/>
                   </w:rPr>
-                  <w:t>Select ▾</w:t>
+                  <w:t>1–2</w:t>
                 </w:r>
               </w:sdtContent>
             </w:sdt>
@@ -8465,7 +8086,7 @@
                     <w:sz w:val="14"/>
                     <w:szCs w:val="14"/>
                   </w:rPr>
-                  <w:t>type here</w:t>
+                  <w:t>63</w:t>
                 </w:r>
               </w:sdtContent>
             </w:sdt>
@@ -8503,7 +8124,7 @@
                     <w:sz w:val="14"/>
                     <w:szCs w:val="14"/>
                   </w:rPr>
-                  <w:t>Select ▾</w:t>
+                  <w:t>5</w:t>
                 </w:r>
               </w:sdtContent>
             </w:sdt>
@@ -8539,7 +8160,7 @@
                     <w:sz w:val="14"/>
                     <w:szCs w:val="14"/>
                   </w:rPr>
-                  <w:t>Select ▾</w:t>
+                  <w:t>Git only</w:t>
                 </w:r>
               </w:sdtContent>
             </w:sdt>
@@ -8574,7 +8195,7 @@
                     <w:sz w:val="14"/>
                     <w:szCs w:val="14"/>
                   </w:rPr>
-                  <w:t xml:space="preserve">Yes</w:t>
+                  <w:t>Yes</w:t>
                 </w:r>
               </w:sdtContent>
             </w:sdt>
@@ -8609,7 +8230,7 @@
                     <w:sz w:val="14"/>
                     <w:szCs w:val="14"/>
                   </w:rPr>
-                  <w:t xml:space="preserve">Yes</w:t>
+                  <w:t>Yes</w:t>
                 </w:r>
               </w:sdtContent>
             </w:sdt>
@@ -8646,7 +8267,7 @@
                     <w:sz w:val="14"/>
                     <w:szCs w:val="14"/>
                   </w:rPr>
-                  <w:t>Select ▾</w:t>
+                  <w:t>0–25 %</w:t>
                 </w:r>
               </w:sdtContent>
             </w:sdt>
@@ -8683,7 +8304,7 @@
                     <w:sz w:val="14"/>
                     <w:szCs w:val="14"/>
                   </w:rPr>
-                  <w:t>Select ▾</w:t>
+                  <w:t>1–2</w:t>
                 </w:r>
               </w:sdtContent>
             </w:sdt>
@@ -8737,7 +8358,7 @@
                     <w:sz w:val="14"/>
                     <w:szCs w:val="14"/>
                   </w:rPr>
-                  <w:t>type here</w:t>
+                  <w:t>32</w:t>
                 </w:r>
               </w:sdtContent>
             </w:sdt>
@@ -8775,7 +8396,7 @@
                     <w:sz w:val="14"/>
                     <w:szCs w:val="14"/>
                   </w:rPr>
-                  <w:t>Select ▾</w:t>
+                  <w:t>5</w:t>
                 </w:r>
               </w:sdtContent>
             </w:sdt>
@@ -8811,7 +8432,7 @@
                     <w:sz w:val="14"/>
                     <w:szCs w:val="14"/>
                   </w:rPr>
-                  <w:t>Select ▾</w:t>
+                  <w:t>Git only</w:t>
                 </w:r>
               </w:sdtContent>
             </w:sdt>
@@ -8846,7 +8467,7 @@
                     <w:sz w:val="14"/>
                     <w:szCs w:val="14"/>
                   </w:rPr>
-                  <w:t xml:space="preserve">Yes</w:t>
+                  <w:t>No</w:t>
                 </w:r>
               </w:sdtContent>
             </w:sdt>
@@ -8881,7 +8502,7 @@
                     <w:sz w:val="14"/>
                     <w:szCs w:val="14"/>
                   </w:rPr>
-                  <w:t xml:space="preserve">Yes</w:t>
+                  <w:t>Yes</w:t>
                 </w:r>
               </w:sdtContent>
             </w:sdt>
@@ -8918,7 +8539,7 @@
                     <w:sz w:val="14"/>
                     <w:szCs w:val="14"/>
                   </w:rPr>
-                  <w:t>Select ▾</w:t>
+                  <w:t>26–50 %</w:t>
                 </w:r>
               </w:sdtContent>
             </w:sdt>
@@ -8955,7 +8576,7 @@
                     <w:sz w:val="14"/>
                     <w:szCs w:val="14"/>
                   </w:rPr>
-                  <w:t>Select ▾</w:t>
+                  <w:t>1–2</w:t>
                 </w:r>
               </w:sdtContent>
             </w:sdt>
@@ -9003,7 +8624,7 @@
                     <w:sz w:val="14"/>
                     <w:szCs w:val="14"/>
                   </w:rPr>
-                  <w:t>type here</w:t>
+                  <w:t>52</w:t>
                 </w:r>
               </w:sdtContent>
             </w:sdt>
@@ -9038,7 +8659,7 @@
                     <w:sz w:val="14"/>
                     <w:szCs w:val="14"/>
                   </w:rPr>
-                  <w:t>Select ▾</w:t>
+                  <w:t>5</w:t>
                 </w:r>
               </w:sdtContent>
             </w:sdt>
@@ -9071,7 +8692,7 @@
                     <w:sz w:val="14"/>
                     <w:szCs w:val="14"/>
                   </w:rPr>
-                  <w:t>Select ▾</w:t>
+                  <w:t>Neither Git nor LFS</w:t>
                 </w:r>
               </w:sdtContent>
             </w:sdt>
@@ -9103,7 +8724,7 @@
                     <w:sz w:val="14"/>
                     <w:szCs w:val="14"/>
                   </w:rPr>
-                  <w:t xml:space="preserve">Yes</w:t>
+                  <w:t>Yes</w:t>
                 </w:r>
               </w:sdtContent>
             </w:sdt>
@@ -9135,7 +8756,7 @@
                     <w:sz w:val="14"/>
                     <w:szCs w:val="14"/>
                   </w:rPr>
-                  <w:t xml:space="preserve">Yes</w:t>
+                  <w:t>Yes</w:t>
                 </w:r>
               </w:sdtContent>
             </w:sdt>
@@ -9169,7 +8790,7 @@
                     <w:sz w:val="14"/>
                     <w:szCs w:val="14"/>
                   </w:rPr>
-                  <w:t>Select ▾</w:t>
+                  <w:t>0–25 %</w:t>
                 </w:r>
               </w:sdtContent>
             </w:sdt>
@@ -9203,7 +8824,7 @@
                     <w:sz w:val="14"/>
                     <w:szCs w:val="14"/>
                   </w:rPr>
-                  <w:t>Select ▾</w:t>
+                  <w:t>1–2</w:t>
                 </w:r>
               </w:sdtContent>
             </w:sdt>
@@ -9336,7 +8957,14 @@
                     <w:sz w:val="14"/>
                     <w:szCs w:val="14"/>
                   </w:rPr>
-                  <w:t>type here</w:t>
+                  <w:t>A</w:t>
+                </w:r>
+                <w:r>
+                  <w:rPr>
+                    <w:sz w:val="14"/>
+                    <w:szCs w:val="14"/>
+                  </w:rPr>
+                  <w:t>rchitecting an asynchronous, event-driven runtime telemetry logger in C# (PhysicalSecurityTelemetryLogger.cs) to record timestamped participant  decisions, gaze dwells, and breach metrics without dropping Quest standalone VR framerates.</w:t>
                 </w:r>
               </w:sdtContent>
             </w:sdt>
@@ -9367,7 +8995,14 @@
                     <w:sz w:val="14"/>
                     <w:szCs w:val="14"/>
                   </w:rPr>
-                  <w:t>type here</w:t>
+                  <w:t>P</w:t>
+                </w:r>
+                <w:r>
+                  <w:rPr>
+                    <w:sz w:val="14"/>
+                    <w:szCs w:val="14"/>
+                  </w:rPr>
+                  <w:t>rovide a minimal pre-configured Meta XR Interaction SDK rig and building block template at the beginning of the semester to accelerate  early prototyping.</w:t>
                 </w:r>
               </w:sdtContent>
             </w:sdt>
@@ -9421,7 +9056,7 @@
                     <w:sz w:val="14"/>
                     <w:szCs w:val="14"/>
                   </w:rPr>
-                  <w:t>type here</w:t>
+                  <w:t>Designing decoupled, state-driven situation triggers (SituationTrigger.cs) and dynamic cooldown directors in Unity 6 LTS that support non-linear  player exploration rather than rigid sequential scripts</w:t>
                 </w:r>
               </w:sdtContent>
             </w:sdt>
@@ -9452,7 +9087,38 @@
                     <w:sz w:val="14"/>
                     <w:szCs w:val="14"/>
                   </w:rPr>
-                  <w:t>type here</w:t>
+                  <w:t>A</w:t>
+                </w:r>
+                <w:r>
+                  <w:rPr>
+                    <w:sz w:val="14"/>
+                    <w:szCs w:val="14"/>
+                  </w:rPr>
+                  <w:t>lign the Technical Dossier requirements with realistic project outcomes by allowing teams the pedagogical flexibility to define simulation-</w:t>
+                </w:r>
+                <w:r>
+                  <w:rPr>
+                    <w:rFonts w:hint="eastAsia"/>
+                    <w:sz w:val="14"/>
+                    <w:szCs w:val="14"/>
+                  </w:rPr>
+                  <w:t xml:space="preserve">  </w:t>
+                </w:r>
+                <w:r>
+                  <w:rPr>
+                    <w:rFonts w:hint="eastAsia"/>
+                    <w:sz w:val="14"/>
+                    <w:szCs w:val="14"/>
+                  </w:rPr>
+                  <w:t>│</w:t>
+                </w:r>
+                <w:r>
+                  <w:rPr>
+                    <w:rFonts w:hint="eastAsia"/>
+                    <w:sz w:val="14"/>
+                    <w:szCs w:val="14"/>
+                  </w:rPr>
+                  <w:t xml:space="preserve"> specific evaluation metrics, rather than mandating prescriptive scaffold tables that encourage artificial data fitting.</w:t>
                 </w:r>
               </w:sdtContent>
             </w:sdt>
@@ -9506,7 +9172,7 @@
                     <w:sz w:val="14"/>
                     <w:szCs w:val="14"/>
                   </w:rPr>
-                  <w:t>type here</w:t>
+                  <w:t>How to design clean telemetry logging that tracks exactly what a player clicked, saw, and how long they hesitated, and then write scripts to parse  those CSVs to see where users actually failed security checks.</w:t>
                 </w:r>
               </w:sdtContent>
             </w:sdt>
@@ -9537,7 +9203,22 @@
                     <w:sz w:val="14"/>
                     <w:szCs w:val="14"/>
                   </w:rPr>
-                  <w:t>type here</w:t>
+                  <w:t xml:space="preserve">Give earlier guidance on setting up 3D spatial audio and room acoustics in Unity, because getting things like the door intercom buzzer and    </w:t>
+                </w:r>
+                <w:r>
+                  <w:rPr>
+                    <w:rFonts w:cs="Calibri"/>
+                    <w:sz w:val="14"/>
+                    <w:szCs w:val="14"/>
+                  </w:rPr>
+                  <w:t>￹</w:t>
+                </w:r>
+                <w:r>
+                  <w:rPr>
+                    <w:sz w:val="14"/>
+                    <w:szCs w:val="14"/>
+                  </w:rPr>
+                  <w:t>phone ringing to sound naturally distant across multiple office rooms took way too much trial and error.</w:t>
                 </w:r>
               </w:sdtContent>
             </w:sdt>
@@ -9585,7 +9266,22 @@
                     <w:sz w:val="14"/>
                     <w:szCs w:val="14"/>
                   </w:rPr>
-                  <w:t>type here</w:t>
+                  <w:t xml:space="preserve">The most valuable thing I learned: How to script branching dialogue choices and state logic in Unity for social engineering encounters, ensuring player inputs reliably trigger the    </w:t>
+                </w:r>
+                <w:r>
+                  <w:rPr>
+                    <w:rFonts w:cs="Calibri"/>
+                    <w:sz w:val="14"/>
+                    <w:szCs w:val="14"/>
+                  </w:rPr>
+                  <w:t>￹</w:t>
+                </w:r>
+                <w:r>
+                  <w:rPr>
+                    <w:sz w:val="14"/>
+                    <w:szCs w:val="14"/>
+                  </w:rPr>
+                  <w:t>right reactions and endings without bugs.</w:t>
                 </w:r>
               </w:sdtContent>
             </w:sdt>
@@ -9613,7 +9309,22 @@
                     <w:sz w:val="14"/>
                     <w:szCs w:val="14"/>
                   </w:rPr>
-                  <w:t>type here</w:t>
+                  <w:t xml:space="preserve">One thing I would change in this course: Include a dedicated session on building responsive World-Space UI and poke interactions in Unity VR; making physical 3D touch buttons and    </w:t>
+                </w:r>
+                <w:r>
+                  <w:rPr>
+                    <w:rFonts w:cs="Calibri"/>
+                    <w:sz w:val="14"/>
+                    <w:szCs w:val="14"/>
+                  </w:rPr>
+                  <w:t>￹</w:t>
+                </w:r>
+                <w:r>
+                  <w:rPr>
+                    <w:sz w:val="14"/>
+                    <w:szCs w:val="14"/>
+                  </w:rPr>
+                  <w:t>monitor screens feel responsive and easy to read in the headset was much trickier than expected.</w:t>
                 </w:r>
               </w:sdtContent>
             </w:sdt>
@@ -9903,7 +9614,6 @@
           <w:b/>
           <w:sz w:val="22"/>
         </w:rPr>
-        <w:lastRenderedPageBreak/>
         <w:t>Academic Sign-off</w:t>
       </w:r>
       <w:r>
@@ -10109,7 +9819,7 @@
                     <w:sz w:val="15"/>
                     <w:szCs w:val="15"/>
                   </w:rPr>
-                  <w:t>Select ▾</w:t>
+                  <w:t>Yes</w:t>
                 </w:r>
               </w:sdtContent>
             </w:sdt>
@@ -10144,7 +9854,7 @@
                     <w:sz w:val="15"/>
                     <w:szCs w:val="15"/>
                   </w:rPr>
-                  <w:t>Select ▾</w:t>
+                  <w:t>Yes</w:t>
                 </w:r>
               </w:sdtContent>
             </w:sdt>
@@ -10179,7 +9889,7 @@
                     <w:sz w:val="15"/>
                     <w:szCs w:val="15"/>
                   </w:rPr>
-                  <w:t>Select ▾</w:t>
+                  <w:t>Yes</w:t>
                 </w:r>
               </w:sdtContent>
             </w:sdt>
@@ -10193,6 +9903,9 @@
             <w:pPr>
               <w:keepNext/>
             </w:pPr>
+            <w:r>
+              <w:t>Samarth Pande</w:t>
+            </w:r>
           </w:p>
         </w:tc>
         <w:tc>
@@ -10224,7 +9937,7 @@
                     <w:sz w:val="15"/>
                     <w:szCs w:val="15"/>
                   </w:rPr>
-                  <w:t>Select ▾</w:t>
+                  <w:t>No</w:t>
                 </w:r>
               </w:sdtContent>
             </w:sdt>
@@ -10282,7 +9995,7 @@
                     <w:sz w:val="15"/>
                     <w:szCs w:val="15"/>
                   </w:rPr>
-                  <w:t>Select ▾</w:t>
+                  <w:t>Yes</w:t>
                 </w:r>
               </w:sdtContent>
             </w:sdt>
@@ -10317,7 +10030,7 @@
                     <w:sz w:val="15"/>
                     <w:szCs w:val="15"/>
                   </w:rPr>
-                  <w:t>Select ▾</w:t>
+                  <w:t>Yes</w:t>
                 </w:r>
               </w:sdtContent>
             </w:sdt>
@@ -10352,7 +10065,7 @@
                     <w:sz w:val="15"/>
                     <w:szCs w:val="15"/>
                   </w:rPr>
-                  <w:t>Select ▾</w:t>
+                  <w:t>Yes</w:t>
                 </w:r>
               </w:sdtContent>
             </w:sdt>
@@ -10366,6 +10079,9 @@
             <w:pPr>
               <w:keepNext/>
             </w:pPr>
+            <w:r>
+              <w:t>Ishan Choudhary</w:t>
+            </w:r>
           </w:p>
         </w:tc>
         <w:tc>
@@ -10397,7 +10113,7 @@
                     <w:sz w:val="15"/>
                     <w:szCs w:val="15"/>
                   </w:rPr>
-                  <w:t>Select ▾</w:t>
+                  <w:t>No</w:t>
                 </w:r>
               </w:sdtContent>
             </w:sdt>
@@ -10455,7 +10171,7 @@
                     <w:sz w:val="15"/>
                     <w:szCs w:val="15"/>
                   </w:rPr>
-                  <w:t>Select ▾</w:t>
+                  <w:t>Yes</w:t>
                 </w:r>
               </w:sdtContent>
             </w:sdt>
@@ -10490,7 +10206,7 @@
                     <w:sz w:val="15"/>
                     <w:szCs w:val="15"/>
                   </w:rPr>
-                  <w:t>Select ▾</w:t>
+                  <w:t>Yes</w:t>
                 </w:r>
               </w:sdtContent>
             </w:sdt>
@@ -10525,7 +10241,7 @@
                     <w:sz w:val="15"/>
                     <w:szCs w:val="15"/>
                   </w:rPr>
-                  <w:t>Select ▾</w:t>
+                  <w:t>Yes</w:t>
                 </w:r>
               </w:sdtContent>
             </w:sdt>
@@ -10539,6 +10255,9 @@
             <w:pPr>
               <w:keepNext/>
             </w:pPr>
+            <w:r>
+              <w:t>Aarush Mishra</w:t>
+            </w:r>
           </w:p>
         </w:tc>
         <w:tc>
@@ -10570,7 +10289,7 @@
                     <w:sz w:val="15"/>
                     <w:szCs w:val="15"/>
                   </w:rPr>
-                  <w:t>Select ▾</w:t>
+                  <w:t>No</w:t>
                 </w:r>
               </w:sdtContent>
             </w:sdt>
@@ -10622,7 +10341,7 @@
                     <w:sz w:val="15"/>
                     <w:szCs w:val="15"/>
                   </w:rPr>
-                  <w:t>Select ▾</w:t>
+                  <w:t>Yes</w:t>
                 </w:r>
               </w:sdtContent>
             </w:sdt>
@@ -10654,7 +10373,7 @@
                     <w:sz w:val="15"/>
                     <w:szCs w:val="15"/>
                   </w:rPr>
-                  <w:t>Select ▾</w:t>
+                  <w:t>Yes</w:t>
                 </w:r>
               </w:sdtContent>
             </w:sdt>
@@ -10686,7 +10405,7 @@
                     <w:sz w:val="15"/>
                     <w:szCs w:val="15"/>
                   </w:rPr>
-                  <w:t>Select ▾</w:t>
+                  <w:t>Yes</w:t>
                 </w:r>
               </w:sdtContent>
             </w:sdt>
@@ -10696,7 +10415,11 @@
           <w:tcPr>
             <w:tcW w:w="2211" w:type="dxa"/>
           </w:tcPr>
-          <w:p/>
+          <w:p>
+            <w:r>
+              <w:t>Sachi Kumar</w:t>
+            </w:r>
+          </w:p>
         </w:tc>
         <w:tc>
           <w:tcPr>
@@ -10724,7 +10447,7 @@
                     <w:sz w:val="15"/>
                     <w:szCs w:val="15"/>
                   </w:rPr>
-                  <w:t>Select ▾</w:t>
+                  <w:t>No</w:t>
                 </w:r>
               </w:sdtContent>
             </w:sdt>
@@ -10747,7 +10470,7 @@
       </w:r>
     </w:p>
     <w:sectPr>
-      <w:footerReference w:type="default" r:id="rId8"/>
+      <w:footerReference w:type="default" r:id="rId10"/>
       <w:pgSz w:w="11906" w:h="16838"/>
       <w:pgMar w:top="850" w:right="850" w:bottom="850" w:left="850" w:header="720" w:footer="720" w:gutter="0"/>
       <w:cols w:space="720"/>
@@ -11636,6 +11359,7 @@
   <w:style w:type="character" w:default="1" w:styleId="DefaultParagraphFont">
     <w:name w:val="Default Paragraph Font"/>
     <w:uiPriority w:val="1"/>
+    <w:semiHidden/>
     <w:unhideWhenUsed/>
   </w:style>
   <w:style w:type="table" w:default="1" w:styleId="TableNormal">

</xml_diff>

<commit_message>
docs(group-17): update dossier with verified contribution table
Co-authored-by: Ishan R Choudhary <73456920+Ishan-Choudhary@users.noreply.github.com>
Co-authored-by: SilverElloy665 <194524778+silverelloy665@users.noreply.github.com>
Co-authored-by: sachi171 <196042924+sachi171@users.noreply.github.com>
Co-Authored-By: Claude Sonnet 5.5 <noreply@anthropic.com>
</commit_message>
<xml_diff>
--- a/Group_17_Samarth_Ishan_Aarush_Sachi/docs/IVRAR_Group_17_Technical_Dossier.docx
+++ b/Group_17_Samarth_Ishan_Aarush_Sachi/docs/IVRAR_Group_17_Technical_Dossier.docx
@@ -103,7 +103,21 @@
               <w:rPr>
                 <w:sz w:val="15"/>
               </w:rPr>
-              <w:t>Group 17 · Batch B1 (as allotted in the finalised PBL titles sheet)</w:t>
+              <w:t xml:space="preserve">Group 17 · Batch B1 (as allotted in the </w:t>
+            </w:r>
+            <w:proofErr w:type="spellStart"/>
+            <w:r>
+              <w:rPr>
+                <w:sz w:val="15"/>
+              </w:rPr>
+              <w:t>finalised</w:t>
+            </w:r>
+            <w:proofErr w:type="spellEnd"/>
+            <w:r>
+              <w:rPr>
+                <w:sz w:val="15"/>
+              </w:rPr>
+              <w:t xml:space="preserve"> PBL titles sheet)</w:t>
             </w:r>
           </w:p>
         </w:tc>
@@ -122,12 +136,21 @@
             <w:pPr>
               <w:keepNext/>
             </w:pPr>
+            <w:proofErr w:type="spellStart"/>
             <w:r>
               <w:rPr>
                 <w:b/>
                 <w:sz w:val="15"/>
               </w:rPr>
-              <w:t>Monorepo folder</w:t>
+              <w:t>Monorepo</w:t>
+            </w:r>
+            <w:proofErr w:type="spellEnd"/>
+            <w:r>
+              <w:rPr>
+                <w:b/>
+                <w:sz w:val="15"/>
+              </w:rPr>
+              <w:t xml:space="preserve"> folder</w:t>
             </w:r>
           </w:p>
         </w:tc>
@@ -312,6 +335,7 @@
             <w:pPr>
               <w:keepNext/>
             </w:pPr>
+            <w:proofErr w:type="spellStart"/>
             <w:r>
               <w:rPr>
                 <w:b/>
@@ -319,6 +343,7 @@
               </w:rPr>
               <w:t>Programme</w:t>
             </w:r>
+            <w:proofErr w:type="spellEnd"/>
           </w:p>
         </w:tc>
         <w:tc>
@@ -721,7 +746,21 @@
               <w:rPr>
                 <w:sz w:val="15"/>
               </w:rPr>
-              <w:t>B Tech Comp Sci &amp; Engg (Cyber Sec)</w:t>
+              <w:t xml:space="preserve">B Tech Comp Sci &amp; </w:t>
+            </w:r>
+            <w:proofErr w:type="spellStart"/>
+            <w:r>
+              <w:rPr>
+                <w:sz w:val="15"/>
+              </w:rPr>
+              <w:t>Engg</w:t>
+            </w:r>
+            <w:proofErr w:type="spellEnd"/>
+            <w:r>
+              <w:rPr>
+                <w:sz w:val="15"/>
+              </w:rPr>
+              <w:t xml:space="preserve"> (Cyber Sec)</w:t>
             </w:r>
           </w:p>
         </w:tc>
@@ -764,7 +803,25 @@
           <w:color w:val="333333"/>
           <w:sz w:val="14"/>
         </w:rPr>
-        <w:t>Batch column = official student list. Tell Dr. Nanade by 20-Oct if any name, ID or role is wrong.</w:t>
+        <w:t xml:space="preserve">Batch column = official student list. Tell Dr. </w:t>
+      </w:r>
+      <w:proofErr w:type="spellStart"/>
+      <w:r>
+        <w:rPr>
+          <w:i/>
+          <w:color w:val="333333"/>
+          <w:sz w:val="14"/>
+        </w:rPr>
+        <w:t>Nanade</w:t>
+      </w:r>
+      <w:proofErr w:type="spellEnd"/>
+      <w:r>
+        <w:rPr>
+          <w:i/>
+          <w:color w:val="333333"/>
+          <w:sz w:val="14"/>
+        </w:rPr>
+        <w:t xml:space="preserve"> by 20-Oct if any name, ID or role is wrong.</w:t>
       </w:r>
     </w:p>
     <w:p>
@@ -816,12 +873,21 @@
             <w:pPr>
               <w:keepNext/>
             </w:pPr>
+            <w:proofErr w:type="spellStart"/>
             <w:r>
               <w:rPr>
                 <w:b/>
                 <w:sz w:val="15"/>
               </w:rPr>
-              <w:t>Authorised Aalborg title</w:t>
+              <w:t>Authorised</w:t>
+            </w:r>
+            <w:proofErr w:type="spellEnd"/>
+            <w:r>
+              <w:rPr>
+                <w:b/>
+                <w:sz w:val="15"/>
+              </w:rPr>
+              <w:t xml:space="preserve"> Aalborg title</w:t>
             </w:r>
           </w:p>
         </w:tc>
@@ -846,7 +912,14 @@
               <w:rPr>
                 <w:sz w:val="15"/>
               </w:rPr>
-              <w:t xml:space="preserve"> social-engineering simulation improve non-technical employees' threat-recognition ability for organisation</w:t>
+              <w:t xml:space="preserve"> social-engineering simulation improve non-technical employees' threat-recognition ability for </w:t>
+            </w:r>
+            <w:proofErr w:type="spellStart"/>
+            <w:r>
+              <w:rPr>
+                <w:sz w:val="15"/>
+              </w:rPr>
+              <w:t>organisation</w:t>
             </w:r>
             <w:r>
               <w:rPr>
@@ -854,6 +927,7 @@
               </w:rPr>
               <w:t>s</w:t>
             </w:r>
+            <w:proofErr w:type="spellEnd"/>
             <w:r>
               <w:rPr>
                 <w:sz w:val="15"/>
@@ -898,7 +972,21 @@
               <w:rPr>
                 <w:sz w:val="15"/>
               </w:rPr>
-              <w:t>How can a Virtual Reality social-engineering simulation improve non-technical employees' threat-recognition ability for organisations like NEXORA Corporation?</w:t>
+              <w:t xml:space="preserve">How can a Virtual Reality social-engineering simulation improve non-technical employees' threat-recognition ability for </w:t>
+            </w:r>
+            <w:proofErr w:type="spellStart"/>
+            <w:r>
+              <w:rPr>
+                <w:sz w:val="15"/>
+              </w:rPr>
+              <w:t>organisations</w:t>
+            </w:r>
+            <w:proofErr w:type="spellEnd"/>
+            <w:r>
+              <w:rPr>
+                <w:sz w:val="15"/>
+              </w:rPr>
+              <w:t xml:space="preserve"> like NEXORA Corporation?</w:t>
             </w:r>
           </w:p>
         </w:tc>
@@ -1405,7 +1493,55 @@
                 <w:sz w:val="15"/>
                 <w:szCs w:val="15"/>
               </w:rPr>
-              <w:t>Non-technical office staff are the easiest way into a company: they open a convincing invoice email, plug in a found USB drive, let a confident 'IT engineer' through the door and approve an unexpected MFA prompt, usually while rushing to finish work. In Verizon's 2024 Data Breach Investigations Report, 68% of the 10,626 confirmed breaches analysed involved a non-malicious human element: a person making an error or falling for social engineering (Verizon, 2024 DBIR, https://www.verizon.com/business/resources/reports/dbir/). Most organisations measure this only through training-completion records and email phishing-simulation click rates, which cover one channel and say nothing about door, USB, chat or MFA pretexts. CyberQuest measures all of them in one 15-minute VR session: breach rate, credential disclosure and challenge latency.</w:t>
+              <w:t xml:space="preserve">Non-technical office staff are the easiest way into a company: they open a convincing invoice email, plug in a found USB drive, let a confident 'IT engineer' through the door and approve an unexpected MFA prompt, usually while rushing to finish work. In Verizon's 2024 Data Breach Investigations Report, 68% of the 10,626 confirmed breaches </w:t>
+            </w:r>
+            <w:proofErr w:type="spellStart"/>
+            <w:r>
+              <w:rPr>
+                <w:sz w:val="15"/>
+                <w:szCs w:val="15"/>
+              </w:rPr>
+              <w:t>analysed</w:t>
+            </w:r>
+            <w:proofErr w:type="spellEnd"/>
+            <w:r>
+              <w:rPr>
+                <w:sz w:val="15"/>
+                <w:szCs w:val="15"/>
+              </w:rPr>
+              <w:t xml:space="preserve"> involved a non-malicious human element: a person making an error or falling for social engineering (Verizon, 2024 DBIR, https://www.verizon.com/business/resources/reports/dbir/). Most </w:t>
+            </w:r>
+            <w:proofErr w:type="spellStart"/>
+            <w:r>
+              <w:rPr>
+                <w:sz w:val="15"/>
+                <w:szCs w:val="15"/>
+              </w:rPr>
+              <w:t>organisations</w:t>
+            </w:r>
+            <w:proofErr w:type="spellEnd"/>
+            <w:r>
+              <w:rPr>
+                <w:sz w:val="15"/>
+                <w:szCs w:val="15"/>
+              </w:rPr>
+              <w:t xml:space="preserve"> measure this only through training-completion records and email phishing-simulation click rates, which cover one channel and say nothing about door, USB, chat or MFA pretexts. </w:t>
+            </w:r>
+            <w:proofErr w:type="spellStart"/>
+            <w:r>
+              <w:rPr>
+                <w:sz w:val="15"/>
+                <w:szCs w:val="15"/>
+              </w:rPr>
+              <w:t>CyberQuest</w:t>
+            </w:r>
+            <w:proofErr w:type="spellEnd"/>
+            <w:r>
+              <w:rPr>
+                <w:sz w:val="15"/>
+                <w:szCs w:val="15"/>
+              </w:rPr>
+              <w:t xml:space="preserve"> measures all of them in one 15-minute VR session: breach rate, credential disclosure and challenge latency.</w:t>
             </w:r>
           </w:p>
         </w:tc>
@@ -1430,7 +1566,23 @@
           <w:sz w:val="22"/>
         </w:rPr>
         <w:lastRenderedPageBreak/>
-        <w:t>SECTION 2 · C# Script Architecture &amp; Mathematical / Behavioural Model</w:t>
+        <w:t xml:space="preserve">SECTION 2 · C# Script Architecture &amp; Mathematical / </w:t>
+      </w:r>
+      <w:proofErr w:type="spellStart"/>
+      <w:r>
+        <w:rPr>
+          <w:b/>
+          <w:sz w:val="22"/>
+        </w:rPr>
+        <w:t>Behavioural</w:t>
+      </w:r>
+      <w:proofErr w:type="spellEnd"/>
+      <w:r>
+        <w:rPr>
+          <w:b/>
+          <w:sz w:val="22"/>
+        </w:rPr>
+        <w:t xml:space="preserve"> Model</w:t>
       </w:r>
       <w:r>
         <w:rPr>
@@ -1471,7 +1623,23 @@
                 <w:b/>
                 <w:sz w:val="15"/>
               </w:rPr>
-              <w:t>C# scripts in your monorepo folder today</w:t>
+              <w:t xml:space="preserve">C# scripts in your </w:t>
+            </w:r>
+            <w:proofErr w:type="spellStart"/>
+            <w:r>
+              <w:rPr>
+                <w:b/>
+                <w:sz w:val="15"/>
+              </w:rPr>
+              <w:t>monorepo</w:t>
+            </w:r>
+            <w:proofErr w:type="spellEnd"/>
+            <w:r>
+              <w:rPr>
+                <w:b/>
+                <w:sz w:val="15"/>
+              </w:rPr>
+              <w:t xml:space="preserve"> folder today</w:t>
             </w:r>
           </w:p>
         </w:tc>
@@ -1487,7 +1655,259 @@
               <w:rPr>
                 <w:sz w:val="15"/>
               </w:rPr>
-              <w:t>Core: GameState.cs · GameDirector.cs · SituationTrigger.cs · EndingResolver.cs · ScoreCalculator.cs · SessionLog.cs · RoomTracker.cs · PhysicalSecurityTelemetryLogger.cs. Situations: EmailQrSituation.cs · FakeLoginSituation.cs · UsbSituation.cs · ColleagueSituation.cs · IntercomSituation.cs · MfaSituation.cs · WorkstationSituation.cs · EndingFlow.cs. (The scaffold's TailgatingBreachManager.cs is replaced by IntercomSituation.cs.)</w:t>
+              <w:t xml:space="preserve">Core: </w:t>
+            </w:r>
+            <w:proofErr w:type="spellStart"/>
+            <w:r>
+              <w:rPr>
+                <w:sz w:val="15"/>
+              </w:rPr>
+              <w:t>GameState.cs</w:t>
+            </w:r>
+            <w:proofErr w:type="spellEnd"/>
+            <w:r>
+              <w:rPr>
+                <w:sz w:val="15"/>
+              </w:rPr>
+              <w:t xml:space="preserve"> · </w:t>
+            </w:r>
+            <w:proofErr w:type="spellStart"/>
+            <w:r>
+              <w:rPr>
+                <w:sz w:val="15"/>
+              </w:rPr>
+              <w:t>GameDirector.cs</w:t>
+            </w:r>
+            <w:proofErr w:type="spellEnd"/>
+            <w:r>
+              <w:rPr>
+                <w:sz w:val="15"/>
+              </w:rPr>
+              <w:t xml:space="preserve"> · </w:t>
+            </w:r>
+            <w:proofErr w:type="spellStart"/>
+            <w:r>
+              <w:rPr>
+                <w:sz w:val="15"/>
+              </w:rPr>
+              <w:t>SituationTrigger.cs</w:t>
+            </w:r>
+            <w:proofErr w:type="spellEnd"/>
+            <w:r>
+              <w:rPr>
+                <w:sz w:val="15"/>
+              </w:rPr>
+              <w:t xml:space="preserve"> · </w:t>
+            </w:r>
+            <w:proofErr w:type="spellStart"/>
+            <w:r>
+              <w:rPr>
+                <w:sz w:val="15"/>
+              </w:rPr>
+              <w:t>EndingResolver.cs</w:t>
+            </w:r>
+            <w:proofErr w:type="spellEnd"/>
+            <w:r>
+              <w:rPr>
+                <w:sz w:val="15"/>
+              </w:rPr>
+              <w:t xml:space="preserve"> · </w:t>
+            </w:r>
+            <w:proofErr w:type="spellStart"/>
+            <w:r>
+              <w:rPr>
+                <w:sz w:val="15"/>
+              </w:rPr>
+              <w:t>ScoreCalculator.cs</w:t>
+            </w:r>
+            <w:proofErr w:type="spellEnd"/>
+            <w:r>
+              <w:rPr>
+                <w:sz w:val="15"/>
+              </w:rPr>
+              <w:t xml:space="preserve"> · </w:t>
+            </w:r>
+            <w:proofErr w:type="spellStart"/>
+            <w:r>
+              <w:rPr>
+                <w:sz w:val="15"/>
+              </w:rPr>
+              <w:t>SessionLog.cs</w:t>
+            </w:r>
+            <w:proofErr w:type="spellEnd"/>
+            <w:r>
+              <w:rPr>
+                <w:sz w:val="15"/>
+              </w:rPr>
+              <w:t xml:space="preserve"> · </w:t>
+            </w:r>
+            <w:proofErr w:type="spellStart"/>
+            <w:r>
+              <w:rPr>
+                <w:sz w:val="15"/>
+              </w:rPr>
+              <w:t>RoomTracker.cs</w:t>
+            </w:r>
+            <w:proofErr w:type="spellEnd"/>
+            <w:r>
+              <w:rPr>
+                <w:sz w:val="15"/>
+              </w:rPr>
+              <w:t xml:space="preserve"> · </w:t>
+            </w:r>
+            <w:proofErr w:type="spellStart"/>
+            <w:r>
+              <w:rPr>
+                <w:sz w:val="15"/>
+              </w:rPr>
+              <w:t>PhysicalSecurityTelemetryLogger.cs</w:t>
+            </w:r>
+            <w:proofErr w:type="spellEnd"/>
+            <w:r>
+              <w:rPr>
+                <w:sz w:val="15"/>
+              </w:rPr>
+              <w:t xml:space="preserve">. Situations: </w:t>
+            </w:r>
+            <w:proofErr w:type="spellStart"/>
+            <w:r>
+              <w:rPr>
+                <w:sz w:val="15"/>
+              </w:rPr>
+              <w:t>EmailQrSituation.cs</w:t>
+            </w:r>
+            <w:proofErr w:type="spellEnd"/>
+            <w:r>
+              <w:rPr>
+                <w:sz w:val="15"/>
+              </w:rPr>
+              <w:t xml:space="preserve"> · </w:t>
+            </w:r>
+            <w:proofErr w:type="spellStart"/>
+            <w:r>
+              <w:rPr>
+                <w:sz w:val="15"/>
+              </w:rPr>
+              <w:t>FakeLoginSituation.cs</w:t>
+            </w:r>
+            <w:proofErr w:type="spellEnd"/>
+            <w:r>
+              <w:rPr>
+                <w:sz w:val="15"/>
+              </w:rPr>
+              <w:t xml:space="preserve"> · </w:t>
+            </w:r>
+            <w:proofErr w:type="spellStart"/>
+            <w:r>
+              <w:rPr>
+                <w:sz w:val="15"/>
+              </w:rPr>
+              <w:t>UsbSituation.cs</w:t>
+            </w:r>
+            <w:proofErr w:type="spellEnd"/>
+            <w:r>
+              <w:rPr>
+                <w:sz w:val="15"/>
+              </w:rPr>
+              <w:t xml:space="preserve"> · </w:t>
+            </w:r>
+            <w:proofErr w:type="spellStart"/>
+            <w:r>
+              <w:rPr>
+                <w:sz w:val="15"/>
+              </w:rPr>
+              <w:t>ColleagueSituation.cs</w:t>
+            </w:r>
+            <w:proofErr w:type="spellEnd"/>
+            <w:r>
+              <w:rPr>
+                <w:sz w:val="15"/>
+              </w:rPr>
+              <w:t xml:space="preserve"> · </w:t>
+            </w:r>
+            <w:proofErr w:type="spellStart"/>
+            <w:r>
+              <w:rPr>
+                <w:sz w:val="15"/>
+              </w:rPr>
+              <w:t>IntercomSituation.cs</w:t>
+            </w:r>
+            <w:proofErr w:type="spellEnd"/>
+            <w:r>
+              <w:rPr>
+                <w:sz w:val="15"/>
+              </w:rPr>
+              <w:t xml:space="preserve"> · </w:t>
+            </w:r>
+            <w:proofErr w:type="spellStart"/>
+            <w:r>
+              <w:rPr>
+                <w:sz w:val="15"/>
+              </w:rPr>
+              <w:t>MfaSituation.cs</w:t>
+            </w:r>
+            <w:proofErr w:type="spellEnd"/>
+            <w:r>
+              <w:rPr>
+                <w:sz w:val="15"/>
+              </w:rPr>
+              <w:t xml:space="preserve"> · </w:t>
+            </w:r>
+            <w:proofErr w:type="spellStart"/>
+            <w:r>
+              <w:rPr>
+                <w:sz w:val="15"/>
+              </w:rPr>
+              <w:t>WorkstationSituation.cs</w:t>
+            </w:r>
+            <w:proofErr w:type="spellEnd"/>
+            <w:r>
+              <w:rPr>
+                <w:sz w:val="15"/>
+              </w:rPr>
+              <w:t xml:space="preserve"> · </w:t>
+            </w:r>
+            <w:proofErr w:type="spellStart"/>
+            <w:r>
+              <w:rPr>
+                <w:sz w:val="15"/>
+              </w:rPr>
+              <w:t>EndingFlow.cs</w:t>
+            </w:r>
+            <w:proofErr w:type="spellEnd"/>
+            <w:r>
+              <w:rPr>
+                <w:sz w:val="15"/>
+              </w:rPr>
+              <w:t xml:space="preserve">. (The scaffold's </w:t>
+            </w:r>
+            <w:proofErr w:type="spellStart"/>
+            <w:r>
+              <w:rPr>
+                <w:sz w:val="15"/>
+              </w:rPr>
+              <w:t>TailgatingBreachManager.cs</w:t>
+            </w:r>
+            <w:proofErr w:type="spellEnd"/>
+            <w:r>
+              <w:rPr>
+                <w:sz w:val="15"/>
+              </w:rPr>
+              <w:t xml:space="preserve"> is replaced by </w:t>
+            </w:r>
+            <w:proofErr w:type="spellStart"/>
+            <w:r>
+              <w:rPr>
+                <w:sz w:val="15"/>
+              </w:rPr>
+              <w:t>IntercomSituation.cs</w:t>
+            </w:r>
+            <w:proofErr w:type="spellEnd"/>
+            <w:r>
+              <w:rPr>
+                <w:sz w:val="15"/>
+              </w:rPr>
+              <w:t>.)</w:t>
             </w:r>
           </w:p>
         </w:tc>
@@ -1523,11 +1943,33 @@
             <w:pPr>
               <w:keepNext/>
             </w:pPr>
-            <w:r>
-              <w:rPr>
-                <w:sz w:val="15"/>
-              </w:rPr>
-              <w:t>PhysicalSecurityLogger.cs, implemented as PhysicalSecurityTelemetryLogger.cs (same file name and CSV columns as the repo scaffold)</w:t>
+            <w:proofErr w:type="spellStart"/>
+            <w:r>
+              <w:rPr>
+                <w:sz w:val="15"/>
+              </w:rPr>
+              <w:t>PhysicalSecurityLogger.cs</w:t>
+            </w:r>
+            <w:proofErr w:type="spellEnd"/>
+            <w:r>
+              <w:rPr>
+                <w:sz w:val="15"/>
+              </w:rPr>
+              <w:t xml:space="preserve">, implemented as </w:t>
+            </w:r>
+            <w:proofErr w:type="spellStart"/>
+            <w:r>
+              <w:rPr>
+                <w:sz w:val="15"/>
+              </w:rPr>
+              <w:t>PhysicalSecurityTelemetryLogger.cs</w:t>
+            </w:r>
+            <w:proofErr w:type="spellEnd"/>
+            <w:r>
+              <w:rPr>
+                <w:sz w:val="15"/>
+              </w:rPr>
+              <w:t xml:space="preserve"> (same file name and CSV columns as the repo scaffold)</w:t>
             </w:r>
           </w:p>
         </w:tc>
@@ -1567,7 +2009,63 @@
               <w:rPr>
                 <w:sz w:val="15"/>
               </w:rPr>
-              <w:t>No fixed sequence. GameState holds every choice; 7 independent situation triggers (email/QR, fake login, USB, colleague, intercom visitor, MFA push, unlocked workstation) each go NotReached → Request shown → Decision (safe / unsafe / over-cautious) → Outcome logged. GameDirector allows one scheduled situation at a time with a 45 s cooldown; 6:30 PM lockout → EndingResolver (Breach / Contained but Exposed / Social Miscalibration / Full Containment).</w:t>
+              <w:t xml:space="preserve">No fixed sequence. </w:t>
+            </w:r>
+            <w:proofErr w:type="spellStart"/>
+            <w:r>
+              <w:rPr>
+                <w:sz w:val="15"/>
+              </w:rPr>
+              <w:t>GameState</w:t>
+            </w:r>
+            <w:proofErr w:type="spellEnd"/>
+            <w:r>
+              <w:rPr>
+                <w:sz w:val="15"/>
+              </w:rPr>
+              <w:t xml:space="preserve"> holds every choice; 7 independent situation triggers (email/QR, fake login, USB, colleague, intercom visitor, MFA push, unlocked workstation) each go </w:t>
+            </w:r>
+            <w:proofErr w:type="spellStart"/>
+            <w:r>
+              <w:rPr>
+                <w:sz w:val="15"/>
+              </w:rPr>
+              <w:t>NotReached</w:t>
+            </w:r>
+            <w:proofErr w:type="spellEnd"/>
+            <w:r>
+              <w:rPr>
+                <w:sz w:val="15"/>
+              </w:rPr>
+              <w:t xml:space="preserve"> → Request shown → Decision (safe / unsafe / over-cautious) → Outcome logged. </w:t>
+            </w:r>
+            <w:proofErr w:type="spellStart"/>
+            <w:r>
+              <w:rPr>
+                <w:sz w:val="15"/>
+              </w:rPr>
+              <w:t>GameDirector</w:t>
+            </w:r>
+            <w:proofErr w:type="spellEnd"/>
+            <w:r>
+              <w:rPr>
+                <w:sz w:val="15"/>
+              </w:rPr>
+              <w:t xml:space="preserve"> allows one scheduled situation at a time with a 45 s cooldown; 6:30 PM lockout → </w:t>
+            </w:r>
+            <w:proofErr w:type="spellStart"/>
+            <w:r>
+              <w:rPr>
+                <w:sz w:val="15"/>
+              </w:rPr>
+              <w:t>EndingResolver</w:t>
+            </w:r>
+            <w:proofErr w:type="spellEnd"/>
+            <w:r>
+              <w:rPr>
+                <w:sz w:val="15"/>
+              </w:rPr>
+              <w:t xml:space="preserve"> (Breach / Contained but Exposed / Social Miscalibration / Full Containment).</w:t>
             </w:r>
           </w:p>
         </w:tc>
@@ -1614,7 +2112,35 @@
                 <w:sz w:val="15"/>
               </w:rPr>
               <w:br/>
-              <w:t>Challenge latency L = t_decision − t_request (s)</w:t>
+              <w:t xml:space="preserve">Challenge latency L = </w:t>
+            </w:r>
+            <w:proofErr w:type="spellStart"/>
+            <w:r>
+              <w:rPr>
+                <w:sz w:val="15"/>
+              </w:rPr>
+              <w:t>t_decision</w:t>
+            </w:r>
+            <w:proofErr w:type="spellEnd"/>
+            <w:r>
+              <w:rPr>
+                <w:sz w:val="15"/>
+              </w:rPr>
+              <w:t xml:space="preserve"> − </w:t>
+            </w:r>
+            <w:proofErr w:type="spellStart"/>
+            <w:r>
+              <w:rPr>
+                <w:sz w:val="15"/>
+              </w:rPr>
+              <w:t>t_request</w:t>
+            </w:r>
+            <w:proofErr w:type="spellEnd"/>
+            <w:r>
+              <w:rPr>
+                <w:sz w:val="15"/>
+              </w:rPr>
+              <w:t xml:space="preserve"> (s)</w:t>
             </w:r>
           </w:p>
         </w:tc>
@@ -1648,7 +2174,35 @@
               <w:rPr>
                 <w:sz w:val="15"/>
               </w:rPr>
-              <w:t>Unity 6 LTS (6000.6.6f1) URP; Meta XR All-in-One SDK (Interaction SDK grab, ray, poke, teleport) on OpenXR; Meta Quest standalone; Meta XR Simulator and Unity Test Framework for testing. Seven-space office floor with no human characters: people appear only as text, subtitles, chat and ID-card images. C# PhysicalSecurityTelemetryLogger.cs. (The title sheet listed Unity 2022.3 LTS and an NPC lobby.)</w:t>
+              <w:t xml:space="preserve">Unity 6 LTS (6000.6.6f1) URP; Meta XR All-in-One SDK (Interaction SDK grab, ray, poke, teleport) on </w:t>
+            </w:r>
+            <w:proofErr w:type="spellStart"/>
+            <w:r>
+              <w:rPr>
+                <w:sz w:val="15"/>
+              </w:rPr>
+              <w:t>OpenXR</w:t>
+            </w:r>
+            <w:proofErr w:type="spellEnd"/>
+            <w:r>
+              <w:rPr>
+                <w:sz w:val="15"/>
+              </w:rPr>
+              <w:t xml:space="preserve">; Meta Quest standalone; Meta XR Simulator and Unity Test Framework for testing. Seven-space office floor with no human characters: people appear only as text, subtitles, chat and ID-card images. C# </w:t>
+            </w:r>
+            <w:proofErr w:type="spellStart"/>
+            <w:r>
+              <w:rPr>
+                <w:sz w:val="15"/>
+              </w:rPr>
+              <w:t>PhysicalSecurityTelemetryLogger.cs</w:t>
+            </w:r>
+            <w:proofErr w:type="spellEnd"/>
+            <w:r>
+              <w:rPr>
+                <w:sz w:val="15"/>
+              </w:rPr>
+              <w:t>. (The title sheet listed Unity 2022.3 LTS and an NPC lobby.)</w:t>
             </w:r>
           </w:p>
         </w:tc>
@@ -1790,12 +2344,14 @@
             <w:pPr>
               <w:keepNext/>
             </w:pPr>
+            <w:proofErr w:type="spellStart"/>
             <w:r>
               <w:rPr>
                 <w:sz w:val="14"/>
               </w:rPr>
               <w:t>TailgatingBreachManager.cs</w:t>
             </w:r>
+            <w:proofErr w:type="spellEnd"/>
           </w:p>
         </w:tc>
         <w:tc>
@@ -1886,7 +2442,23 @@
                 <w:sz w:val="14"/>
                 <w:szCs w:val="14"/>
               </w:rPr>
-              <w:t>Not used: it needs animated NPCs and turnstiles. Its tailgating pretext is built as the intercom impersonator in IntercomSituation.cs.</w:t>
+              <w:t xml:space="preserve">Not used: it needs animated NPCs and turnstiles. Its tailgating pretext is built as the intercom impersonator in </w:t>
+            </w:r>
+            <w:proofErr w:type="spellStart"/>
+            <w:r>
+              <w:rPr>
+                <w:sz w:val="14"/>
+                <w:szCs w:val="14"/>
+              </w:rPr>
+              <w:t>IntercomSituation.cs</w:t>
+            </w:r>
+            <w:proofErr w:type="spellEnd"/>
+            <w:r>
+              <w:rPr>
+                <w:sz w:val="14"/>
+                <w:szCs w:val="14"/>
+              </w:rPr>
+              <w:t>.</w:t>
             </w:r>
           </w:p>
         </w:tc>
@@ -1904,12 +2476,14 @@
             <w:pPr>
               <w:keepNext/>
             </w:pPr>
+            <w:proofErr w:type="spellStart"/>
             <w:r>
               <w:rPr>
                 <w:sz w:val="14"/>
               </w:rPr>
               <w:t>PhysicalSecurityTelemetryLogger.cs</w:t>
             </w:r>
+            <w:proofErr w:type="spellEnd"/>
           </w:p>
         </w:tc>
         <w:tc>
@@ -2030,6 +2604,7 @@
                 <w:text/>
               </w:sdtPr>
               <w:sdtContent>
+                <w:proofErr w:type="spellStart"/>
                 <w:r>
                   <w:rPr>
                     <w:sz w:val="14"/>
@@ -2037,6 +2612,7 @@
                   </w:rPr>
                   <w:t>SituationTrigger.cs</w:t>
                 </w:r>
+                <w:proofErr w:type="spellEnd"/>
               </w:sdtContent>
             </w:sdt>
           </w:p>
@@ -2129,7 +2705,39 @@
                 <w:sz w:val="14"/>
                 <w:szCs w:val="14"/>
               </w:rPr>
-              <w:t>Base class for every situation: trigger conditions, t_request and t_decision timestamps, hands each decision to the telemetry logger.</w:t>
+              <w:t xml:space="preserve">Base class for every situation: trigger conditions, </w:t>
+            </w:r>
+            <w:proofErr w:type="spellStart"/>
+            <w:r>
+              <w:rPr>
+                <w:sz w:val="14"/>
+                <w:szCs w:val="14"/>
+              </w:rPr>
+              <w:t>t_request</w:t>
+            </w:r>
+            <w:proofErr w:type="spellEnd"/>
+            <w:r>
+              <w:rPr>
+                <w:sz w:val="14"/>
+                <w:szCs w:val="14"/>
+              </w:rPr>
+              <w:t xml:space="preserve"> and </w:t>
+            </w:r>
+            <w:proofErr w:type="spellStart"/>
+            <w:r>
+              <w:rPr>
+                <w:sz w:val="14"/>
+                <w:szCs w:val="14"/>
+              </w:rPr>
+              <w:t>t_decision</w:t>
+            </w:r>
+            <w:proofErr w:type="spellEnd"/>
+            <w:r>
+              <w:rPr>
+                <w:sz w:val="14"/>
+                <w:szCs w:val="14"/>
+              </w:rPr>
+              <w:t xml:space="preserve"> timestamps, hands each decision to the telemetry logger.</w:t>
             </w:r>
           </w:p>
         </w:tc>
@@ -2156,6 +2764,7 @@
                 <w:text/>
               </w:sdtPr>
               <w:sdtContent>
+                <w:proofErr w:type="spellStart"/>
                 <w:r>
                   <w:rPr>
                     <w:sz w:val="14"/>
@@ -2163,6 +2772,7 @@
                   </w:rPr>
                   <w:t>IntercomSituation.cs</w:t>
                 </w:r>
+                <w:proofErr w:type="spellEnd"/>
               </w:sdtContent>
             </w:sdt>
           </w:p>
@@ -2298,130 +2908,9 @@
                 <w:sz w:val="16"/>
                 <w:szCs w:val="16"/>
               </w:rPr>
-              <w:t>// Assets/_Project/Scripts/Core/SituationTrigger.cs</w:t>
-            </w:r>
-          </w:p>
-          <w:p>
-            <w:r>
-              <w:rPr>
-                <w:rFonts w:ascii="Consolas" w:hAnsi="Consolas" w:cs="Consolas"/>
-                <w:sz w:val="16"/>
-                <w:szCs w:val="16"/>
-              </w:rPr>
-              <w:t>147  protected void Complete(string decision)</w:t>
-            </w:r>
-          </w:p>
-          <w:p>
-            <w:r>
-              <w:rPr>
-                <w:rFonts w:ascii="Consolas" w:hAnsi="Consolas" w:cs="Consolas"/>
-                <w:sz w:val="16"/>
-                <w:szCs w:val="16"/>
-              </w:rPr>
-              <w:t>148  {</w:t>
-            </w:r>
-          </w:p>
-          <w:p>
-            <w:r>
-              <w:rPr>
-                <w:rFonts w:ascii="Consolas" w:hAnsi="Consolas" w:cs="Consolas"/>
-                <w:sz w:val="16"/>
-                <w:szCs w:val="16"/>
-              </w:rPr>
-              <w:t>149      if (Resolved)</w:t>
-            </w:r>
-          </w:p>
-          <w:p>
-            <w:r>
-              <w:rPr>
-                <w:rFonts w:ascii="Consolas" w:hAnsi="Consolas" w:cs="Consolas"/>
-                <w:sz w:val="16"/>
-                <w:szCs w:val="16"/>
-              </w:rPr>
-              <w:t>150      {</w:t>
-            </w:r>
-          </w:p>
-          <w:p>
-            <w:r>
-              <w:rPr>
-                <w:rFonts w:ascii="Consolas" w:hAnsi="Consolas" w:cs="Consolas"/>
-                <w:sz w:val="16"/>
-                <w:szCs w:val="16"/>
-              </w:rPr>
-              <w:t>151          return;</w:t>
-            </w:r>
-          </w:p>
-          <w:p>
-            <w:r>
-              <w:rPr>
-                <w:rFonts w:ascii="Consolas" w:hAnsi="Consolas" w:cs="Consolas"/>
-                <w:sz w:val="16"/>
-                <w:szCs w:val="16"/>
-              </w:rPr>
-              <w:t>152      }</w:t>
-            </w:r>
-          </w:p>
-          <w:p>
-            <w:r>
-              <w:rPr>
-                <w:rFonts w:ascii="Consolas" w:hAnsi="Consolas" w:cs="Consolas"/>
-                <w:sz w:val="16"/>
-                <w:szCs w:val="16"/>
-              </w:rPr>
-              <w:t>153      Resolved = true;</w:t>
-            </w:r>
-          </w:p>
-          <w:p>
-            <w:r>
-              <w:rPr>
-                <w:rFonts w:ascii="Consolas" w:hAnsi="Consolas" w:cs="Consolas"/>
-                <w:sz w:val="16"/>
-                <w:szCs w:val="16"/>
-              </w:rPr>
-              <w:t>154      State.MarkCompleted(id);</w:t>
-            </w:r>
-          </w:p>
-          <w:p>
-            <w:r>
-              <w:rPr>
-                <w:rFonts w:ascii="Consolas" w:hAnsi="Consolas" w:cs="Consolas"/>
-                <w:sz w:val="16"/>
-                <w:szCs w:val="16"/>
-              </w:rPr>
-              <w:t>155      SessionLog.Decision($"{id}: {decision}");</w:t>
-            </w:r>
-          </w:p>
-          <w:p>
-            <w:r>
-              <w:rPr>
-                <w:rFonts w:ascii="Consolas" w:hAnsi="Consolas" w:cs="Consolas"/>
-                <w:sz w:val="16"/>
-                <w:szCs w:val="16"/>
-              </w:rPr>
-              <w:t>156      PhysicalSecurityTelemetryLogger.RecordDecision(id, decision, RequestShownAt, Director != null ? Director.Elapsed : TriggeredAt);</w:t>
-            </w:r>
-          </w:p>
-          <w:p>
-            <w:r>
-              <w:rPr>
-                <w:rFonts w:ascii="Consolas" w:hAnsi="Consolas" w:cs="Consolas"/>
-                <w:sz w:val="16"/>
-                <w:szCs w:val="16"/>
-              </w:rPr>
-              <w:t>157      Director?.Release(this);</w:t>
-            </w:r>
-          </w:p>
-          <w:p>
-            <w:r>
-              <w:rPr>
-                <w:rFonts w:ascii="Consolas" w:hAnsi="Consolas" w:cs="Consolas"/>
-                <w:sz w:val="16"/>
-                <w:szCs w:val="16"/>
-              </w:rPr>
-              <w:t>158  }</w:t>
-            </w:r>
-          </w:p>
-          <w:p>
+              <w:t>// Assets/_Project/Scripts/Core/</w:t>
+            </w:r>
+            <w:proofErr w:type="spellStart"/>
             <w:r>
               <w:rPr>
                 <w:rFonts w:ascii="Consolas" w:hAnsi="Consolas" w:cs="Consolas"/>
@@ -2429,58 +2918,59 @@
                 <w:sz w:val="16"/>
                 <w:szCs w:val="16"/>
               </w:rPr>
-              <w:t>// Assets/_Project/Scripts/Core/PhysicalSecurityTelemetryLogger.cs</w:t>
-            </w:r>
-          </w:p>
-          <w:p>
+              <w:t>SituationTrigger.cs</w:t>
+            </w:r>
+            <w:proofErr w:type="spellEnd"/>
+          </w:p>
+          <w:p>
+            <w:proofErr w:type="gramStart"/>
             <w:r>
               <w:rPr>
                 <w:rFonts w:ascii="Consolas" w:hAnsi="Consolas" w:cs="Consolas"/>
                 <w:sz w:val="16"/>
                 <w:szCs w:val="16"/>
               </w:rPr>
-              <w:t>95   public static void RecordDecision(SituationId id, string action, float requestedAt, float decidedAt)</w:t>
-            </w:r>
-          </w:p>
-          <w:p>
+              <w:t>147  protected</w:t>
+            </w:r>
+            <w:proofErr w:type="gramEnd"/>
             <w:r>
               <w:rPr>
                 <w:rFonts w:ascii="Consolas" w:hAnsi="Consolas" w:cs="Consolas"/>
                 <w:sz w:val="16"/>
                 <w:szCs w:val="16"/>
               </w:rPr>
-              <w:t>96   {</w:t>
-            </w:r>
-          </w:p>
-          <w:p>
+              <w:t xml:space="preserve"> void </w:t>
+            </w:r>
+            <w:proofErr w:type="gramStart"/>
             <w:r>
               <w:rPr>
                 <w:rFonts w:ascii="Consolas" w:hAnsi="Consolas" w:cs="Consolas"/>
                 <w:sz w:val="16"/>
                 <w:szCs w:val="16"/>
               </w:rPr>
-              <w:t>97       Decisions[id] = new Decision { action = action, latency = Mathf.Max(0f, decidedAt - requestedAt) };</w:t>
-            </w:r>
-          </w:p>
-          <w:p>
+              <w:t>Complete(</w:t>
+            </w:r>
+            <w:proofErr w:type="gramEnd"/>
             <w:r>
               <w:rPr>
                 <w:rFonts w:ascii="Consolas" w:hAnsi="Consolas" w:cs="Consolas"/>
                 <w:sz w:val="16"/>
                 <w:szCs w:val="16"/>
               </w:rPr>
-              <w:t>98   }</w:t>
-            </w:r>
-          </w:p>
-          <w:p>
+              <w:t>string decision)</w:t>
+            </w:r>
+          </w:p>
+          <w:p>
+            <w:proofErr w:type="gramStart"/>
             <w:r>
               <w:rPr>
                 <w:rFonts w:ascii="Consolas" w:hAnsi="Consolas" w:cs="Consolas"/>
                 <w:sz w:val="16"/>
                 <w:szCs w:val="16"/>
               </w:rPr>
-              <w:t>262  public static float BreachRate(GameState s)</w:t>
-            </w:r>
+              <w:t>148  {</w:t>
+            </w:r>
+            <w:proofErr w:type="gramEnd"/>
           </w:p>
           <w:p>
             <w:r>
@@ -2489,7 +2979,7 @@
                 <w:sz w:val="16"/>
                 <w:szCs w:val="16"/>
               </w:rPr>
-              <w:t>263  {</w:t>
+              <w:t>149      if (Resolved)</w:t>
             </w:r>
           </w:p>
           <w:p>
@@ -2499,18 +2989,18 @@
                 <w:sz w:val="16"/>
                 <w:szCs w:val="16"/>
               </w:rPr>
-              <w:t>264      int attacks = AttacksReached(s);</w:t>
-            </w:r>
-          </w:p>
-          <w:p>
+              <w:t xml:space="preserve">150   </w:t>
+            </w:r>
+            <w:proofErr w:type="gramStart"/>
             <w:r>
               <w:rPr>
                 <w:rFonts w:ascii="Consolas" w:hAnsi="Consolas" w:cs="Consolas"/>
                 <w:sz w:val="16"/>
                 <w:szCs w:val="16"/>
               </w:rPr>
-              <w:t>265      return attacks == 0 ? 0f : (float)s.CompromiseSources / attacks;</w:t>
-            </w:r>
+              <w:t xml:space="preserve">   {</w:t>
+            </w:r>
+            <w:proofErr w:type="gramEnd"/>
           </w:p>
           <w:p>
             <w:r>
@@ -2519,8 +3009,704 @@
                 <w:sz w:val="16"/>
                 <w:szCs w:val="16"/>
               </w:rPr>
+              <w:t xml:space="preserve">151          </w:t>
+            </w:r>
+            <w:proofErr w:type="gramStart"/>
+            <w:r>
+              <w:rPr>
+                <w:rFonts w:ascii="Consolas" w:hAnsi="Consolas" w:cs="Consolas"/>
+                <w:sz w:val="16"/>
+                <w:szCs w:val="16"/>
+              </w:rPr>
+              <w:t>return</w:t>
+            </w:r>
+            <w:proofErr w:type="gramEnd"/>
+            <w:r>
+              <w:rPr>
+                <w:rFonts w:ascii="Consolas" w:hAnsi="Consolas" w:cs="Consolas"/>
+                <w:sz w:val="16"/>
+                <w:szCs w:val="16"/>
+              </w:rPr>
+              <w:t>;</w:t>
+            </w:r>
+          </w:p>
+          <w:p>
+            <w:r>
+              <w:rPr>
+                <w:rFonts w:ascii="Consolas" w:hAnsi="Consolas" w:cs="Consolas"/>
+                <w:sz w:val="16"/>
+                <w:szCs w:val="16"/>
+              </w:rPr>
+              <w:t xml:space="preserve">152    </w:t>
+            </w:r>
+            <w:proofErr w:type="gramStart"/>
+            <w:r>
+              <w:rPr>
+                <w:rFonts w:ascii="Consolas" w:hAnsi="Consolas" w:cs="Consolas"/>
+                <w:sz w:val="16"/>
+                <w:szCs w:val="16"/>
+              </w:rPr>
+              <w:t xml:space="preserve">  }</w:t>
+            </w:r>
+            <w:proofErr w:type="gramEnd"/>
+          </w:p>
+          <w:p>
+            <w:r>
+              <w:rPr>
+                <w:rFonts w:ascii="Consolas" w:hAnsi="Consolas" w:cs="Consolas"/>
+                <w:sz w:val="16"/>
+                <w:szCs w:val="16"/>
+              </w:rPr>
+              <w:t>153      Resolved = true;</w:t>
+            </w:r>
+          </w:p>
+          <w:p>
+            <w:r>
+              <w:rPr>
+                <w:rFonts w:ascii="Consolas" w:hAnsi="Consolas" w:cs="Consolas"/>
+                <w:sz w:val="16"/>
+                <w:szCs w:val="16"/>
+              </w:rPr>
+              <w:t xml:space="preserve">154      </w:t>
+            </w:r>
+            <w:proofErr w:type="spellStart"/>
+            <w:r>
+              <w:rPr>
+                <w:rFonts w:ascii="Consolas" w:hAnsi="Consolas" w:cs="Consolas"/>
+                <w:sz w:val="16"/>
+                <w:szCs w:val="16"/>
+              </w:rPr>
+              <w:t>State.MarkCompleted</w:t>
+            </w:r>
+            <w:proofErr w:type="spellEnd"/>
+            <w:r>
+              <w:rPr>
+                <w:rFonts w:ascii="Consolas" w:hAnsi="Consolas" w:cs="Consolas"/>
+                <w:sz w:val="16"/>
+                <w:szCs w:val="16"/>
+              </w:rPr>
+              <w:t>(id);</w:t>
+            </w:r>
+          </w:p>
+          <w:p>
+            <w:r>
+              <w:rPr>
+                <w:rFonts w:ascii="Consolas" w:hAnsi="Consolas" w:cs="Consolas"/>
+                <w:sz w:val="16"/>
+                <w:szCs w:val="16"/>
+              </w:rPr>
+              <w:t xml:space="preserve">155      </w:t>
+            </w:r>
+            <w:proofErr w:type="spellStart"/>
+            <w:r>
+              <w:rPr>
+                <w:rFonts w:ascii="Consolas" w:hAnsi="Consolas" w:cs="Consolas"/>
+                <w:sz w:val="16"/>
+                <w:szCs w:val="16"/>
+              </w:rPr>
+              <w:t>SessionLog.Decision</w:t>
+            </w:r>
+            <w:proofErr w:type="spellEnd"/>
+            <w:r>
+              <w:rPr>
+                <w:rFonts w:ascii="Consolas" w:hAnsi="Consolas" w:cs="Consolas"/>
+                <w:sz w:val="16"/>
+                <w:szCs w:val="16"/>
+              </w:rPr>
+              <w:t>($"{id}: {decision}");</w:t>
+            </w:r>
+          </w:p>
+          <w:p>
+            <w:r>
+              <w:rPr>
+                <w:rFonts w:ascii="Consolas" w:hAnsi="Consolas" w:cs="Consolas"/>
+                <w:sz w:val="16"/>
+                <w:szCs w:val="16"/>
+              </w:rPr>
+              <w:t xml:space="preserve">156      </w:t>
+            </w:r>
+            <w:proofErr w:type="spellStart"/>
+            <w:r>
+              <w:rPr>
+                <w:rFonts w:ascii="Consolas" w:hAnsi="Consolas" w:cs="Consolas"/>
+                <w:sz w:val="16"/>
+                <w:szCs w:val="16"/>
+              </w:rPr>
+              <w:t>PhysicalSecurityTelemetryLogger.RecordDecision</w:t>
+            </w:r>
+            <w:proofErr w:type="spellEnd"/>
+            <w:r>
+              <w:rPr>
+                <w:rFonts w:ascii="Consolas" w:hAnsi="Consolas" w:cs="Consolas"/>
+                <w:sz w:val="16"/>
+                <w:szCs w:val="16"/>
+              </w:rPr>
+              <w:t xml:space="preserve">(id, decision, </w:t>
+            </w:r>
+            <w:proofErr w:type="spellStart"/>
+            <w:r>
+              <w:rPr>
+                <w:rFonts w:ascii="Consolas" w:hAnsi="Consolas" w:cs="Consolas"/>
+                <w:sz w:val="16"/>
+                <w:szCs w:val="16"/>
+              </w:rPr>
+              <w:t>RequestShownAt</w:t>
+            </w:r>
+            <w:proofErr w:type="spellEnd"/>
+            <w:r>
+              <w:rPr>
+                <w:rFonts w:ascii="Consolas" w:hAnsi="Consolas" w:cs="Consolas"/>
+                <w:sz w:val="16"/>
+                <w:szCs w:val="16"/>
+              </w:rPr>
+              <w:t xml:space="preserve">, </w:t>
+            </w:r>
+            <w:proofErr w:type="gramStart"/>
+            <w:r>
+              <w:rPr>
+                <w:rFonts w:ascii="Consolas" w:hAnsi="Consolas" w:cs="Consolas"/>
+                <w:sz w:val="16"/>
+                <w:szCs w:val="16"/>
+              </w:rPr>
+              <w:t>Director !</w:t>
+            </w:r>
+            <w:proofErr w:type="gramEnd"/>
+            <w:r>
+              <w:rPr>
+                <w:rFonts w:ascii="Consolas" w:hAnsi="Consolas" w:cs="Consolas"/>
+                <w:sz w:val="16"/>
+                <w:szCs w:val="16"/>
+              </w:rPr>
+              <w:t xml:space="preserve">= </w:t>
+            </w:r>
+            <w:proofErr w:type="gramStart"/>
+            <w:r>
+              <w:rPr>
+                <w:rFonts w:ascii="Consolas" w:hAnsi="Consolas" w:cs="Consolas"/>
+                <w:sz w:val="16"/>
+                <w:szCs w:val="16"/>
+              </w:rPr>
+              <w:t>null ?</w:t>
+            </w:r>
+            <w:proofErr w:type="gramEnd"/>
+            <w:r>
+              <w:rPr>
+                <w:rFonts w:ascii="Consolas" w:hAnsi="Consolas" w:cs="Consolas"/>
+                <w:sz w:val="16"/>
+                <w:szCs w:val="16"/>
+              </w:rPr>
+              <w:t xml:space="preserve"> </w:t>
+            </w:r>
+            <w:proofErr w:type="spellStart"/>
+            <w:proofErr w:type="gramStart"/>
+            <w:r>
+              <w:rPr>
+                <w:rFonts w:ascii="Consolas" w:hAnsi="Consolas" w:cs="Consolas"/>
+                <w:sz w:val="16"/>
+                <w:szCs w:val="16"/>
+              </w:rPr>
+              <w:t>Director.Elapsed</w:t>
+            </w:r>
+            <w:proofErr w:type="spellEnd"/>
+            <w:r>
+              <w:rPr>
+                <w:rFonts w:ascii="Consolas" w:hAnsi="Consolas" w:cs="Consolas"/>
+                <w:sz w:val="16"/>
+                <w:szCs w:val="16"/>
+              </w:rPr>
+              <w:t xml:space="preserve"> :</w:t>
+            </w:r>
+            <w:proofErr w:type="gramEnd"/>
+            <w:r>
+              <w:rPr>
+                <w:rFonts w:ascii="Consolas" w:hAnsi="Consolas" w:cs="Consolas"/>
+                <w:sz w:val="16"/>
+                <w:szCs w:val="16"/>
+              </w:rPr>
+              <w:t xml:space="preserve"> </w:t>
+            </w:r>
+            <w:proofErr w:type="spellStart"/>
+            <w:r>
+              <w:rPr>
+                <w:rFonts w:ascii="Consolas" w:hAnsi="Consolas" w:cs="Consolas"/>
+                <w:sz w:val="16"/>
+                <w:szCs w:val="16"/>
+              </w:rPr>
+              <w:t>TriggeredAt</w:t>
+            </w:r>
+            <w:proofErr w:type="spellEnd"/>
+            <w:r>
+              <w:rPr>
+                <w:rFonts w:ascii="Consolas" w:hAnsi="Consolas" w:cs="Consolas"/>
+                <w:sz w:val="16"/>
+                <w:szCs w:val="16"/>
+              </w:rPr>
+              <w:t>);</w:t>
+            </w:r>
+          </w:p>
+          <w:p>
+            <w:r>
+              <w:rPr>
+                <w:rFonts w:ascii="Consolas" w:hAnsi="Consolas" w:cs="Consolas"/>
+                <w:sz w:val="16"/>
+                <w:szCs w:val="16"/>
+              </w:rPr>
+              <w:t xml:space="preserve">157      </w:t>
+            </w:r>
+            <w:proofErr w:type="spellStart"/>
+            <w:proofErr w:type="gramStart"/>
+            <w:r>
+              <w:rPr>
+                <w:rFonts w:ascii="Consolas" w:hAnsi="Consolas" w:cs="Consolas"/>
+                <w:sz w:val="16"/>
+                <w:szCs w:val="16"/>
+              </w:rPr>
+              <w:t>Director?.</w:t>
+            </w:r>
+            <w:proofErr w:type="gramEnd"/>
+            <w:r>
+              <w:rPr>
+                <w:rFonts w:ascii="Consolas" w:hAnsi="Consolas" w:cs="Consolas"/>
+                <w:sz w:val="16"/>
+                <w:szCs w:val="16"/>
+              </w:rPr>
+              <w:t>Release</w:t>
+            </w:r>
+            <w:proofErr w:type="spellEnd"/>
+            <w:r>
+              <w:rPr>
+                <w:rFonts w:ascii="Consolas" w:hAnsi="Consolas" w:cs="Consolas"/>
+                <w:sz w:val="16"/>
+                <w:szCs w:val="16"/>
+              </w:rPr>
+              <w:t>(this);</w:t>
+            </w:r>
+          </w:p>
+          <w:p>
+            <w:proofErr w:type="gramStart"/>
+            <w:r>
+              <w:rPr>
+                <w:rFonts w:ascii="Consolas" w:hAnsi="Consolas" w:cs="Consolas"/>
+                <w:sz w:val="16"/>
+                <w:szCs w:val="16"/>
+              </w:rPr>
+              <w:t>158  }</w:t>
+            </w:r>
+            <w:proofErr w:type="gramEnd"/>
+          </w:p>
+          <w:p>
+            <w:r>
+              <w:rPr>
+                <w:rFonts w:ascii="Consolas" w:hAnsi="Consolas" w:cs="Consolas"/>
+                <w:b/>
+                <w:sz w:val="16"/>
+                <w:szCs w:val="16"/>
+              </w:rPr>
+              <w:t>// Assets/_Project/Scripts/Core/</w:t>
+            </w:r>
+            <w:proofErr w:type="spellStart"/>
+            <w:r>
+              <w:rPr>
+                <w:rFonts w:ascii="Consolas" w:hAnsi="Consolas" w:cs="Consolas"/>
+                <w:b/>
+                <w:sz w:val="16"/>
+                <w:szCs w:val="16"/>
+              </w:rPr>
+              <w:t>PhysicalSecurityTelemetryLogger.cs</w:t>
+            </w:r>
+            <w:proofErr w:type="spellEnd"/>
+          </w:p>
+          <w:p>
+            <w:r>
+              <w:rPr>
+                <w:rFonts w:ascii="Consolas" w:hAnsi="Consolas" w:cs="Consolas"/>
+                <w:sz w:val="16"/>
+                <w:szCs w:val="16"/>
+              </w:rPr>
+              <w:t xml:space="preserve">95   public static void </w:t>
+            </w:r>
+            <w:proofErr w:type="spellStart"/>
+            <w:proofErr w:type="gramStart"/>
+            <w:r>
+              <w:rPr>
+                <w:rFonts w:ascii="Consolas" w:hAnsi="Consolas" w:cs="Consolas"/>
+                <w:sz w:val="16"/>
+                <w:szCs w:val="16"/>
+              </w:rPr>
+              <w:t>RecordDecision</w:t>
+            </w:r>
+            <w:proofErr w:type="spellEnd"/>
+            <w:r>
+              <w:rPr>
+                <w:rFonts w:ascii="Consolas" w:hAnsi="Consolas" w:cs="Consolas"/>
+                <w:sz w:val="16"/>
+                <w:szCs w:val="16"/>
+              </w:rPr>
+              <w:t>(</w:t>
+            </w:r>
+            <w:proofErr w:type="spellStart"/>
+            <w:proofErr w:type="gramEnd"/>
+            <w:r>
+              <w:rPr>
+                <w:rFonts w:ascii="Consolas" w:hAnsi="Consolas" w:cs="Consolas"/>
+                <w:sz w:val="16"/>
+                <w:szCs w:val="16"/>
+              </w:rPr>
+              <w:t>SituationId</w:t>
+            </w:r>
+            <w:proofErr w:type="spellEnd"/>
+            <w:r>
+              <w:rPr>
+                <w:rFonts w:ascii="Consolas" w:hAnsi="Consolas" w:cs="Consolas"/>
+                <w:sz w:val="16"/>
+                <w:szCs w:val="16"/>
+              </w:rPr>
+              <w:t xml:space="preserve"> id, string action, float </w:t>
+            </w:r>
+            <w:proofErr w:type="spellStart"/>
+            <w:r>
+              <w:rPr>
+                <w:rFonts w:ascii="Consolas" w:hAnsi="Consolas" w:cs="Consolas"/>
+                <w:sz w:val="16"/>
+                <w:szCs w:val="16"/>
+              </w:rPr>
+              <w:t>requestedAt</w:t>
+            </w:r>
+            <w:proofErr w:type="spellEnd"/>
+            <w:r>
+              <w:rPr>
+                <w:rFonts w:ascii="Consolas" w:hAnsi="Consolas" w:cs="Consolas"/>
+                <w:sz w:val="16"/>
+                <w:szCs w:val="16"/>
+              </w:rPr>
+              <w:t xml:space="preserve">, float </w:t>
+            </w:r>
+            <w:proofErr w:type="spellStart"/>
+            <w:r>
+              <w:rPr>
+                <w:rFonts w:ascii="Consolas" w:hAnsi="Consolas" w:cs="Consolas"/>
+                <w:sz w:val="16"/>
+                <w:szCs w:val="16"/>
+              </w:rPr>
+              <w:t>decidedAt</w:t>
+            </w:r>
+            <w:proofErr w:type="spellEnd"/>
+            <w:r>
+              <w:rPr>
+                <w:rFonts w:ascii="Consolas" w:hAnsi="Consolas" w:cs="Consolas"/>
+                <w:sz w:val="16"/>
+                <w:szCs w:val="16"/>
+              </w:rPr>
+              <w:t>)</w:t>
+            </w:r>
+          </w:p>
+          <w:p>
+            <w:r>
+              <w:rPr>
+                <w:rFonts w:ascii="Consolas" w:hAnsi="Consolas" w:cs="Consolas"/>
+                <w:sz w:val="16"/>
+                <w:szCs w:val="16"/>
+              </w:rPr>
+              <w:t>96</w:t>
+            </w:r>
+            <w:proofErr w:type="gramStart"/>
+            <w:r>
+              <w:rPr>
+                <w:rFonts w:ascii="Consolas" w:hAnsi="Consolas" w:cs="Consolas"/>
+                <w:sz w:val="16"/>
+                <w:szCs w:val="16"/>
+              </w:rPr>
+              <w:t xml:space="preserve">   {</w:t>
+            </w:r>
+            <w:proofErr w:type="gramEnd"/>
+          </w:p>
+          <w:p>
+            <w:r>
+              <w:rPr>
+                <w:rFonts w:ascii="Consolas" w:hAnsi="Consolas" w:cs="Consolas"/>
+                <w:sz w:val="16"/>
+                <w:szCs w:val="16"/>
+              </w:rPr>
+              <w:t xml:space="preserve">97       Decisions[id] = new Decision </w:t>
+            </w:r>
+            <w:proofErr w:type="gramStart"/>
+            <w:r>
+              <w:rPr>
+                <w:rFonts w:ascii="Consolas" w:hAnsi="Consolas" w:cs="Consolas"/>
+                <w:sz w:val="16"/>
+                <w:szCs w:val="16"/>
+              </w:rPr>
+              <w:t>{ action</w:t>
+            </w:r>
+            <w:proofErr w:type="gramEnd"/>
+            <w:r>
+              <w:rPr>
+                <w:rFonts w:ascii="Consolas" w:hAnsi="Consolas" w:cs="Consolas"/>
+                <w:sz w:val="16"/>
+                <w:szCs w:val="16"/>
+              </w:rPr>
+              <w:t xml:space="preserve"> = action, latency = </w:t>
+            </w:r>
+            <w:proofErr w:type="spellStart"/>
+            <w:r>
+              <w:rPr>
+                <w:rFonts w:ascii="Consolas" w:hAnsi="Consolas" w:cs="Consolas"/>
+                <w:sz w:val="16"/>
+                <w:szCs w:val="16"/>
+              </w:rPr>
+              <w:t>Mathf.Max</w:t>
+            </w:r>
+            <w:proofErr w:type="spellEnd"/>
+            <w:r>
+              <w:rPr>
+                <w:rFonts w:ascii="Consolas" w:hAnsi="Consolas" w:cs="Consolas"/>
+                <w:sz w:val="16"/>
+                <w:szCs w:val="16"/>
+              </w:rPr>
+              <w:t xml:space="preserve">(0f, </w:t>
+            </w:r>
+            <w:proofErr w:type="spellStart"/>
+            <w:r>
+              <w:rPr>
+                <w:rFonts w:ascii="Consolas" w:hAnsi="Consolas" w:cs="Consolas"/>
+                <w:sz w:val="16"/>
+                <w:szCs w:val="16"/>
+              </w:rPr>
+              <w:t>decidedAt</w:t>
+            </w:r>
+            <w:proofErr w:type="spellEnd"/>
+            <w:r>
+              <w:rPr>
+                <w:rFonts w:ascii="Consolas" w:hAnsi="Consolas" w:cs="Consolas"/>
+                <w:sz w:val="16"/>
+                <w:szCs w:val="16"/>
+              </w:rPr>
+              <w:t xml:space="preserve"> - </w:t>
+            </w:r>
+            <w:proofErr w:type="spellStart"/>
+            <w:r>
+              <w:rPr>
+                <w:rFonts w:ascii="Consolas" w:hAnsi="Consolas" w:cs="Consolas"/>
+                <w:sz w:val="16"/>
+                <w:szCs w:val="16"/>
+              </w:rPr>
+              <w:t>requestedAt</w:t>
+            </w:r>
+            <w:proofErr w:type="spellEnd"/>
+            <w:proofErr w:type="gramStart"/>
+            <w:r>
+              <w:rPr>
+                <w:rFonts w:ascii="Consolas" w:hAnsi="Consolas" w:cs="Consolas"/>
+                <w:sz w:val="16"/>
+                <w:szCs w:val="16"/>
+              </w:rPr>
+              <w:t>) }</w:t>
+            </w:r>
+            <w:proofErr w:type="gramEnd"/>
+            <w:r>
+              <w:rPr>
+                <w:rFonts w:ascii="Consolas" w:hAnsi="Consolas" w:cs="Consolas"/>
+                <w:sz w:val="16"/>
+                <w:szCs w:val="16"/>
+              </w:rPr>
+              <w:t>;</w:t>
+            </w:r>
+          </w:p>
+          <w:p>
+            <w:r>
+              <w:rPr>
+                <w:rFonts w:ascii="Consolas" w:hAnsi="Consolas" w:cs="Consolas"/>
+                <w:sz w:val="16"/>
+                <w:szCs w:val="16"/>
+              </w:rPr>
+              <w:t xml:space="preserve">98 </w:t>
+            </w:r>
+            <w:proofErr w:type="gramStart"/>
+            <w:r>
+              <w:rPr>
+                <w:rFonts w:ascii="Consolas" w:hAnsi="Consolas" w:cs="Consolas"/>
+                <w:sz w:val="16"/>
+                <w:szCs w:val="16"/>
+              </w:rPr>
+              <w:t xml:space="preserve">  }</w:t>
+            </w:r>
+            <w:proofErr w:type="gramEnd"/>
+          </w:p>
+          <w:p>
+            <w:proofErr w:type="gramStart"/>
+            <w:r>
+              <w:rPr>
+                <w:rFonts w:ascii="Consolas" w:hAnsi="Consolas" w:cs="Consolas"/>
+                <w:sz w:val="16"/>
+                <w:szCs w:val="16"/>
+              </w:rPr>
+              <w:t>262  public</w:t>
+            </w:r>
+            <w:proofErr w:type="gramEnd"/>
+            <w:r>
+              <w:rPr>
+                <w:rFonts w:ascii="Consolas" w:hAnsi="Consolas" w:cs="Consolas"/>
+                <w:sz w:val="16"/>
+                <w:szCs w:val="16"/>
+              </w:rPr>
+              <w:t xml:space="preserve"> static float </w:t>
+            </w:r>
+            <w:proofErr w:type="spellStart"/>
+            <w:proofErr w:type="gramStart"/>
+            <w:r>
+              <w:rPr>
+                <w:rFonts w:ascii="Consolas" w:hAnsi="Consolas" w:cs="Consolas"/>
+                <w:sz w:val="16"/>
+                <w:szCs w:val="16"/>
+              </w:rPr>
+              <w:t>BreachRate</w:t>
+            </w:r>
+            <w:proofErr w:type="spellEnd"/>
+            <w:r>
+              <w:rPr>
+                <w:rFonts w:ascii="Consolas" w:hAnsi="Consolas" w:cs="Consolas"/>
+                <w:sz w:val="16"/>
+                <w:szCs w:val="16"/>
+              </w:rPr>
+              <w:t>(</w:t>
+            </w:r>
+            <w:proofErr w:type="spellStart"/>
+            <w:proofErr w:type="gramEnd"/>
+            <w:r>
+              <w:rPr>
+                <w:rFonts w:ascii="Consolas" w:hAnsi="Consolas" w:cs="Consolas"/>
+                <w:sz w:val="16"/>
+                <w:szCs w:val="16"/>
+              </w:rPr>
+              <w:t>GameState</w:t>
+            </w:r>
+            <w:proofErr w:type="spellEnd"/>
+            <w:r>
+              <w:rPr>
+                <w:rFonts w:ascii="Consolas" w:hAnsi="Consolas" w:cs="Consolas"/>
+                <w:sz w:val="16"/>
+                <w:szCs w:val="16"/>
+              </w:rPr>
+              <w:t xml:space="preserve"> s)</w:t>
+            </w:r>
+          </w:p>
+          <w:p>
+            <w:proofErr w:type="gramStart"/>
+            <w:r>
+              <w:rPr>
+                <w:rFonts w:ascii="Consolas" w:hAnsi="Consolas" w:cs="Consolas"/>
+                <w:sz w:val="16"/>
+                <w:szCs w:val="16"/>
+              </w:rPr>
+              <w:t>263  {</w:t>
+            </w:r>
+            <w:proofErr w:type="gramEnd"/>
+          </w:p>
+          <w:p>
+            <w:r>
+              <w:rPr>
+                <w:rFonts w:ascii="Consolas" w:hAnsi="Consolas" w:cs="Consolas"/>
+                <w:sz w:val="16"/>
+                <w:szCs w:val="16"/>
+              </w:rPr>
+              <w:t xml:space="preserve">264      int attacks = </w:t>
+            </w:r>
+            <w:proofErr w:type="spellStart"/>
+            <w:r>
+              <w:rPr>
+                <w:rFonts w:ascii="Consolas" w:hAnsi="Consolas" w:cs="Consolas"/>
+                <w:sz w:val="16"/>
+                <w:szCs w:val="16"/>
+              </w:rPr>
+              <w:t>AttacksReached</w:t>
+            </w:r>
+            <w:proofErr w:type="spellEnd"/>
+            <w:r>
+              <w:rPr>
+                <w:rFonts w:ascii="Consolas" w:hAnsi="Consolas" w:cs="Consolas"/>
+                <w:sz w:val="16"/>
+                <w:szCs w:val="16"/>
+              </w:rPr>
+              <w:t>(s);</w:t>
+            </w:r>
+          </w:p>
+          <w:p>
+            <w:r>
+              <w:rPr>
+                <w:rFonts w:ascii="Consolas" w:hAnsi="Consolas" w:cs="Consolas"/>
+                <w:sz w:val="16"/>
+                <w:szCs w:val="16"/>
+              </w:rPr>
+              <w:t xml:space="preserve">265      return attacks == </w:t>
+            </w:r>
+            <w:proofErr w:type="gramStart"/>
+            <w:r>
+              <w:rPr>
+                <w:rFonts w:ascii="Consolas" w:hAnsi="Consolas" w:cs="Consolas"/>
+                <w:sz w:val="16"/>
+                <w:szCs w:val="16"/>
+              </w:rPr>
+              <w:t>0 ?</w:t>
+            </w:r>
+            <w:proofErr w:type="gramEnd"/>
+            <w:r>
+              <w:rPr>
+                <w:rFonts w:ascii="Consolas" w:hAnsi="Consolas" w:cs="Consolas"/>
+                <w:sz w:val="16"/>
+                <w:szCs w:val="16"/>
+              </w:rPr>
+              <w:t xml:space="preserve"> 0</w:t>
+            </w:r>
+            <w:proofErr w:type="gramStart"/>
+            <w:r>
+              <w:rPr>
+                <w:rFonts w:ascii="Consolas" w:hAnsi="Consolas" w:cs="Consolas"/>
+                <w:sz w:val="16"/>
+                <w:szCs w:val="16"/>
+              </w:rPr>
+              <w:t>f :</w:t>
+            </w:r>
+            <w:proofErr w:type="gramEnd"/>
+            <w:r>
+              <w:rPr>
+                <w:rFonts w:ascii="Consolas" w:hAnsi="Consolas" w:cs="Consolas"/>
+                <w:sz w:val="16"/>
+                <w:szCs w:val="16"/>
+              </w:rPr>
+              <w:t xml:space="preserve"> (float)</w:t>
+            </w:r>
+            <w:proofErr w:type="spellStart"/>
+            <w:proofErr w:type="gramStart"/>
+            <w:r>
+              <w:rPr>
+                <w:rFonts w:ascii="Consolas" w:hAnsi="Consolas" w:cs="Consolas"/>
+                <w:sz w:val="16"/>
+                <w:szCs w:val="16"/>
+              </w:rPr>
+              <w:t>s.CompromiseSources</w:t>
+            </w:r>
+            <w:proofErr w:type="spellEnd"/>
+            <w:proofErr w:type="gramEnd"/>
+            <w:r>
+              <w:rPr>
+                <w:rFonts w:ascii="Consolas" w:hAnsi="Consolas" w:cs="Consolas"/>
+                <w:sz w:val="16"/>
+                <w:szCs w:val="16"/>
+              </w:rPr>
+              <w:t xml:space="preserve"> / attacks;</w:t>
+            </w:r>
+          </w:p>
+          <w:p>
+            <w:proofErr w:type="gramStart"/>
+            <w:r>
+              <w:rPr>
+                <w:rFonts w:ascii="Consolas" w:hAnsi="Consolas" w:cs="Consolas"/>
+                <w:sz w:val="16"/>
+                <w:szCs w:val="16"/>
+              </w:rPr>
               <w:t>266  }</w:t>
             </w:r>
+            <w:proofErr w:type="gramEnd"/>
           </w:p>
         </w:tc>
       </w:tr>
@@ -2600,7 +3786,71 @@
                 <w:sz w:val="15"/>
                 <w:szCs w:val="15"/>
               </w:rPr>
-              <w:t>L = t_decision − t_request, in real seconds. t_request is when the request is put to the player (email arrives, drive drops, intercom answered, MFA push, chat message); t_decision is when they choose.</w:t>
+              <w:t xml:space="preserve">L = </w:t>
+            </w:r>
+            <w:proofErr w:type="spellStart"/>
+            <w:r>
+              <w:rPr>
+                <w:sz w:val="15"/>
+                <w:szCs w:val="15"/>
+              </w:rPr>
+              <w:t>t_decision</w:t>
+            </w:r>
+            <w:proofErr w:type="spellEnd"/>
+            <w:r>
+              <w:rPr>
+                <w:sz w:val="15"/>
+                <w:szCs w:val="15"/>
+              </w:rPr>
+              <w:t xml:space="preserve"> − </w:t>
+            </w:r>
+            <w:proofErr w:type="spellStart"/>
+            <w:r>
+              <w:rPr>
+                <w:sz w:val="15"/>
+                <w:szCs w:val="15"/>
+              </w:rPr>
+              <w:t>t_request</w:t>
+            </w:r>
+            <w:proofErr w:type="spellEnd"/>
+            <w:r>
+              <w:rPr>
+                <w:sz w:val="15"/>
+                <w:szCs w:val="15"/>
+              </w:rPr>
+              <w:t xml:space="preserve">, in real seconds. </w:t>
+            </w:r>
+            <w:proofErr w:type="spellStart"/>
+            <w:r>
+              <w:rPr>
+                <w:sz w:val="15"/>
+                <w:szCs w:val="15"/>
+              </w:rPr>
+              <w:t>t_request</w:t>
+            </w:r>
+            <w:proofErr w:type="spellEnd"/>
+            <w:r>
+              <w:rPr>
+                <w:sz w:val="15"/>
+                <w:szCs w:val="15"/>
+              </w:rPr>
+              <w:t xml:space="preserve"> is when the request is put to the player (email arrives, drive drops, intercom answered, MFA push, chat message); </w:t>
+            </w:r>
+            <w:proofErr w:type="spellStart"/>
+            <w:r>
+              <w:rPr>
+                <w:sz w:val="15"/>
+                <w:szCs w:val="15"/>
+              </w:rPr>
+              <w:t>t_decision</w:t>
+            </w:r>
+            <w:proofErr w:type="spellEnd"/>
+            <w:r>
+              <w:rPr>
+                <w:sz w:val="15"/>
+                <w:szCs w:val="15"/>
+              </w:rPr>
+              <w:t xml:space="preserve"> is when they choose.</w:t>
             </w:r>
           </w:p>
           <w:p>
@@ -2660,7 +3910,71 @@
                 <w:sz w:val="15"/>
                 <w:szCs w:val="15"/>
               </w:rPr>
-              <w:t>B is breach_rate (0.5) and D is credential_disclosure (True) in telemetry/session_summary.csv. L is decision_latency_sec (19.50) on the Intercom row of telemetry/security_audit_real_trials.csv; the per-session mean is mean_challenge_latency_sec. telemetry/analyse_cyberquest.py computes N, mean, SD and median from these files.</w:t>
+              <w:t xml:space="preserve">B is </w:t>
+            </w:r>
+            <w:proofErr w:type="spellStart"/>
+            <w:r>
+              <w:rPr>
+                <w:sz w:val="15"/>
+                <w:szCs w:val="15"/>
+              </w:rPr>
+              <w:t>breach_rate</w:t>
+            </w:r>
+            <w:proofErr w:type="spellEnd"/>
+            <w:r>
+              <w:rPr>
+                <w:sz w:val="15"/>
+                <w:szCs w:val="15"/>
+              </w:rPr>
+              <w:t xml:space="preserve"> (0.5) and D is </w:t>
+            </w:r>
+            <w:proofErr w:type="spellStart"/>
+            <w:r>
+              <w:rPr>
+                <w:sz w:val="15"/>
+                <w:szCs w:val="15"/>
+              </w:rPr>
+              <w:t>credential_disclosure</w:t>
+            </w:r>
+            <w:proofErr w:type="spellEnd"/>
+            <w:r>
+              <w:rPr>
+                <w:sz w:val="15"/>
+                <w:szCs w:val="15"/>
+              </w:rPr>
+              <w:t xml:space="preserve"> (True) in telemetry/session_summary.csv. L is </w:t>
+            </w:r>
+            <w:proofErr w:type="spellStart"/>
+            <w:r>
+              <w:rPr>
+                <w:sz w:val="15"/>
+                <w:szCs w:val="15"/>
+              </w:rPr>
+              <w:t>decision_latency_sec</w:t>
+            </w:r>
+            <w:proofErr w:type="spellEnd"/>
+            <w:r>
+              <w:rPr>
+                <w:sz w:val="15"/>
+                <w:szCs w:val="15"/>
+              </w:rPr>
+              <w:t xml:space="preserve"> (19.50) on the Intercom row of telemetry/security_audit_real_trials.csv; the per-session mean is </w:t>
+            </w:r>
+            <w:proofErr w:type="spellStart"/>
+            <w:r>
+              <w:rPr>
+                <w:sz w:val="15"/>
+                <w:szCs w:val="15"/>
+              </w:rPr>
+              <w:t>mean_challenge_latency_sec</w:t>
+            </w:r>
+            <w:proofErr w:type="spellEnd"/>
+            <w:r>
+              <w:rPr>
+                <w:sz w:val="15"/>
+                <w:szCs w:val="15"/>
+              </w:rPr>
+              <w:t>. telemetry/analyse_cyberquest.py computes N, mean, SD and median from these files.</w:t>
             </w:r>
           </w:p>
         </w:tc>
@@ -2740,7 +4054,23 @@
                 <w:b/>
                 <w:sz w:val="15"/>
               </w:rPr>
-              <w:t>Repository (monorepo)</w:t>
+              <w:t>Repository (</w:t>
+            </w:r>
+            <w:proofErr w:type="spellStart"/>
+            <w:r>
+              <w:rPr>
+                <w:b/>
+                <w:sz w:val="15"/>
+              </w:rPr>
+              <w:t>monorepo</w:t>
+            </w:r>
+            <w:proofErr w:type="spellEnd"/>
+            <w:r>
+              <w:rPr>
+                <w:b/>
+                <w:sz w:val="15"/>
+              </w:rPr>
+              <w:t>)</w:t>
             </w:r>
           </w:p>
         </w:tc>
@@ -2870,7 +4200,21 @@
               <w:rPr>
                 <w:sz w:val="15"/>
               </w:rPr>
-              <w:t>group-17-v1.0 · build: Quest .apk or PCVR .exe</w:t>
+              <w:t>group-17-v1.0 · build: Quest .</w:t>
+            </w:r>
+            <w:proofErr w:type="spellStart"/>
+            <w:r>
+              <w:rPr>
+                <w:sz w:val="15"/>
+              </w:rPr>
+              <w:t>apk</w:t>
+            </w:r>
+            <w:proofErr w:type="spellEnd"/>
+            <w:r>
+              <w:rPr>
+                <w:sz w:val="15"/>
+              </w:rPr>
+              <w:t xml:space="preserve"> or PCVR .exe</w:t>
             </w:r>
           </w:p>
         </w:tc>
@@ -2941,7 +4285,23 @@
                     <w:sz w:val="15"/>
                     <w:szCs w:val="15"/>
                   </w:rPr>
-                  <w:t>de9ea1d078c832e1036c450fd1a90da63b1ff815 (github.com/Samarthpande1510/cyberquest, main = tag group-17-v1.0)</w:t>
+                  <w:t>de9ea1d078c832e1036c450fd1a90da63b1ff815 (github.com/Samarthpande1510/</w:t>
+                </w:r>
+                <w:proofErr w:type="spellStart"/>
+                <w:r>
+                  <w:rPr>
+                    <w:sz w:val="15"/>
+                    <w:szCs w:val="15"/>
+                  </w:rPr>
+                  <w:t>cyberquest</w:t>
+                </w:r>
+                <w:proofErr w:type="spellEnd"/>
+                <w:r>
+                  <w:rPr>
+                    <w:sz w:val="15"/>
+                    <w:szCs w:val="15"/>
+                  </w:rPr>
+                  <w:t>, main = tag group-17-v1.0)</w:t>
                 </w:r>
               </w:sdtContent>
             </w:sdt>
@@ -2967,7 +4327,23 @@
                 <w:b/>
                 <w:sz w:val="15"/>
               </w:rPr>
-              <w:t>Release build link (.apk / .exe)</w:t>
+              <w:t>Release build link (.</w:t>
+            </w:r>
+            <w:proofErr w:type="spellStart"/>
+            <w:r>
+              <w:rPr>
+                <w:b/>
+                <w:sz w:val="15"/>
+              </w:rPr>
+              <w:t>apk</w:t>
+            </w:r>
+            <w:proofErr w:type="spellEnd"/>
+            <w:r>
+              <w:rPr>
+                <w:b/>
+                <w:sz w:val="15"/>
+              </w:rPr>
+              <w:t xml:space="preserve"> / .exe)</w:t>
             </w:r>
           </w:p>
         </w:tc>
@@ -2996,7 +4372,23 @@
                     <w:sz w:val="15"/>
                     <w:szCs w:val="15"/>
                   </w:rPr>
-                  <w:t>https://github.com/Samarthpande1510/cyberquest/releases/tag/group-17-v1.0 (CyberQuest.apk, Meta Quest)</w:t>
+                  <w:t>https://github.com/Samarthpande1510/cyberquest/releases/tag/group-17-v1.0 (</w:t>
+                </w:r>
+                <w:proofErr w:type="spellStart"/>
+                <w:r>
+                  <w:rPr>
+                    <w:sz w:val="15"/>
+                    <w:szCs w:val="15"/>
+                  </w:rPr>
+                  <w:t>CyberQuest.apk</w:t>
+                </w:r>
+                <w:proofErr w:type="spellEnd"/>
+                <w:r>
+                  <w:rPr>
+                    <w:sz w:val="15"/>
+                    <w:szCs w:val="15"/>
+                  </w:rPr>
+                  <w:t>, Meta Quest)</w:t>
                 </w:r>
               </w:sdtContent>
             </w:sdt>
@@ -3022,7 +4414,23 @@
                 <w:b/>
                 <w:sz w:val="15"/>
               </w:rPr>
-              <w:t>Root .gitattributes tracks our binary asset types via Git LFS</w:t>
+              <w:t>Root .</w:t>
+            </w:r>
+            <w:proofErr w:type="spellStart"/>
+            <w:r>
+              <w:rPr>
+                <w:b/>
+                <w:sz w:val="15"/>
+              </w:rPr>
+              <w:t>gitattributes</w:t>
+            </w:r>
+            <w:proofErr w:type="spellEnd"/>
+            <w:r>
+              <w:rPr>
+                <w:b/>
+                <w:sz w:val="15"/>
+              </w:rPr>
+              <w:t xml:space="preserve"> tracks our binary asset types via Git LFS</w:t>
             </w:r>
           </w:p>
         </w:tc>
@@ -3081,7 +4489,23 @@
                 <w:b/>
                 <w:sz w:val="15"/>
               </w:rPr>
-              <w:t>`git lfs ls-files` lists our models / textures / audio</w:t>
+              <w:t xml:space="preserve">`git </w:t>
+            </w:r>
+            <w:proofErr w:type="spellStart"/>
+            <w:r>
+              <w:rPr>
+                <w:b/>
+                <w:sz w:val="15"/>
+              </w:rPr>
+              <w:t>lfs</w:t>
+            </w:r>
+            <w:proofErr w:type="spellEnd"/>
+            <w:r>
+              <w:rPr>
+                <w:b/>
+                <w:sz w:val="15"/>
+              </w:rPr>
+              <w:t xml:space="preserve"> ls-files` lists our models / textures / audio</w:t>
             </w:r>
           </w:p>
         </w:tc>
@@ -3140,7 +4564,23 @@
                 <w:b/>
                 <w:sz w:val="15"/>
               </w:rPr>
-              <w:t>No build (.apk / .exe) is committed to Git history</w:t>
+              <w:t>No build (.</w:t>
+            </w:r>
+            <w:proofErr w:type="spellStart"/>
+            <w:r>
+              <w:rPr>
+                <w:b/>
+                <w:sz w:val="15"/>
+              </w:rPr>
+              <w:t>apk</w:t>
+            </w:r>
+            <w:proofErr w:type="spellEnd"/>
+            <w:r>
+              <w:rPr>
+                <w:b/>
+                <w:sz w:val="15"/>
+              </w:rPr>
+              <w:t xml:space="preserve"> / .exe) is committed to Git history</w:t>
             </w:r>
           </w:p>
         </w:tc>
@@ -3417,7 +4857,39 @@
                 <w:color w:val="333333"/>
                 <w:sz w:val="13"/>
               </w:rPr>
-              <w:t>git log --oneline -- Group_17_Samarth_Ishan_Aarush_Sachi/ | wc -l</w:t>
+              <w:t>git log --</w:t>
+            </w:r>
+            <w:proofErr w:type="spellStart"/>
+            <w:r>
+              <w:rPr>
+                <w:color w:val="333333"/>
+                <w:sz w:val="13"/>
+              </w:rPr>
+              <w:t>oneline</w:t>
+            </w:r>
+            <w:proofErr w:type="spellEnd"/>
+            <w:r>
+              <w:rPr>
+                <w:color w:val="333333"/>
+                <w:sz w:val="13"/>
+              </w:rPr>
+              <w:t xml:space="preserve"> -- Group_17_Samarth_Ishan_Aarush_Sachi/ | </w:t>
+            </w:r>
+            <w:proofErr w:type="spellStart"/>
+            <w:r>
+              <w:rPr>
+                <w:color w:val="333333"/>
+                <w:sz w:val="13"/>
+              </w:rPr>
+              <w:t>wc</w:t>
+            </w:r>
+            <w:proofErr w:type="spellEnd"/>
+            <w:r>
+              <w:rPr>
+                <w:color w:val="333333"/>
+                <w:sz w:val="13"/>
+              </w:rPr>
+              <w:t xml:space="preserve"> -l</w:t>
             </w:r>
           </w:p>
         </w:tc>
@@ -3446,7 +4918,39 @@
                     <w:sz w:val="15"/>
                     <w:szCs w:val="15"/>
                   </w:rPr>
-                  <w:t>19 (measured in Samarthpande1510/cyberquest; project not yet copied into the monorepo folder)</w:t>
+                  <w:t>19 (measured in Samarthpande1510/</w:t>
+                </w:r>
+                <w:proofErr w:type="spellStart"/>
+                <w:r>
+                  <w:rPr>
+                    <w:sz w:val="15"/>
+                    <w:szCs w:val="15"/>
+                  </w:rPr>
+                  <w:t>cyberquest</w:t>
+                </w:r>
+                <w:proofErr w:type="spellEnd"/>
+                <w:r>
+                  <w:rPr>
+                    <w:sz w:val="15"/>
+                    <w:szCs w:val="15"/>
+                  </w:rPr>
+                  <w:t xml:space="preserve">; project not yet copied into the </w:t>
+                </w:r>
+                <w:proofErr w:type="spellStart"/>
+                <w:r>
+                  <w:rPr>
+                    <w:sz w:val="15"/>
+                    <w:szCs w:val="15"/>
+                  </w:rPr>
+                  <w:t>monorepo</w:t>
+                </w:r>
+                <w:proofErr w:type="spellEnd"/>
+                <w:r>
+                  <w:rPr>
+                    <w:sz w:val="15"/>
+                    <w:szCs w:val="15"/>
+                  </w:rPr>
+                  <w:t xml:space="preserve"> folder)</w:t>
                 </w:r>
               </w:sdtContent>
             </w:sdt>
@@ -3487,7 +4991,23 @@
                 <w:color w:val="333333"/>
                 <w:sz w:val="13"/>
               </w:rPr>
-              <w:t>git branch -r --list '*group-17*' | wc -l</w:t>
+              <w:t xml:space="preserve">git branch -r --list '*group-17*' | </w:t>
+            </w:r>
+            <w:proofErr w:type="spellStart"/>
+            <w:r>
+              <w:rPr>
+                <w:color w:val="333333"/>
+                <w:sz w:val="13"/>
+              </w:rPr>
+              <w:t>wc</w:t>
+            </w:r>
+            <w:proofErr w:type="spellEnd"/>
+            <w:r>
+              <w:rPr>
+                <w:color w:val="333333"/>
+                <w:sz w:val="13"/>
+              </w:rPr>
+              <w:t xml:space="preserve"> -l</w:t>
             </w:r>
           </w:p>
         </w:tc>
@@ -3557,7 +5077,55 @@
                 <w:color w:val="333333"/>
                 <w:sz w:val="13"/>
               </w:rPr>
-              <w:t>find Group_17_Samarth_Ishan_Aarush_Sachi -name '*.cs' | xargs cat | wc -l</w:t>
+              <w:t>find Group_17_Samarth_Ishan_Aarush_Sachi -name '*.</w:t>
+            </w:r>
+            <w:proofErr w:type="spellStart"/>
+            <w:r>
+              <w:rPr>
+                <w:color w:val="333333"/>
+                <w:sz w:val="13"/>
+              </w:rPr>
+              <w:t>cs'</w:t>
+            </w:r>
+            <w:proofErr w:type="spellEnd"/>
+            <w:r>
+              <w:rPr>
+                <w:color w:val="333333"/>
+                <w:sz w:val="13"/>
+              </w:rPr>
+              <w:t xml:space="preserve"> | </w:t>
+            </w:r>
+            <w:proofErr w:type="spellStart"/>
+            <w:r>
+              <w:rPr>
+                <w:color w:val="333333"/>
+                <w:sz w:val="13"/>
+              </w:rPr>
+              <w:t>xargs</w:t>
+            </w:r>
+            <w:proofErr w:type="spellEnd"/>
+            <w:r>
+              <w:rPr>
+                <w:color w:val="333333"/>
+                <w:sz w:val="13"/>
+              </w:rPr>
+              <w:t xml:space="preserve"> cat | </w:t>
+            </w:r>
+            <w:proofErr w:type="spellStart"/>
+            <w:r>
+              <w:rPr>
+                <w:color w:val="333333"/>
+                <w:sz w:val="13"/>
+              </w:rPr>
+              <w:t>wc</w:t>
+            </w:r>
+            <w:proofErr w:type="spellEnd"/>
+            <w:r>
+              <w:rPr>
+                <w:color w:val="333333"/>
+                <w:sz w:val="13"/>
+              </w:rPr>
+              <w:t xml:space="preserve"> -l</w:t>
             </w:r>
           </w:p>
         </w:tc>
@@ -3627,7 +5195,23 @@
                 <w:color w:val="333333"/>
                 <w:sz w:val="13"/>
               </w:rPr>
-              <w:t>du -sm Group_17_Samarth_Ishan_Aarush_Sachi</w:t>
+              <w:t>du -</w:t>
+            </w:r>
+            <w:proofErr w:type="spellStart"/>
+            <w:r>
+              <w:rPr>
+                <w:color w:val="333333"/>
+                <w:sz w:val="13"/>
+              </w:rPr>
+              <w:t>sm</w:t>
+            </w:r>
+            <w:proofErr w:type="spellEnd"/>
+            <w:r>
+              <w:rPr>
+                <w:color w:val="333333"/>
+                <w:sz w:val="13"/>
+              </w:rPr>
+              <w:t xml:space="preserve"> Group_17_Samarth_Ishan_Aarush_Sachi</w:t>
             </w:r>
           </w:p>
         </w:tc>
@@ -3697,7 +5281,39 @@
                 <w:color w:val="333333"/>
                 <w:sz w:val="13"/>
               </w:rPr>
-              <w:t>git lfs ls-files | grep Group_17_Samarth_Ishan_Aarush_Sachi | wc -l</w:t>
+              <w:t xml:space="preserve">git </w:t>
+            </w:r>
+            <w:proofErr w:type="spellStart"/>
+            <w:r>
+              <w:rPr>
+                <w:color w:val="333333"/>
+                <w:sz w:val="13"/>
+              </w:rPr>
+              <w:t>lfs</w:t>
+            </w:r>
+            <w:proofErr w:type="spellEnd"/>
+            <w:r>
+              <w:rPr>
+                <w:color w:val="333333"/>
+                <w:sz w:val="13"/>
+              </w:rPr>
+              <w:t xml:space="preserve"> ls-files | grep Group_17_Samarth_Ishan_Aarush_Sachi | </w:t>
+            </w:r>
+            <w:proofErr w:type="spellStart"/>
+            <w:r>
+              <w:rPr>
+                <w:color w:val="333333"/>
+                <w:sz w:val="13"/>
+              </w:rPr>
+              <w:t>wc</w:t>
+            </w:r>
+            <w:proofErr w:type="spellEnd"/>
+            <w:r>
+              <w:rPr>
+                <w:color w:val="333333"/>
+                <w:sz w:val="13"/>
+              </w:rPr>
+              <w:t xml:space="preserve"> -l</w:t>
             </w:r>
           </w:p>
         </w:tc>
@@ -3761,7 +5377,23 @@
                 <w:color w:val="333333"/>
                 <w:sz w:val="13"/>
               </w:rPr>
-              <w:t>ls Group_17_Samarth_Ishan_Aarush_Sachi/telemetry/*.csv | wc -l</w:t>
+              <w:t xml:space="preserve">ls Group_17_Samarth_Ishan_Aarush_Sachi/telemetry/*.csv | </w:t>
+            </w:r>
+            <w:proofErr w:type="spellStart"/>
+            <w:r>
+              <w:rPr>
+                <w:color w:val="333333"/>
+                <w:sz w:val="13"/>
+              </w:rPr>
+              <w:t>wc</w:t>
+            </w:r>
+            <w:proofErr w:type="spellEnd"/>
+            <w:r>
+              <w:rPr>
+                <w:color w:val="333333"/>
+                <w:sz w:val="13"/>
+              </w:rPr>
+              <w:t xml:space="preserve"> -l</w:t>
             </w:r>
           </w:p>
         </w:tc>
@@ -4062,7 +5694,55 @@
                     <w:sz w:val="15"/>
                     <w:szCs w:val="15"/>
                   </w:rPr>
-                  <w:t>Author of all 19 commits: Unity 6 project setup, GameState, situations, GameDirector, EndingResolver, UI, office scene, telemetry, tests, Quest release build</w:t>
+                  <w:t xml:space="preserve">Author of all 19 commits: Unity 6 project setup, </w:t>
+                </w:r>
+                <w:proofErr w:type="spellStart"/>
+                <w:r>
+                  <w:rPr>
+                    <w:sz w:val="15"/>
+                    <w:szCs w:val="15"/>
+                  </w:rPr>
+                  <w:t>GameState</w:t>
+                </w:r>
+                <w:proofErr w:type="spellEnd"/>
+                <w:r>
+                  <w:rPr>
+                    <w:sz w:val="15"/>
+                    <w:szCs w:val="15"/>
+                  </w:rPr>
+                  <w:t xml:space="preserve">, situations, </w:t>
+                </w:r>
+                <w:proofErr w:type="spellStart"/>
+                <w:r>
+                  <w:rPr>
+                    <w:sz w:val="15"/>
+                    <w:szCs w:val="15"/>
+                  </w:rPr>
+                  <w:t>GameDirector</w:t>
+                </w:r>
+                <w:proofErr w:type="spellEnd"/>
+                <w:r>
+                  <w:rPr>
+                    <w:sz w:val="15"/>
+                    <w:szCs w:val="15"/>
+                  </w:rPr>
+                  <w:t xml:space="preserve">, </w:t>
+                </w:r>
+                <w:proofErr w:type="spellStart"/>
+                <w:r>
+                  <w:rPr>
+                    <w:sz w:val="15"/>
+                    <w:szCs w:val="15"/>
+                  </w:rPr>
+                  <w:t>EndingResolver</w:t>
+                </w:r>
+                <w:proofErr w:type="spellEnd"/>
+                <w:r>
+                  <w:rPr>
+                    <w:sz w:val="15"/>
+                    <w:szCs w:val="15"/>
+                  </w:rPr>
+                  <w:t>, UI, office scene, telemetry, tests, Quest release build</w:t>
                 </w:r>
               </w:sdtContent>
             </w:sdt>
@@ -4203,12 +5883,37 @@
                 <w:text/>
               </w:sdtPr>
               <w:sdtContent>
+                <w:proofErr w:type="spellStart"/>
                 <w:r>
                   <w:rPr>
                     <w:sz w:val="15"/>
                     <w:szCs w:val="15"/>
                   </w:rPr>
-                  <w:t>GameState, situation triggers, GameDirector, ending resolver; 7 situations; office scene builder and 7-space floor; UI panels; telemetry logger; policies board; docs</w:t>
+                  <w:t>GameState</w:t>
+                </w:r>
+                <w:proofErr w:type="spellEnd"/>
+                <w:r>
+                  <w:rPr>
+                    <w:sz w:val="15"/>
+                    <w:szCs w:val="15"/>
+                  </w:rPr>
+                  <w:t xml:space="preserve">, situation triggers, </w:t>
+                </w:r>
+                <w:proofErr w:type="spellStart"/>
+                <w:r>
+                  <w:rPr>
+                    <w:sz w:val="15"/>
+                    <w:szCs w:val="15"/>
+                  </w:rPr>
+                  <w:t>GameDirector</w:t>
+                </w:r>
+                <w:proofErr w:type="spellEnd"/>
+                <w:r>
+                  <w:rPr>
+                    <w:sz w:val="15"/>
+                    <w:szCs w:val="15"/>
+                  </w:rPr>
+                  <w:t>, ending resolver; 7 situations; office scene builder and 7-space floor; UI panels; telemetry logger; policies board; docs</w:t>
                 </w:r>
               </w:sdtContent>
             </w:sdt>
@@ -4349,12 +6054,21 @@
                 <w:text/>
               </w:sdtPr>
               <w:sdtContent>
+                <w:proofErr w:type="spellStart"/>
                 <w:r>
                   <w:rPr>
                     <w:sz w:val="15"/>
                     <w:szCs w:val="15"/>
                   </w:rPr>
-                  <w:t>Office_Main 7-space floor; generated materials, textures and audio; props, events and locomotion; policies orientation board</w:t>
+                  <w:t>Office_Main</w:t>
+                </w:r>
+                <w:proofErr w:type="spellEnd"/>
+                <w:r>
+                  <w:rPr>
+                    <w:sz w:val="15"/>
+                    <w:szCs w:val="15"/>
+                  </w:rPr>
+                  <w:t xml:space="preserve"> 7-space floor; generated materials, textures and audio; props, events and locomotion; policies orientation board</w:t>
                 </w:r>
               </w:sdtContent>
             </w:sdt>
@@ -4485,7 +6199,23 @@
                     <w:sz w:val="15"/>
                     <w:szCs w:val="15"/>
                   </w:rPr>
-                  <w:t>Project setup and Meta XR SDK packages; situations; UI panels; EditMode tests (director, endings, scoring) and telemetry tests; analysis script; README</w:t>
+                  <w:t xml:space="preserve">Project setup and Meta XR SDK packages; situations; UI panels; </w:t>
+                </w:r>
+                <w:proofErr w:type="spellStart"/>
+                <w:r>
+                  <w:rPr>
+                    <w:sz w:val="15"/>
+                    <w:szCs w:val="15"/>
+                  </w:rPr>
+                  <w:t>EditMode</w:t>
+                </w:r>
+                <w:proofErr w:type="spellEnd"/>
+                <w:r>
+                  <w:rPr>
+                    <w:sz w:val="15"/>
+                    <w:szCs w:val="15"/>
+                  </w:rPr>
+                  <w:t xml:space="preserve"> tests (director, endings, scoring) and telemetry tests; analysis script; README</w:t>
                 </w:r>
               </w:sdtContent>
             </w:sdt>
@@ -4608,7 +6338,21 @@
               <w:rPr>
                 <w:sz w:val="15"/>
               </w:rPr>
-              <w:t>N = 11 real participants (P01–P11). Voluntary, adult, written consent; anonymised IDs. Tested 100% in standalone VR using a single Meta Quest headset.</w:t>
+              <w:t xml:space="preserve">N = 11 real participants (P01–P11). Voluntary, adult, written consent; </w:t>
+            </w:r>
+            <w:proofErr w:type="spellStart"/>
+            <w:r>
+              <w:rPr>
+                <w:sz w:val="15"/>
+              </w:rPr>
+              <w:t>anonymised</w:t>
+            </w:r>
+            <w:proofErr w:type="spellEnd"/>
+            <w:r>
+              <w:rPr>
+                <w:sz w:val="15"/>
+              </w:rPr>
+              <w:t xml:space="preserve"> IDs. Tested 100% in standalone VR using a single Meta Quest headset.</w:t>
             </w:r>
           </w:p>
         </w:tc>
@@ -5226,12 +6970,21 @@
                 <w:text/>
               </w:sdtPr>
               <w:sdtContent>
+                <w:proofErr w:type="spellStart"/>
                 <w:r>
                   <w:rPr>
                     <w:sz w:val="15"/>
                     <w:szCs w:val="15"/>
                   </w:rPr>
-                  <w:t>VR_Interactive (1 Meta Quest headset shared across all 11 participants). High perceived usability; no interaction blocks or game-breaking glitches reported</w:t>
+                  <w:t>VR_Interactive</w:t>
+                </w:r>
+                <w:proofErr w:type="spellEnd"/>
+                <w:r>
+                  <w:rPr>
+                    <w:sz w:val="15"/>
+                    <w:szCs w:val="15"/>
+                  </w:rPr>
+                  <w:t xml:space="preserve"> (1 Meta Quest headset shared across all 11 participants). High perceived usability; no interaction blocks or game-breaking glitches reported</w:t>
                 </w:r>
               </w:sdtContent>
             </w:sdt>
@@ -5385,12 +7138,37 @@
                 <w:text/>
               </w:sdtPr>
               <w:sdtContent>
+                <w:proofErr w:type="spellStart"/>
                 <w:r>
                   <w:rPr>
                     <w:sz w:val="15"/>
                     <w:szCs w:val="15"/>
                   </w:rPr>
-                  <w:t>VR_Interactive (100% Meta Quest headset). Endings: 2 Full Containment, 6 Contained but Exposed, 3 Breach; score mean 71.6/100. Decisions: TP 35, TN 7, FN 12, FP 4. Unauthorised entry 3 of 11.</w:t>
+                  <w:t>VR_Interactive</w:t>
+                </w:r>
+                <w:proofErr w:type="spellEnd"/>
+                <w:r>
+                  <w:rPr>
+                    <w:sz w:val="15"/>
+                    <w:szCs w:val="15"/>
+                  </w:rPr>
+                  <w:t xml:space="preserve"> (100% Meta Quest headset). Endings: 2 Full Containment, 6 Contained but Exposed, 3 Breach; score mean 71.6/100. Decisions: TP 35, TN 7, FN 12, FP 4. </w:t>
+                </w:r>
+                <w:proofErr w:type="spellStart"/>
+                <w:r>
+                  <w:rPr>
+                    <w:sz w:val="15"/>
+                    <w:szCs w:val="15"/>
+                  </w:rPr>
+                  <w:t>Unauthorised</w:t>
+                </w:r>
+                <w:proofErr w:type="spellEnd"/>
+                <w:r>
+                  <w:rPr>
+                    <w:sz w:val="15"/>
+                    <w:szCs w:val="15"/>
+                  </w:rPr>
+                  <w:t xml:space="preserve"> entry 3 of 11.</w:t>
                 </w:r>
               </w:sdtContent>
             </w:sdt>
@@ -5860,6 +7638,7 @@
             <w:sdt>
               <w:sdtPr>
                 <w:rPr>
+                  <w:rStyle w:val="Hyperlink"/>
                   <w:sz w:val="15"/>
                   <w:szCs w:val="15"/>
                 </w:rPr>
@@ -5871,10 +7650,11 @@
               <w:sdtContent>
                 <w:r>
                   <w:rPr>
+                    <w:rStyle w:val="Hyperlink"/>
                     <w:sz w:val="15"/>
                     <w:szCs w:val="15"/>
                   </w:rPr>
-                  <w:t>type here</w:t>
+                  <w:t>https://lnkd.in/p/dAnJfxbr</w:t>
                 </w:r>
               </w:sdtContent>
             </w:sdt>
@@ -5900,7 +7680,25 @@
                 <w:b/>
                 <w:sz w:val="15"/>
               </w:rPr>
-              <w:t>Video length (mm:ss)</w:t>
+              <w:t>Video length (</w:t>
+            </w:r>
+            <w:proofErr w:type="spellStart"/>
+            <w:proofErr w:type="gramStart"/>
+            <w:r>
+              <w:rPr>
+                <w:b/>
+                <w:sz w:val="15"/>
+              </w:rPr>
+              <w:t>mm:ss</w:t>
+            </w:r>
+            <w:proofErr w:type="spellEnd"/>
+            <w:proofErr w:type="gramEnd"/>
+            <w:r>
+              <w:rPr>
+                <w:b/>
+                <w:sz w:val="15"/>
+              </w:rPr>
+              <w:t>)</w:t>
             </w:r>
           </w:p>
         </w:tc>
@@ -5929,7 +7727,7 @@
                     <w:sz w:val="15"/>
                     <w:szCs w:val="15"/>
                   </w:rPr>
-                  <w:t>type here</w:t>
+                  <w:t>4:40</w:t>
                 </w:r>
               </w:sdtContent>
             </w:sdt>
@@ -5982,7 +7780,7 @@
                     <w:sz w:val="15"/>
                     <w:szCs w:val="15"/>
                   </w:rPr>
-                  <w:t>Select ▾</w:t>
+                  <w:t>Yes</w:t>
                 </w:r>
               </w:sdtContent>
             </w:sdt>
@@ -6257,7 +8055,23 @@
                     <w:sz w:val="14"/>
                     <w:szCs w:val="14"/>
                   </w:rPr>
-                  <w:t>Asked to draft our research title and case context; it named 'NEXORA Corporation' as the target organisation as if it were a real company.</w:t>
+                  <w:t xml:space="preserve">Asked to draft our research title and case context; it named 'NEXORA Corporation' as the target </w:t>
+                </w:r>
+                <w:proofErr w:type="spellStart"/>
+                <w:r>
+                  <w:rPr>
+                    <w:sz w:val="14"/>
+                    <w:szCs w:val="14"/>
+                  </w:rPr>
+                  <w:t>organisation</w:t>
+                </w:r>
+                <w:proofErr w:type="spellEnd"/>
+                <w:r>
+                  <w:rPr>
+                    <w:sz w:val="14"/>
+                    <w:szCs w:val="14"/>
+                  </w:rPr>
+                  <w:t xml:space="preserve"> as if it were a real company.</w:t>
                 </w:r>
               </w:sdtContent>
             </w:sdt>
@@ -6326,7 +8140,39 @@
                     <w:sz w:val="14"/>
                     <w:szCs w:val="14"/>
                   </w:rPr>
-                  <w:t>No such company exists (faculty pre-audit, Section 1). Title replaced by the authorised one. NEXORA stays only as the fictional employer inside the game and is never cited as a real organisation.</w:t>
+                  <w:t xml:space="preserve">No such company exists (faculty pre-audit, Section 1). Title replaced by the </w:t>
+                </w:r>
+                <w:proofErr w:type="spellStart"/>
+                <w:r>
+                  <w:rPr>
+                    <w:sz w:val="14"/>
+                    <w:szCs w:val="14"/>
+                  </w:rPr>
+                  <w:t>authorised</w:t>
+                </w:r>
+                <w:proofErr w:type="spellEnd"/>
+                <w:r>
+                  <w:rPr>
+                    <w:sz w:val="14"/>
+                    <w:szCs w:val="14"/>
+                  </w:rPr>
+                  <w:t xml:space="preserve"> one. NEXORA stays only as the fictional employer inside the game and is never cited as a real </w:t>
+                </w:r>
+                <w:proofErr w:type="spellStart"/>
+                <w:r>
+                  <w:rPr>
+                    <w:sz w:val="14"/>
+                    <w:szCs w:val="14"/>
+                  </w:rPr>
+                  <w:t>organisation</w:t>
+                </w:r>
+                <w:proofErr w:type="spellEnd"/>
+                <w:r>
+                  <w:rPr>
+                    <w:sz w:val="14"/>
+                    <w:szCs w:val="14"/>
+                  </w:rPr>
+                  <w:t>.</w:t>
                 </w:r>
               </w:sdtContent>
             </w:sdt>
@@ -6564,7 +8410,23 @@
                     <w:sz w:val="14"/>
                     <w:szCs w:val="14"/>
                   </w:rPr>
-                  <w:t>No penetration-test study found. The figure matches a 2014 Boon Edam vendor survey where about 71% of respondents believed they were vulnerable to tailgating (SecurityInfoWatch). Deleted; replaced by Verizon 2024 DBIR (68% of breaches involve a non-malicious human element).</w:t>
+                  <w:t>No penetration-test study found. The figure matches a 2014 Boon Edam vendor survey where about 71% of respondents believed they were vulnerable to tailgating (</w:t>
+                </w:r>
+                <w:proofErr w:type="spellStart"/>
+                <w:r>
+                  <w:rPr>
+                    <w:sz w:val="14"/>
+                    <w:szCs w:val="14"/>
+                  </w:rPr>
+                  <w:t>SecurityInfoWatch</w:t>
+                </w:r>
+                <w:proofErr w:type="spellEnd"/>
+                <w:r>
+                  <w:rPr>
+                    <w:sz w:val="14"/>
+                    <w:szCs w:val="14"/>
+                  </w:rPr>
+                  <w:t>). Deleted; replaced by Verizon 2024 DBIR (68% of breaches involve a non-malicious human element).</w:t>
                 </w:r>
               </w:sdtContent>
             </w:sdt>
@@ -7027,7 +8889,25 @@
                 <w:b/>
                 <w:sz w:val="13"/>
               </w:rPr>
-              <w:t>Best moment (mm:ss)</w:t>
+              <w:t>Best moment (</w:t>
+            </w:r>
+            <w:proofErr w:type="spellStart"/>
+            <w:proofErr w:type="gramStart"/>
+            <w:r>
+              <w:rPr>
+                <w:b/>
+                <w:sz w:val="13"/>
+              </w:rPr>
+              <w:t>mm:ss</w:t>
+            </w:r>
+            <w:proofErr w:type="spellEnd"/>
+            <w:proofErr w:type="gramEnd"/>
+            <w:r>
+              <w:rPr>
+                <w:b/>
+                <w:sz w:val="13"/>
+              </w:rPr>
+              <w:t>)</w:t>
             </w:r>
           </w:p>
         </w:tc>
@@ -7102,7 +8982,7 @@
                     <w:sz w:val="14"/>
                     <w:szCs w:val="14"/>
                   </w:rPr>
-                  <w:t>Select ▾</w:t>
+                  <w:t>0</w:t>
                 </w:r>
               </w:sdtContent>
             </w:sdt>
@@ -7138,7 +9018,7 @@
                     <w:sz w:val="14"/>
                     <w:szCs w:val="14"/>
                   </w:rPr>
-                  <w:t>Select ▾</w:t>
+                  <w:t>0</w:t>
                 </w:r>
               </w:sdtContent>
             </w:sdt>
@@ -7596,7 +9476,25 @@
           <w:color w:val="333333"/>
           <w:sz w:val="15"/>
         </w:rPr>
-        <w:t>These answers do not change your marks. They help us improve the course, and are used in anonymised research only if you consent in the sign-off below.</w:t>
+        <w:t xml:space="preserve">These answers do not change your marks. They help us improve the course, and are used in </w:t>
+      </w:r>
+      <w:proofErr w:type="spellStart"/>
+      <w:r>
+        <w:rPr>
+          <w:i/>
+          <w:color w:val="333333"/>
+          <w:sz w:val="15"/>
+        </w:rPr>
+        <w:t>anonymised</w:t>
+      </w:r>
+      <w:proofErr w:type="spellEnd"/>
+      <w:r>
+        <w:rPr>
+          <w:i/>
+          <w:color w:val="333333"/>
+          <w:sz w:val="15"/>
+        </w:rPr>
+        <w:t xml:space="preserve"> research only if you consent in the sign-off below.</w:t>
       </w:r>
     </w:p>
     <w:tbl>
@@ -7726,8 +9624,17 @@
                 <w:b/>
                 <w:sz w:val="12"/>
               </w:rPr>
-              <w:t>I learned a skill from a teammate of another programme</w:t>
-            </w:r>
+              <w:t xml:space="preserve">I learned a skill from a teammate of another </w:t>
+            </w:r>
+            <w:proofErr w:type="spellStart"/>
+            <w:r>
+              <w:rPr>
+                <w:b/>
+                <w:sz w:val="12"/>
+              </w:rPr>
+              <w:t>programme</w:t>
+            </w:r>
+            <w:proofErr w:type="spellEnd"/>
           </w:p>
         </w:tc>
         <w:tc>
@@ -8964,7 +10871,39 @@
                     <w:sz w:val="14"/>
                     <w:szCs w:val="14"/>
                   </w:rPr>
-                  <w:t>rchitecting an asynchronous, event-driven runtime telemetry logger in C# (PhysicalSecurityTelemetryLogger.cs) to record timestamped participant  decisions, gaze dwells, and breach metrics without dropping Quest standalone VR framerates.</w:t>
+                  <w:t>rchitecting an asynchronous, event-driven runtime telemetry logger in C# (</w:t>
+                </w:r>
+                <w:proofErr w:type="spellStart"/>
+                <w:r>
+                  <w:rPr>
+                    <w:sz w:val="14"/>
+                    <w:szCs w:val="14"/>
+                  </w:rPr>
+                  <w:t>PhysicalSecurityTelemetryLogger.cs</w:t>
+                </w:r>
+                <w:proofErr w:type="spellEnd"/>
+                <w:r>
+                  <w:rPr>
+                    <w:sz w:val="14"/>
+                    <w:szCs w:val="14"/>
+                  </w:rPr>
+                  <w:t xml:space="preserve">) to record timestamped </w:t>
+                </w:r>
+                <w:proofErr w:type="gramStart"/>
+                <w:r>
+                  <w:rPr>
+                    <w:sz w:val="14"/>
+                    <w:szCs w:val="14"/>
+                  </w:rPr>
+                  <w:t>participant  decisions</w:t>
+                </w:r>
+                <w:proofErr w:type="gramEnd"/>
+                <w:r>
+                  <w:rPr>
+                    <w:sz w:val="14"/>
+                    <w:szCs w:val="14"/>
+                  </w:rPr>
+                  <w:t>, gaze dwells, and breach metrics without dropping Quest standalone VR framerates.</w:t>
                 </w:r>
               </w:sdtContent>
             </w:sdt>
@@ -9002,7 +10941,23 @@
                     <w:sz w:val="14"/>
                     <w:szCs w:val="14"/>
                   </w:rPr>
-                  <w:t>rovide a minimal pre-configured Meta XR Interaction SDK rig and building block template at the beginning of the semester to accelerate  early prototyping.</w:t>
+                  <w:t xml:space="preserve">rovide a minimal pre-configured Meta XR Interaction SDK rig and building block template at the beginning of the semester to </w:t>
+                </w:r>
+                <w:proofErr w:type="gramStart"/>
+                <w:r>
+                  <w:rPr>
+                    <w:sz w:val="14"/>
+                    <w:szCs w:val="14"/>
+                  </w:rPr>
+                  <w:t>accelerate  early</w:t>
+                </w:r>
+                <w:proofErr w:type="gramEnd"/>
+                <w:r>
+                  <w:rPr>
+                    <w:sz w:val="14"/>
+                    <w:szCs w:val="14"/>
+                  </w:rPr>
+                  <w:t xml:space="preserve"> prototyping.</w:t>
                 </w:r>
               </w:sdtContent>
             </w:sdt>
@@ -9056,7 +11011,39 @@
                     <w:sz w:val="14"/>
                     <w:szCs w:val="14"/>
                   </w:rPr>
-                  <w:t>Designing decoupled, state-driven situation triggers (SituationTrigger.cs) and dynamic cooldown directors in Unity 6 LTS that support non-linear  player exploration rather than rigid sequential scripts</w:t>
+                  <w:t>Designing decoupled, state-driven situation triggers (</w:t>
+                </w:r>
+                <w:proofErr w:type="spellStart"/>
+                <w:r>
+                  <w:rPr>
+                    <w:sz w:val="14"/>
+                    <w:szCs w:val="14"/>
+                  </w:rPr>
+                  <w:t>SituationTrigger.cs</w:t>
+                </w:r>
+                <w:proofErr w:type="spellEnd"/>
+                <w:r>
+                  <w:rPr>
+                    <w:sz w:val="14"/>
+                    <w:szCs w:val="14"/>
+                  </w:rPr>
+                  <w:t>) and dynamic cooldown directors in Unity 6 LTS that support non-</w:t>
+                </w:r>
+                <w:proofErr w:type="gramStart"/>
+                <w:r>
+                  <w:rPr>
+                    <w:sz w:val="14"/>
+                    <w:szCs w:val="14"/>
+                  </w:rPr>
+                  <w:t>linear  player</w:t>
+                </w:r>
+                <w:proofErr w:type="gramEnd"/>
+                <w:r>
+                  <w:rPr>
+                    <w:sz w:val="14"/>
+                    <w:szCs w:val="14"/>
+                  </w:rPr>
+                  <w:t xml:space="preserve"> exploration rather than rigid sequential scripts</w:t>
                 </w:r>
               </w:sdtContent>
             </w:sdt>
@@ -9094,7 +11081,14 @@
                     <w:sz w:val="14"/>
                     <w:szCs w:val="14"/>
                   </w:rPr>
-                  <w:t>lign the Technical Dossier requirements with realistic project outcomes by allowing teams the pedagogical flexibility to define simulation-</w:t>
+                  <w:t>lign the Technical Dossier requirements with realistic project outcomes by allowing teams the pedagogical flexibility to define simulation</w:t>
+                </w:r>
+                <w:r>
+                  <w:rPr>
+                    <w:sz w:val="14"/>
+                    <w:szCs w:val="14"/>
+                  </w:rPr>
+                  <w:t xml:space="preserve"> s</w:t>
                 </w:r>
                 <w:r>
                   <w:rPr>
@@ -9102,23 +11096,7 @@
                     <w:sz w:val="14"/>
                     <w:szCs w:val="14"/>
                   </w:rPr>
-                  <w:t xml:space="preserve">  </w:t>
-                </w:r>
-                <w:r>
-                  <w:rPr>
-                    <w:rFonts w:hint="eastAsia"/>
-                    <w:sz w:val="14"/>
-                    <w:szCs w:val="14"/>
-                  </w:rPr>
-                  <w:t>│</w:t>
-                </w:r>
-                <w:r>
-                  <w:rPr>
-                    <w:rFonts w:hint="eastAsia"/>
-                    <w:sz w:val="14"/>
-                    <w:szCs w:val="14"/>
-                  </w:rPr>
-                  <w:t xml:space="preserve"> specific evaluation metrics, rather than mandating prescriptive scaffold tables that encourage artificial data fitting.</w:t>
+                  <w:t>pecific evaluation metrics, rather than mandating prescriptive scaffold tables that encourage artificial data fitting.</w:t>
                 </w:r>
               </w:sdtContent>
             </w:sdt>
@@ -9172,7 +11150,23 @@
                     <w:sz w:val="14"/>
                     <w:szCs w:val="14"/>
                   </w:rPr>
-                  <w:t>How to design clean telemetry logging that tracks exactly what a player clicked, saw, and how long they hesitated, and then write scripts to parse  those CSVs to see where users actually failed security checks.</w:t>
+                  <w:t xml:space="preserve">How to design clean telemetry logging that tracks exactly what a player clicked, saw, and how long they hesitated, and then write scripts to </w:t>
+                </w:r>
+                <w:proofErr w:type="gramStart"/>
+                <w:r>
+                  <w:rPr>
+                    <w:sz w:val="14"/>
+                    <w:szCs w:val="14"/>
+                  </w:rPr>
+                  <w:t>parse  those</w:t>
+                </w:r>
+                <w:proofErr w:type="gramEnd"/>
+                <w:r>
+                  <w:rPr>
+                    <w:sz w:val="14"/>
+                    <w:szCs w:val="14"/>
+                  </w:rPr>
+                  <w:t xml:space="preserve"> CSVs to see where users actually failed security checks.</w:t>
                 </w:r>
               </w:sdtContent>
             </w:sdt>
@@ -9203,22 +11197,7 @@
                     <w:sz w:val="14"/>
                     <w:szCs w:val="14"/>
                   </w:rPr>
-                  <w:t xml:space="preserve">Give earlier guidance on setting up 3D spatial audio and room acoustics in Unity, because getting things like the door intercom buzzer and    </w:t>
-                </w:r>
-                <w:r>
-                  <w:rPr>
-                    <w:rFonts w:cs="Calibri"/>
-                    <w:sz w:val="14"/>
-                    <w:szCs w:val="14"/>
-                  </w:rPr>
-                  <w:t>￹</w:t>
-                </w:r>
-                <w:r>
-                  <w:rPr>
-                    <w:sz w:val="14"/>
-                    <w:szCs w:val="14"/>
-                  </w:rPr>
-                  <w:t>phone ringing to sound naturally distant across multiple office rooms took way too much trial and error.</w:t>
+                  <w:t>Give earlier guidance on setting up 3D spatial audio and room acoustics in Unity, because getting things like the door intercom buzzer and phone ringing to sound naturally distant across multiple office rooms took way too much trial and error.</w:t>
                 </w:r>
               </w:sdtContent>
             </w:sdt>
@@ -9266,22 +11245,7 @@
                     <w:sz w:val="14"/>
                     <w:szCs w:val="14"/>
                   </w:rPr>
-                  <w:t xml:space="preserve">The most valuable thing I learned: How to script branching dialogue choices and state logic in Unity for social engineering encounters, ensuring player inputs reliably trigger the    </w:t>
-                </w:r>
-                <w:r>
-                  <w:rPr>
-                    <w:rFonts w:cs="Calibri"/>
-                    <w:sz w:val="14"/>
-                    <w:szCs w:val="14"/>
-                  </w:rPr>
-                  <w:t>￹</w:t>
-                </w:r>
-                <w:r>
-                  <w:rPr>
-                    <w:sz w:val="14"/>
-                    <w:szCs w:val="14"/>
-                  </w:rPr>
-                  <w:t>right reactions and endings without bugs.</w:t>
+                  <w:t>The most valuable thing I learned: How to script branching dialogue choices and state logic in Unity for social engineering encounters, ensuring player inputs reliably trigger the right reactions and endings without bugs.</w:t>
                 </w:r>
               </w:sdtContent>
             </w:sdt>
@@ -9309,22 +11273,7 @@
                     <w:sz w:val="14"/>
                     <w:szCs w:val="14"/>
                   </w:rPr>
-                  <w:t xml:space="preserve">One thing I would change in this course: Include a dedicated session on building responsive World-Space UI and poke interactions in Unity VR; making physical 3D touch buttons and    </w:t>
-                </w:r>
-                <w:r>
-                  <w:rPr>
-                    <w:rFonts w:cs="Calibri"/>
-                    <w:sz w:val="14"/>
-                    <w:szCs w:val="14"/>
-                  </w:rPr>
-                  <w:t>￹</w:t>
-                </w:r>
-                <w:r>
-                  <w:rPr>
-                    <w:sz w:val="14"/>
-                    <w:szCs w:val="14"/>
-                  </w:rPr>
-                  <w:t>monitor screens feel responsive and easy to read in the headset was much trickier than expected.</w:t>
+                  <w:t>One thing I would change in this course: Include a dedicated session on building responsive World-Space UI and poke interactions in Unity VR; making physical 3D touch buttons and    monitor screens feel responsive and easy to read in the headset was much trickier than expected.</w:t>
                 </w:r>
               </w:sdtContent>
             </w:sdt>
@@ -9590,7 +11539,21 @@
               <w:rPr>
                 <w:sz w:val="15"/>
               </w:rPr>
-              <w:t>A: IEEE INDICON (IEEE India Council International Conference)   ·   B: SOUPS (Symposium on Usable Privacy and Security)</w:t>
+              <w:t xml:space="preserve">A: IEEE INDICON (IEEE India Council International </w:t>
+            </w:r>
+            <w:proofErr w:type="gramStart"/>
+            <w:r>
+              <w:rPr>
+                <w:sz w:val="15"/>
+              </w:rPr>
+              <w:t xml:space="preserve">Conference)   </w:t>
+            </w:r>
+            <w:proofErr w:type="gramEnd"/>
+            <w:r>
+              <w:rPr>
+                <w:sz w:val="15"/>
+              </w:rPr>
+              <w:t>·   B: SOUPS (Symposium on Usable Privacy and Security)</w:t>
             </w:r>
           </w:p>
         </w:tc>
@@ -9621,8 +11584,17 @@
           <w:i/>
           <w:sz w:val="17"/>
         </w:rPr>
-        <w:t xml:space="preserve">    every member answers and signs</w:t>
+        <w:t xml:space="preserve">    </w:t>
       </w:r>
+      <w:proofErr w:type="gramStart"/>
+      <w:r>
+        <w:rPr>
+          <w:i/>
+          <w:sz w:val="17"/>
+        </w:rPr>
+        <w:t>every member answers and signs</w:t>
+      </w:r>
+      <w:proofErr w:type="gramEnd"/>
     </w:p>
     <w:p>
       <w:pPr>
@@ -10466,7 +12438,43 @@
           <w:color w:val="333333"/>
           <w:sz w:val="14"/>
         </w:rPr>
-        <w:t>*Optional: may Dr. Nanade use anonymised data from this dossier and repository in education research publications? Your answer has no effect on your marks, and you can withdraw until results are published.</w:t>
+        <w:t xml:space="preserve">*Optional: may Dr. </w:t>
+      </w:r>
+      <w:proofErr w:type="spellStart"/>
+      <w:r>
+        <w:rPr>
+          <w:i/>
+          <w:color w:val="333333"/>
+          <w:sz w:val="14"/>
+        </w:rPr>
+        <w:t>Nanade</w:t>
+      </w:r>
+      <w:proofErr w:type="spellEnd"/>
+      <w:r>
+        <w:rPr>
+          <w:i/>
+          <w:color w:val="333333"/>
+          <w:sz w:val="14"/>
+        </w:rPr>
+        <w:t xml:space="preserve"> use </w:t>
+      </w:r>
+      <w:proofErr w:type="spellStart"/>
+      <w:r>
+        <w:rPr>
+          <w:i/>
+          <w:color w:val="333333"/>
+          <w:sz w:val="14"/>
+        </w:rPr>
+        <w:t>anonymised</w:t>
+      </w:r>
+      <w:proofErr w:type="spellEnd"/>
+      <w:r>
+        <w:rPr>
+          <w:i/>
+          <w:color w:val="333333"/>
+          <w:sz w:val="14"/>
+        </w:rPr>
+        <w:t xml:space="preserve"> data from this dossier and repository in education research publications? Your answer has no effect on your marks, and you can withdraw until results are published.</w:t>
       </w:r>
     </w:p>
     <w:sectPr>
@@ -22135,6 +24143,29 @@
       </w:tcPr>
     </w:tblStylePr>
   </w:style>
+  <w:style w:type="character" w:styleId="Hyperlink">
+    <w:name w:val="Hyperlink"/>
+    <w:basedOn w:val="DefaultParagraphFont"/>
+    <w:uiPriority w:val="99"/>
+    <w:unhideWhenUsed/>
+    <w:rsid w:val="003241B0"/>
+    <w:rPr>
+      <w:color w:val="0000FF" w:themeColor="hyperlink"/>
+      <w:u w:val="single"/>
+    </w:rPr>
+  </w:style>
+  <w:style w:type="character" w:styleId="UnresolvedMention">
+    <w:name w:val="Unresolved Mention"/>
+    <w:basedOn w:val="DefaultParagraphFont"/>
+    <w:uiPriority w:val="99"/>
+    <w:semiHidden/>
+    <w:unhideWhenUsed/>
+    <w:rsid w:val="003241B0"/>
+    <w:rPr>
+      <w:color w:val="605E5C"/>
+      <w:shd w:val="clear" w:color="auto" w:fill="E1DFDD"/>
+    </w:rPr>
+  </w:style>
 </w:styles>
 </file>
 

</xml_diff>